<commit_message>
Chapter One Code Breakdown
</commit_message>
<xml_diff>
--- a/Projects/Chapter1/code-plan.docx
+++ b/Projects/Chapter1/code-plan.docx
@@ -2,11 +2,7 @@
 <file path=word/document.xml><?xml version="1.0" encoding="utf-8"?>
 <w:document xmlns:wpc="http://schemas.microsoft.com/office/word/2010/wordprocessingCanvas" xmlns:cx="http://schemas.microsoft.com/office/drawing/2014/chartex" xmlns:cx1="http://schemas.microsoft.com/office/drawing/2015/9/8/chartex" xmlns:cx2="http://schemas.microsoft.com/office/drawing/2015/10/21/chartex" xmlns:cx3="http://schemas.microsoft.com/office/drawing/2016/5/9/chartex" xmlns:cx4="http://schemas.microsoft.com/office/drawing/2016/5/10/chartex" xmlns:cx5="http://schemas.microsoft.com/office/drawing/2016/5/11/chartex" xmlns:cx6="http://schemas.microsoft.com/office/drawing/2016/5/12/chartex" xmlns:cx7="http://schemas.microsoft.com/office/drawing/2016/5/13/chartex" xmlns:cx8="http://schemas.microsoft.com/office/drawing/2016/5/14/chartex" xmlns:mc="http://schemas.openxmlformats.org/markup-compatibility/2006" xmlns:aink="http://schemas.microsoft.com/office/drawing/2016/ink" xmlns:am3d="http://schemas.microsoft.com/office/drawing/2017/model3d" xmlns:o="urn:schemas-microsoft-com:office:office" xmlns:r="http://schemas.openxmlformats.org/officeDocument/2006/relationships" xmlns:m="http://schemas.openxmlformats.org/officeDocument/2006/math" xmlns:v="urn:schemas-microsoft-com:vml" xmlns:wp14="http://schemas.microsoft.com/office/word/2010/wordprocessingDrawing" xmlns:wp="http://schemas.openxmlformats.org/drawingml/2006/wordprocessingDrawing" xmlns:w10="urn:schemas-microsoft-com:office:word" xmlns:w="http://schemas.openxmlformats.org/wordprocessingml/2006/main" xmlns:w14="http://schemas.microsoft.com/office/word/2010/wordml" xmlns:w15="http://schemas.microsoft.com/office/word/2012/wordml" xmlns:w16cid="http://schemas.microsoft.com/office/word/2016/wordml/cid" xmlns:w16se="http://schemas.microsoft.com/office/word/2015/wordml/symex" xmlns:wpg="http://schemas.microsoft.com/office/word/2010/wordprocessingGroup" xmlns:wpi="http://schemas.microsoft.com/office/word/2010/wordprocessingInk" xmlns:wne="http://schemas.microsoft.com/office/word/2006/wordml" xmlns:wps="http://schemas.microsoft.com/office/word/2010/wordprocessingShape" mc:Ignorable="w14 w15 w16se w16cid wp14">
   <w:body>
-    <w:p>
-      <w:pPr>
-        <w:pStyle w:val="Heading1"/>
-      </w:pPr>
-    </w:p>
+    <w:p/>
     <w:p>
       <w:pPr>
         <w:jc w:val="center"/>
@@ -396,6 +392,15 @@
     </w:p>
     <w:sdt>
       <w:sdtPr>
+        <w:rPr>
+          <w:rFonts w:asciiTheme="minorHAnsi" w:eastAsiaTheme="minorHAnsi" w:hAnsiTheme="minorHAnsi" w:cstheme="minorBidi"/>
+          <w:b w:val="0"/>
+          <w:bCs w:val="0"/>
+          <w:color w:val="auto"/>
+          <w:sz w:val="24"/>
+          <w:szCs w:val="24"/>
+          <w:lang w:val="en-GB"/>
+        </w:rPr>
         <w:id w:val="835037074"/>
         <w:docPartObj>
           <w:docPartGallery w:val="Table of Contents"/>
@@ -404,12 +409,7 @@
       </w:sdtPr>
       <w:sdtEndPr>
         <w:rPr>
-          <w:rFonts w:asciiTheme="minorHAnsi" w:eastAsiaTheme="minorHAnsi" w:hAnsiTheme="minorHAnsi" w:cstheme="minorBidi"/>
           <w:noProof/>
-          <w:color w:val="auto"/>
-          <w:sz w:val="24"/>
-          <w:szCs w:val="24"/>
-          <w:lang w:val="en-GB"/>
         </w:rPr>
       </w:sdtEndPr>
       <w:sdtContent>
@@ -1501,20 +1501,12 @@
     <w:p/>
     <w:p>
       <w:pPr>
-        <w:rPr>
-          <w:b/>
-        </w:rPr>
+        <w:pStyle w:val="Heading2"/>
       </w:pPr>
       <w:r>
-        <w:rPr>
-          <w:b/>
-        </w:rPr>
-        <w:t>Overall aim of this script:</w:t>
+        <w:t>Aim</w:t>
       </w:r>
       <w:r>
-        <w:rPr>
-          <w:b/>
-        </w:rPr>
         <w:t xml:space="preserve"> </w:t>
       </w:r>
     </w:p>
@@ -1677,15 +1669,10 @@
     <w:p/>
     <w:p>
       <w:pPr>
-        <w:rPr>
-          <w:b/>
-        </w:rPr>
+        <w:pStyle w:val="Heading2"/>
       </w:pPr>
       <w:r>
-        <w:rPr>
-          <w:b/>
-        </w:rPr>
-        <w:t>Input files this script needs:</w:t>
+        <w:t>Input Files</w:t>
       </w:r>
     </w:p>
     <w:p>
@@ -1696,15 +1683,10 @@
     <w:p/>
     <w:p>
       <w:pPr>
-        <w:rPr>
-          <w:b/>
-        </w:rPr>
+        <w:pStyle w:val="Heading2"/>
       </w:pPr>
       <w:r>
-        <w:rPr>
-          <w:b/>
-        </w:rPr>
-        <w:t>Output files this script will produce:</w:t>
+        <w:t>Output Files</w:t>
       </w:r>
     </w:p>
     <w:tbl>
@@ -2758,17 +2740,17 @@
       </w:tr>
     </w:tbl>
     <w:p/>
-    <w:p/>
-    <w:p/>
-    <w:p/>
-    <w:p/>
-    <w:p/>
-    <w:p/>
-    <w:p/>
+    <w:p>
+      <w:pPr>
+        <w:pStyle w:val="Heading2"/>
+      </w:pPr>
+      <w:r>
+        <w:t>Code</w:t>
+      </w:r>
+    </w:p>
     <w:tbl>
       <w:tblPr>
         <w:tblStyle w:val="GridTable2-Accent2"/>
-        <w:tblpPr w:leftFromText="180" w:rightFromText="180" w:vertAnchor="page" w:horzAnchor="margin" w:tblpY="1574"/>
         <w:tblW w:w="0" w:type="auto"/>
         <w:tblLook w:val="04A0" w:firstRow="1" w:lastRow="0" w:firstColumn="1" w:lastColumn="0" w:noHBand="0" w:noVBand="1"/>
       </w:tblPr>
@@ -2788,7 +2770,6 @@
           </w:tcPr>
           <w:p>
             <w:r>
-              <w:lastRenderedPageBreak/>
               <w:t>What am I trying to do?</w:t>
             </w:r>
           </w:p>
@@ -3122,6 +3103,7 @@
           </w:tcPr>
           <w:p>
             <w:r>
+              <w:lastRenderedPageBreak/>
               <w:t xml:space="preserve">Enter each file, </w:t>
             </w:r>
             <w:proofErr w:type="spellStart"/>
@@ -4046,7 +4028,6 @@
           </w:p>
           <w:p>
             <w:r>
-              <w:lastRenderedPageBreak/>
               <w:t>Updated sequences: 515F (</w:t>
             </w:r>
             <w:proofErr w:type="spellStart"/>
@@ -4086,12 +4067,7 @@
               <w:cnfStyle w:val="000000100000" w:firstRow="0" w:lastRow="0" w:firstColumn="0" w:lastColumn="0" w:oddVBand="0" w:evenVBand="0" w:oddHBand="1" w:evenHBand="0" w:firstRowFirstColumn="0" w:firstRowLastColumn="0" w:lastRowFirstColumn="0" w:lastRowLastColumn="0"/>
             </w:pPr>
             <w:r>
-              <w:lastRenderedPageBreak/>
-              <w:t xml:space="preserve">On the forward reads we are trimming the 5' end for the forward primer (GTGYCAGCMGCCGCGGTAA). We're trimming the 3' end for the reverse compliment of the reverse primer (ATTAGAWACCCBDGTAGTCC). On the </w:t>
-            </w:r>
-            <w:r>
-              <w:lastRenderedPageBreak/>
-              <w:t>reverse reads we're trimming the reverse primer (GGACTACNVGGGTWTCTAAT) and then the reverse compliment of the forward primer (TTACCGCGGCKGCTGGCAC).</w:t>
+              <w:t>On the forward reads we are trimming the 5' end for the forward primer (GTGYCAGCMGCCGCGGTAA). We're trimming the 3' end for the reverse compliment of the reverse primer (ATTAGAWACCCBDGTAGTCC). On the reverse reads we're trimming the reverse primer (GGACTACNVGGGTWTCTAAT) and then the reverse compliment of the forward primer (TTACCGCGGCKGCTGGCAC).</w:t>
             </w:r>
           </w:p>
           <w:p>
@@ -4138,7 +4114,6 @@
               <w:cnfStyle w:val="000000100000" w:firstRow="0" w:lastRow="0" w:firstColumn="0" w:lastColumn="0" w:oddVBand="0" w:evenVBand="0" w:oddHBand="1" w:evenHBand="0" w:firstRowFirstColumn="0" w:firstRowLastColumn="0" w:lastRowFirstColumn="0" w:lastRowLastColumn="0"/>
             </w:pPr>
             <w:r>
-              <w:lastRenderedPageBreak/>
               <w:t xml:space="preserve"> </w:t>
             </w:r>
             <w:proofErr w:type="spellStart"/>
@@ -4227,7 +4202,6 @@
               <w:cnfStyle w:val="000000100000" w:firstRow="0" w:lastRow="0" w:firstColumn="0" w:lastColumn="0" w:oddVBand="0" w:evenVBand="0" w:oddHBand="1" w:evenHBand="0" w:firstRowFirstColumn="0" w:firstRowLastColumn="0" w:lastRowFirstColumn="0" w:lastRowLastColumn="0"/>
             </w:pPr>
             <w:r>
-              <w:lastRenderedPageBreak/>
               <w:t>--p-adapter-r TTACCGCGGCKGCTGGCAC \</w:t>
             </w:r>
           </w:p>
@@ -5219,196 +5193,196 @@
               <w:cnfStyle w:val="000000100000" w:firstRow="0" w:lastRow="0" w:firstColumn="0" w:lastColumn="0" w:oddVBand="0" w:evenVBand="0" w:oddHBand="1" w:evenHBand="0" w:firstRowFirstColumn="0" w:firstRowLastColumn="0" w:lastRowFirstColumn="0" w:lastRowLastColumn="0"/>
             </w:pPr>
             <w:r>
+              <w:t>I've backed up my computer to my external hard drive.</w:t>
+            </w:r>
+          </w:p>
+          <w:p>
+            <w:pPr>
+              <w:cnfStyle w:val="000000100000" w:firstRow="0" w:lastRow="0" w:firstColumn="0" w:lastColumn="0" w:oddVBand="0" w:evenVBand="0" w:oddHBand="1" w:evenHBand="0" w:firstRowFirstColumn="0" w:firstRowLastColumn="0" w:lastRowFirstColumn="0" w:lastRowLastColumn="0"/>
+            </w:pPr>
+          </w:p>
+          <w:p>
+            <w:pPr>
+              <w:cnfStyle w:val="000000100000" w:firstRow="0" w:lastRow="0" w:firstColumn="0" w:lastColumn="0" w:oddVBand="0" w:evenVBand="0" w:oddHBand="1" w:evenHBand="0" w:firstRowFirstColumn="0" w:firstRowLastColumn="0" w:lastRowFirstColumn="0" w:lastRowLastColumn="0"/>
+            </w:pPr>
+            <w:r>
+              <w:t xml:space="preserve">###Then I'm going to follow these instructions to try and reassign my </w:t>
+            </w:r>
+            <w:proofErr w:type="spellStart"/>
+            <w:r>
+              <w:t>tmp</w:t>
+            </w:r>
+            <w:proofErr w:type="spellEnd"/>
+            <w:r>
+              <w:t xml:space="preserve"> folder and run the classification again</w:t>
+            </w:r>
+          </w:p>
+          <w:p>
+            <w:pPr>
+              <w:cnfStyle w:val="000000100000" w:firstRow="0" w:lastRow="0" w:firstColumn="0" w:lastColumn="0" w:oddVBand="0" w:evenVBand="0" w:oddHBand="1" w:evenHBand="0" w:firstRowFirstColumn="0" w:firstRowLastColumn="0" w:lastRowFirstColumn="0" w:lastRowLastColumn="0"/>
+            </w:pPr>
+            <w:r>
+              <w:t xml:space="preserve">https://forum.qiime2.org/t/error-on-running-silva-132-99-nb-classifier-1-qza-classifier/13252/3 </w:t>
+            </w:r>
+          </w:p>
+          <w:p>
+            <w:pPr>
+              <w:cnfStyle w:val="000000100000" w:firstRow="0" w:lastRow="0" w:firstColumn="0" w:lastColumn="0" w:oddVBand="0" w:evenVBand="0" w:oddHBand="1" w:evenHBand="0" w:firstRowFirstColumn="0" w:firstRowLastColumn="0" w:lastRowFirstColumn="0" w:lastRowLastColumn="0"/>
+            </w:pPr>
+            <w:r>
+              <w:t>I have reassigned by TMPDIR to a folder called data</w:t>
+            </w:r>
+          </w:p>
+        </w:tc>
+        <w:tc>
+          <w:tcPr>
+            <w:tcW w:w="4650" w:type="dxa"/>
+          </w:tcPr>
+          <w:p>
+            <w:pPr>
+              <w:cnfStyle w:val="000000100000" w:firstRow="0" w:lastRow="0" w:firstColumn="0" w:lastColumn="0" w:oddVBand="0" w:evenVBand="0" w:oddHBand="1" w:evenHBand="0" w:firstRowFirstColumn="0" w:firstRowLastColumn="0" w:lastRowFirstColumn="0" w:lastRowLastColumn="0"/>
+            </w:pPr>
+          </w:p>
+        </w:tc>
+      </w:tr>
+      <w:tr>
+        <w:tc>
+          <w:tcPr>
+            <w:cnfStyle w:val="001000000000" w:firstRow="0" w:lastRow="0" w:firstColumn="1" w:lastColumn="0" w:oddVBand="0" w:evenVBand="0" w:oddHBand="0" w:evenHBand="0" w:firstRowFirstColumn="0" w:firstRowLastColumn="0" w:lastRowFirstColumn="0" w:lastRowLastColumn="0"/>
+            <w:tcW w:w="4649" w:type="dxa"/>
+          </w:tcPr>
+          <w:p>
+            <w:r>
+              <w:t>Active the other QIIME2 version, classify representative sequences and visualise.</w:t>
+            </w:r>
+          </w:p>
+        </w:tc>
+        <w:tc>
+          <w:tcPr>
+            <w:tcW w:w="4649" w:type="dxa"/>
+          </w:tcPr>
+          <w:p>
+            <w:pPr>
+              <w:cnfStyle w:val="000000000000" w:firstRow="0" w:lastRow="0" w:firstColumn="0" w:lastColumn="0" w:oddVBand="0" w:evenVBand="0" w:oddHBand="0" w:evenHBand="0" w:firstRowFirstColumn="0" w:firstRowLastColumn="0" w:lastRowFirstColumn="0" w:lastRowLastColumn="0"/>
+            </w:pPr>
+            <w:r>
+              <w:t>This step tells us which ASVs are present in the dataset so we can start drawing some meaningful information out of the sequence data. WARNING: This takes an hour.</w:t>
+            </w:r>
+          </w:p>
+        </w:tc>
+        <w:tc>
+          <w:tcPr>
+            <w:tcW w:w="4650" w:type="dxa"/>
+          </w:tcPr>
+          <w:p>
+            <w:pPr>
+              <w:cnfStyle w:val="000000000000" w:firstRow="0" w:lastRow="0" w:firstColumn="0" w:lastColumn="0" w:oddVBand="0" w:evenVBand="0" w:oddHBand="0" w:evenHBand="0" w:firstRowFirstColumn="0" w:firstRowLastColumn="0" w:lastRowFirstColumn="0" w:lastRowLastColumn="0"/>
+            </w:pPr>
+            <w:proofErr w:type="spellStart"/>
+            <w:r>
+              <w:t>conda</w:t>
+            </w:r>
+            <w:proofErr w:type="spellEnd"/>
+            <w:r>
+              <w:t xml:space="preserve"> activate qiime2-2019.10</w:t>
+            </w:r>
+          </w:p>
+          <w:p>
+            <w:pPr>
+              <w:cnfStyle w:val="000000000000" w:firstRow="0" w:lastRow="0" w:firstColumn="0" w:lastColumn="0" w:oddVBand="0" w:evenVBand="0" w:oddHBand="0" w:evenHBand="0" w:firstRowFirstColumn="0" w:firstRowLastColumn="0" w:lastRowFirstColumn="0" w:lastRowLastColumn="0"/>
+            </w:pPr>
+          </w:p>
+          <w:p>
+            <w:pPr>
+              <w:cnfStyle w:val="000000000000" w:firstRow="0" w:lastRow="0" w:firstColumn="0" w:lastColumn="0" w:oddVBand="0" w:evenVBand="0" w:oddHBand="0" w:evenHBand="0" w:firstRowFirstColumn="0" w:firstRowLastColumn="0" w:lastRowFirstColumn="0" w:lastRowLastColumn="0"/>
+            </w:pPr>
+            <w:proofErr w:type="spellStart"/>
+            <w:r>
+              <w:t>qiime</w:t>
+            </w:r>
+            <w:proofErr w:type="spellEnd"/>
+            <w:r>
+              <w:t xml:space="preserve"> feature-classifier classify-</w:t>
+            </w:r>
+            <w:proofErr w:type="spellStart"/>
+            <w:r>
+              <w:t>sklearn</w:t>
+            </w:r>
+            <w:proofErr w:type="spellEnd"/>
+            <w:r>
+              <w:t xml:space="preserve"> \</w:t>
+            </w:r>
+          </w:p>
+          <w:p>
+            <w:pPr>
+              <w:cnfStyle w:val="000000000000" w:firstRow="0" w:lastRow="0" w:firstColumn="0" w:lastColumn="0" w:oddVBand="0" w:evenVBand="0" w:oddHBand="0" w:evenHBand="0" w:firstRowFirstColumn="0" w:firstRowLastColumn="0" w:lastRowFirstColumn="0" w:lastRowLastColumn="0"/>
+            </w:pPr>
+            <w:r>
+              <w:t>--</w:t>
+            </w:r>
+            <w:proofErr w:type="spellStart"/>
+            <w:r>
+              <w:t>i</w:t>
+            </w:r>
+            <w:proofErr w:type="spellEnd"/>
+            <w:r>
+              <w:t>-classifier work/silva-132-99-515-806-nb-classifier.qza \</w:t>
+            </w:r>
+          </w:p>
+          <w:p>
+            <w:pPr>
+              <w:cnfStyle w:val="000000000000" w:firstRow="0" w:lastRow="0" w:firstColumn="0" w:lastColumn="0" w:oddVBand="0" w:evenVBand="0" w:oddHBand="0" w:evenHBand="0" w:firstRowFirstColumn="0" w:firstRowLastColumn="0" w:lastRowFirstColumn="0" w:lastRowLastColumn="0"/>
+            </w:pPr>
+            <w:r>
+              <w:t>--</w:t>
+            </w:r>
+            <w:proofErr w:type="spellStart"/>
+            <w:r>
+              <w:t>i</w:t>
+            </w:r>
+            <w:proofErr w:type="spellEnd"/>
+            <w:r>
+              <w:t>-reads work/DADA2_denoising_output/</w:t>
+            </w:r>
+            <w:proofErr w:type="spellStart"/>
+            <w:r>
+              <w:t>representative_sequences.qza</w:t>
+            </w:r>
+            <w:proofErr w:type="spellEnd"/>
+            <w:r>
+              <w:t xml:space="preserve"> \</w:t>
+            </w:r>
+          </w:p>
+          <w:p>
+            <w:pPr>
+              <w:cnfStyle w:val="000000000000" w:firstRow="0" w:lastRow="0" w:firstColumn="0" w:lastColumn="0" w:oddVBand="0" w:evenVBand="0" w:oddHBand="0" w:evenHBand="0" w:firstRowFirstColumn="0" w:firstRowLastColumn="0" w:lastRowFirstColumn="0" w:lastRowLastColumn="0"/>
+            </w:pPr>
+            <w:r>
+              <w:t>--output-</w:t>
+            </w:r>
+            <w:proofErr w:type="spellStart"/>
+            <w:r>
+              <w:t>dir</w:t>
+            </w:r>
+            <w:proofErr w:type="spellEnd"/>
+            <w:r>
+              <w:t xml:space="preserve"> work/</w:t>
+            </w:r>
+            <w:proofErr w:type="spellStart"/>
+            <w:r>
+              <w:t>classified_sequences</w:t>
+            </w:r>
+            <w:proofErr w:type="spellEnd"/>
+            <w:r>
+              <w:t xml:space="preserve"> \</w:t>
+            </w:r>
+          </w:p>
+          <w:p>
+            <w:pPr>
+              <w:cnfStyle w:val="000000000000" w:firstRow="0" w:lastRow="0" w:firstColumn="0" w:lastColumn="0" w:oddVBand="0" w:evenVBand="0" w:oddHBand="0" w:evenHBand="0" w:firstRowFirstColumn="0" w:firstRowLastColumn="0" w:lastRowFirstColumn="0" w:lastRowLastColumn="0"/>
+            </w:pPr>
+            <w:r>
               <w:lastRenderedPageBreak/>
-              <w:t>I've backed up my computer to my external hard drive.</w:t>
-            </w:r>
-          </w:p>
-          <w:p>
-            <w:pPr>
-              <w:cnfStyle w:val="000000100000" w:firstRow="0" w:lastRow="0" w:firstColumn="0" w:lastColumn="0" w:oddVBand="0" w:evenVBand="0" w:oddHBand="1" w:evenHBand="0" w:firstRowFirstColumn="0" w:firstRowLastColumn="0" w:lastRowFirstColumn="0" w:lastRowLastColumn="0"/>
-            </w:pPr>
-          </w:p>
-          <w:p>
-            <w:pPr>
-              <w:cnfStyle w:val="000000100000" w:firstRow="0" w:lastRow="0" w:firstColumn="0" w:lastColumn="0" w:oddVBand="0" w:evenVBand="0" w:oddHBand="1" w:evenHBand="0" w:firstRowFirstColumn="0" w:firstRowLastColumn="0" w:lastRowFirstColumn="0" w:lastRowLastColumn="0"/>
-            </w:pPr>
-            <w:r>
-              <w:t xml:space="preserve">###Then I'm going to follow these instructions to try and reassign my </w:t>
-            </w:r>
-            <w:proofErr w:type="spellStart"/>
-            <w:r>
-              <w:t>tmp</w:t>
-            </w:r>
-            <w:proofErr w:type="spellEnd"/>
-            <w:r>
-              <w:t xml:space="preserve"> folder and run the classification again</w:t>
-            </w:r>
-          </w:p>
-          <w:p>
-            <w:pPr>
-              <w:cnfStyle w:val="000000100000" w:firstRow="0" w:lastRow="0" w:firstColumn="0" w:lastColumn="0" w:oddVBand="0" w:evenVBand="0" w:oddHBand="1" w:evenHBand="0" w:firstRowFirstColumn="0" w:firstRowLastColumn="0" w:lastRowFirstColumn="0" w:lastRowLastColumn="0"/>
-            </w:pPr>
-            <w:r>
-              <w:t xml:space="preserve">https://forum.qiime2.org/t/error-on-running-silva-132-99-nb-classifier-1-qza-classifier/13252/3 </w:t>
-            </w:r>
-          </w:p>
-          <w:p>
-            <w:pPr>
-              <w:cnfStyle w:val="000000100000" w:firstRow="0" w:lastRow="0" w:firstColumn="0" w:lastColumn="0" w:oddVBand="0" w:evenVBand="0" w:oddHBand="1" w:evenHBand="0" w:firstRowFirstColumn="0" w:firstRowLastColumn="0" w:lastRowFirstColumn="0" w:lastRowLastColumn="0"/>
-            </w:pPr>
-            <w:r>
-              <w:t>I have reassigned by TMPDIR to a folder called data</w:t>
-            </w:r>
-          </w:p>
-        </w:tc>
-        <w:tc>
-          <w:tcPr>
-            <w:tcW w:w="4650" w:type="dxa"/>
-          </w:tcPr>
-          <w:p>
-            <w:pPr>
-              <w:cnfStyle w:val="000000100000" w:firstRow="0" w:lastRow="0" w:firstColumn="0" w:lastColumn="0" w:oddVBand="0" w:evenVBand="0" w:oddHBand="1" w:evenHBand="0" w:firstRowFirstColumn="0" w:firstRowLastColumn="0" w:lastRowFirstColumn="0" w:lastRowLastColumn="0"/>
-            </w:pPr>
-          </w:p>
-        </w:tc>
-      </w:tr>
-      <w:tr>
-        <w:tc>
-          <w:tcPr>
-            <w:cnfStyle w:val="001000000000" w:firstRow="0" w:lastRow="0" w:firstColumn="1" w:lastColumn="0" w:oddVBand="0" w:evenVBand="0" w:oddHBand="0" w:evenHBand="0" w:firstRowFirstColumn="0" w:firstRowLastColumn="0" w:lastRowFirstColumn="0" w:lastRowLastColumn="0"/>
-            <w:tcW w:w="4649" w:type="dxa"/>
-          </w:tcPr>
-          <w:p>
-            <w:r>
-              <w:t>Active the other QIIME2 version, classify representative sequences and visualise.</w:t>
-            </w:r>
-          </w:p>
-        </w:tc>
-        <w:tc>
-          <w:tcPr>
-            <w:tcW w:w="4649" w:type="dxa"/>
-          </w:tcPr>
-          <w:p>
-            <w:pPr>
-              <w:cnfStyle w:val="000000000000" w:firstRow="0" w:lastRow="0" w:firstColumn="0" w:lastColumn="0" w:oddVBand="0" w:evenVBand="0" w:oddHBand="0" w:evenHBand="0" w:firstRowFirstColumn="0" w:firstRowLastColumn="0" w:lastRowFirstColumn="0" w:lastRowLastColumn="0"/>
-            </w:pPr>
-            <w:r>
-              <w:t>This step tells us which ASVs are present in the dataset so we can start drawing some meaningful information out of the sequence data. WARNING: This takes an hour.</w:t>
-            </w:r>
-          </w:p>
-        </w:tc>
-        <w:tc>
-          <w:tcPr>
-            <w:tcW w:w="4650" w:type="dxa"/>
-          </w:tcPr>
-          <w:p>
-            <w:pPr>
-              <w:cnfStyle w:val="000000000000" w:firstRow="0" w:lastRow="0" w:firstColumn="0" w:lastColumn="0" w:oddVBand="0" w:evenVBand="0" w:oddHBand="0" w:evenHBand="0" w:firstRowFirstColumn="0" w:firstRowLastColumn="0" w:lastRowFirstColumn="0" w:lastRowLastColumn="0"/>
-            </w:pPr>
-            <w:proofErr w:type="spellStart"/>
-            <w:r>
-              <w:t>conda</w:t>
-            </w:r>
-            <w:proofErr w:type="spellEnd"/>
-            <w:r>
-              <w:t xml:space="preserve"> activate qiime2-2019.10</w:t>
-            </w:r>
-          </w:p>
-          <w:p>
-            <w:pPr>
-              <w:cnfStyle w:val="000000000000" w:firstRow="0" w:lastRow="0" w:firstColumn="0" w:lastColumn="0" w:oddVBand="0" w:evenVBand="0" w:oddHBand="0" w:evenHBand="0" w:firstRowFirstColumn="0" w:firstRowLastColumn="0" w:lastRowFirstColumn="0" w:lastRowLastColumn="0"/>
-            </w:pPr>
-          </w:p>
-          <w:p>
-            <w:pPr>
-              <w:cnfStyle w:val="000000000000" w:firstRow="0" w:lastRow="0" w:firstColumn="0" w:lastColumn="0" w:oddVBand="0" w:evenVBand="0" w:oddHBand="0" w:evenHBand="0" w:firstRowFirstColumn="0" w:firstRowLastColumn="0" w:lastRowFirstColumn="0" w:lastRowLastColumn="0"/>
-            </w:pPr>
-            <w:proofErr w:type="spellStart"/>
-            <w:r>
-              <w:t>qiime</w:t>
-            </w:r>
-            <w:proofErr w:type="spellEnd"/>
-            <w:r>
-              <w:t xml:space="preserve"> feature-classifier classify-</w:t>
-            </w:r>
-            <w:proofErr w:type="spellStart"/>
-            <w:r>
-              <w:t>sklearn</w:t>
-            </w:r>
-            <w:proofErr w:type="spellEnd"/>
-            <w:r>
-              <w:t xml:space="preserve"> \</w:t>
-            </w:r>
-          </w:p>
-          <w:p>
-            <w:pPr>
-              <w:cnfStyle w:val="000000000000" w:firstRow="0" w:lastRow="0" w:firstColumn="0" w:lastColumn="0" w:oddVBand="0" w:evenVBand="0" w:oddHBand="0" w:evenHBand="0" w:firstRowFirstColumn="0" w:firstRowLastColumn="0" w:lastRowFirstColumn="0" w:lastRowLastColumn="0"/>
-            </w:pPr>
-            <w:r>
-              <w:t>--</w:t>
-            </w:r>
-            <w:proofErr w:type="spellStart"/>
-            <w:r>
-              <w:t>i</w:t>
-            </w:r>
-            <w:proofErr w:type="spellEnd"/>
-            <w:r>
-              <w:t>-classifier work/silva-132-99-515-806-nb-classifier.qza \</w:t>
-            </w:r>
-          </w:p>
-          <w:p>
-            <w:pPr>
-              <w:cnfStyle w:val="000000000000" w:firstRow="0" w:lastRow="0" w:firstColumn="0" w:lastColumn="0" w:oddVBand="0" w:evenVBand="0" w:oddHBand="0" w:evenHBand="0" w:firstRowFirstColumn="0" w:firstRowLastColumn="0" w:lastRowFirstColumn="0" w:lastRowLastColumn="0"/>
-            </w:pPr>
-            <w:r>
-              <w:t>--</w:t>
-            </w:r>
-            <w:proofErr w:type="spellStart"/>
-            <w:r>
-              <w:t>i</w:t>
-            </w:r>
-            <w:proofErr w:type="spellEnd"/>
-            <w:r>
-              <w:t>-reads work/DADA2_denoising_output/</w:t>
-            </w:r>
-            <w:proofErr w:type="spellStart"/>
-            <w:r>
-              <w:t>representative_sequences.qza</w:t>
-            </w:r>
-            <w:proofErr w:type="spellEnd"/>
-            <w:r>
-              <w:t xml:space="preserve"> \</w:t>
-            </w:r>
-          </w:p>
-          <w:p>
-            <w:pPr>
-              <w:cnfStyle w:val="000000000000" w:firstRow="0" w:lastRow="0" w:firstColumn="0" w:lastColumn="0" w:oddVBand="0" w:evenVBand="0" w:oddHBand="0" w:evenHBand="0" w:firstRowFirstColumn="0" w:firstRowLastColumn="0" w:lastRowFirstColumn="0" w:lastRowLastColumn="0"/>
-            </w:pPr>
-            <w:r>
-              <w:t>--output-</w:t>
-            </w:r>
-            <w:proofErr w:type="spellStart"/>
-            <w:r>
-              <w:t>dir</w:t>
-            </w:r>
-            <w:proofErr w:type="spellEnd"/>
-            <w:r>
-              <w:t xml:space="preserve"> work/</w:t>
-            </w:r>
-            <w:proofErr w:type="spellStart"/>
-            <w:r>
-              <w:t>classified_sequences</w:t>
-            </w:r>
-            <w:proofErr w:type="spellEnd"/>
-            <w:r>
-              <w:t xml:space="preserve"> \</w:t>
-            </w:r>
-          </w:p>
-          <w:p>
-            <w:pPr>
-              <w:cnfStyle w:val="000000000000" w:firstRow="0" w:lastRow="0" w:firstColumn="0" w:lastColumn="0" w:oddVBand="0" w:evenVBand="0" w:oddHBand="0" w:evenHBand="0" w:firstRowFirstColumn="0" w:firstRowLastColumn="0" w:lastRowFirstColumn="0" w:lastRowLastColumn="0"/>
-            </w:pPr>
-            <w:r>
               <w:t>--verbose</w:t>
             </w:r>
           </w:p>
@@ -5530,6 +5504,7 @@
           </w:tcPr>
           <w:p>
             <w:r>
+              <w:lastRenderedPageBreak/>
               <w:t>Create a folder for building a phylogenetic tree.</w:t>
             </w:r>
           </w:p>
@@ -6520,22 +6495,18 @@
     <w:p/>
     <w:p>
       <w:pPr>
+        <w:pStyle w:val="Heading2"/>
+      </w:pPr>
+      <w:r>
+        <w:t>Aim</w:t>
+      </w:r>
+    </w:p>
+    <w:p>
+      <w:pPr>
         <w:rPr>
           <w:b/>
         </w:rPr>
       </w:pPr>
-      <w:r>
-        <w:rPr>
-          <w:b/>
-        </w:rPr>
-        <w:t>Overall aim of this script:</w:t>
-      </w:r>
-      <w:r>
-        <w:rPr>
-          <w:b/>
-        </w:rPr>
-        <w:t xml:space="preserve"> </w:t>
-      </w:r>
       <w:r>
         <w:t>W</w:t>
       </w:r>
@@ -6558,15 +6529,16 @@
     <w:p/>
     <w:p>
       <w:pPr>
-        <w:rPr>
-          <w:b/>
-        </w:rPr>
+        <w:pStyle w:val="Heading2"/>
       </w:pPr>
       <w:r>
-        <w:rPr>
-          <w:b/>
-        </w:rPr>
-        <w:t>Input files</w:t>
+        <w:t xml:space="preserve">Input </w:t>
+      </w:r>
+      <w:r>
+        <w:t>F</w:t>
+      </w:r>
+      <w:r>
+        <w:t>iles</w:t>
       </w:r>
     </w:p>
     <w:tbl>
@@ -6641,15 +6613,16 @@
     <w:p/>
     <w:p>
       <w:pPr>
-        <w:rPr>
-          <w:b/>
-        </w:rPr>
+        <w:pStyle w:val="Heading2"/>
       </w:pPr>
       <w:r>
-        <w:rPr>
-          <w:b/>
-        </w:rPr>
-        <w:t>Output files</w:t>
+        <w:t xml:space="preserve">Output </w:t>
+      </w:r>
+      <w:r>
+        <w:t>F</w:t>
+      </w:r>
+      <w:r>
+        <w:t>iles</w:t>
       </w:r>
     </w:p>
     <w:tbl>
@@ -6727,10 +6700,17 @@
       </w:tr>
     </w:tbl>
     <w:p/>
+    <w:p>
+      <w:pPr>
+        <w:pStyle w:val="Heading2"/>
+      </w:pPr>
+      <w:r>
+        <w:t>Code</w:t>
+      </w:r>
+    </w:p>
     <w:tbl>
       <w:tblPr>
         <w:tblStyle w:val="GridTable2-Accent2"/>
-        <w:tblpPr w:leftFromText="180" w:rightFromText="180" w:vertAnchor="page" w:horzAnchor="margin" w:tblpY="4653"/>
         <w:tblW w:w="0" w:type="auto"/>
         <w:tblLook w:val="04A0" w:firstRow="1" w:lastRow="0" w:firstColumn="1" w:lastColumn="0" w:noHBand="0" w:noVBand="1"/>
       </w:tblPr>
@@ -7576,7 +7556,6 @@
         </w:tc>
       </w:tr>
     </w:tbl>
-    <w:p/>
     <w:p>
       <w:pPr>
         <w:pStyle w:val="Heading1"/>
@@ -7595,18 +7574,14 @@
     </w:p>
     <w:p/>
     <w:p>
+      <w:pPr>
+        <w:pStyle w:val="Heading2"/>
+      </w:pPr>
       <w:r>
-        <w:rPr>
-          <w:b/>
-        </w:rPr>
-        <w:t>Overall aim of this script:</w:t>
+        <w:t>Aim</w:t>
       </w:r>
-      <w:r>
-        <w:rPr>
-          <w:b/>
-        </w:rPr>
-        <w:t xml:space="preserve"> </w:t>
-      </w:r>
+    </w:p>
+    <w:p>
       <w:r>
         <w:t xml:space="preserve">To prepare the QIIME2 output for downstream analysis by identifying and removing contaminants, removing singletons (although we may run the analysis without doing this for rare taxa), transform data, generate </w:t>
       </w:r>
@@ -7622,15 +7597,16 @@
     <w:p/>
     <w:p>
       <w:pPr>
-        <w:rPr>
-          <w:b/>
-        </w:rPr>
+        <w:pStyle w:val="Heading2"/>
       </w:pPr>
       <w:r>
-        <w:rPr>
-          <w:b/>
-        </w:rPr>
-        <w:t>Input files</w:t>
+        <w:t xml:space="preserve">Input </w:t>
+      </w:r>
+      <w:r>
+        <w:t>F</w:t>
+      </w:r>
+      <w:r>
+        <w:t>iles</w:t>
       </w:r>
     </w:p>
     <w:tbl>
@@ -7640,8 +7616,8 @@
         <w:tblLook w:val="04A0" w:firstRow="1" w:lastRow="0" w:firstColumn="1" w:lastColumn="0" w:noHBand="0" w:noVBand="1"/>
       </w:tblPr>
       <w:tblGrid>
-        <w:gridCol w:w="7694"/>
-        <w:gridCol w:w="7694"/>
+        <w:gridCol w:w="4072"/>
+        <w:gridCol w:w="11326"/>
       </w:tblGrid>
       <w:tr>
         <w:trPr>
@@ -7650,7 +7626,7 @@
         <w:tc>
           <w:tcPr>
             <w:cnfStyle w:val="001000000000" w:firstRow="0" w:lastRow="0" w:firstColumn="1" w:lastColumn="0" w:oddVBand="0" w:evenVBand="0" w:oddHBand="0" w:evenHBand="0" w:firstRowFirstColumn="0" w:firstRowLastColumn="0" w:lastRowFirstColumn="0" w:lastRowLastColumn="0"/>
-            <w:tcW w:w="7694" w:type="dxa"/>
+            <w:tcW w:w="0" w:type="auto"/>
           </w:tcPr>
           <w:p>
             <w:r>
@@ -7660,7 +7636,7 @@
         </w:tc>
         <w:tc>
           <w:tcPr>
-            <w:tcW w:w="7694" w:type="dxa"/>
+            <w:tcW w:w="0" w:type="auto"/>
           </w:tcPr>
           <w:p>
             <w:pPr>
@@ -7679,18 +7655,181 @@
         <w:tc>
           <w:tcPr>
             <w:cnfStyle w:val="001000000000" w:firstRow="0" w:lastRow="0" w:firstColumn="1" w:lastColumn="0" w:oddVBand="0" w:evenVBand="0" w:oddHBand="0" w:evenHBand="0" w:firstRowFirstColumn="0" w:firstRowLastColumn="0" w:lastRowFirstColumn="0" w:lastRowLastColumn="0"/>
-            <w:tcW w:w="7694" w:type="dxa"/>
-          </w:tcPr>
-          <w:p/>
-        </w:tc>
-        <w:tc>
-          <w:tcPr>
-            <w:tcW w:w="7694" w:type="dxa"/>
-          </w:tcPr>
-          <w:p>
-            <w:pPr>
-              <w:cnfStyle w:val="000000100000" w:firstRow="0" w:lastRow="0" w:firstColumn="0" w:lastColumn="0" w:oddVBand="0" w:evenVBand="0" w:oddHBand="1" w:evenHBand="0" w:firstRowFirstColumn="0" w:firstRowLastColumn="0" w:lastRowFirstColumn="0" w:lastRowLastColumn="0"/>
-            </w:pPr>
+            <w:tcW w:w="0" w:type="auto"/>
+          </w:tcPr>
+          <w:p>
+            <w:r>
+              <w:t>export/table/</w:t>
+            </w:r>
+            <w:proofErr w:type="spellStart"/>
+            <w:r>
+              <w:t>table.tsv</w:t>
+            </w:r>
+            <w:proofErr w:type="spellEnd"/>
+          </w:p>
+        </w:tc>
+        <w:tc>
+          <w:tcPr>
+            <w:tcW w:w="0" w:type="auto"/>
+          </w:tcPr>
+          <w:p>
+            <w:pPr>
+              <w:cnfStyle w:val="000000100000" w:firstRow="0" w:lastRow="0" w:firstColumn="0" w:lastColumn="0" w:oddVBand="0" w:evenVBand="0" w:oddHBand="1" w:evenHBand="0" w:firstRowFirstColumn="0" w:firstRowLastColumn="0" w:lastRowFirstColumn="0" w:lastRowLastColumn="0"/>
+            </w:pPr>
+            <w:r>
+              <w:t>ASV count table with sample as columns and ASV as row from 1a-QIIME2-DADA2.sh</w:t>
+            </w:r>
+          </w:p>
+        </w:tc>
+      </w:tr>
+      <w:tr>
+        <w:tc>
+          <w:tcPr>
+            <w:cnfStyle w:val="001000000000" w:firstRow="0" w:lastRow="0" w:firstColumn="1" w:lastColumn="0" w:oddVBand="0" w:evenVBand="0" w:oddHBand="0" w:evenHBand="0" w:firstRowFirstColumn="0" w:firstRowLastColumn="0" w:lastRowFirstColumn="0" w:lastRowLastColumn="0"/>
+            <w:tcW w:w="0" w:type="auto"/>
+          </w:tcPr>
+          <w:p>
+            <w:r>
+              <w:t>export/taxonomy/</w:t>
+            </w:r>
+            <w:proofErr w:type="spellStart"/>
+            <w:r>
+              <w:t>taxonomy.tsv</w:t>
+            </w:r>
+            <w:proofErr w:type="spellEnd"/>
+          </w:p>
+        </w:tc>
+        <w:tc>
+          <w:tcPr>
+            <w:tcW w:w="0" w:type="auto"/>
+          </w:tcPr>
+          <w:p>
+            <w:pPr>
+              <w:cnfStyle w:val="000000000000" w:firstRow="0" w:lastRow="0" w:firstColumn="0" w:lastColumn="0" w:oddVBand="0" w:evenVBand="0" w:oddHBand="0" w:evenHBand="0" w:firstRowFirstColumn="0" w:firstRowLastColumn="0" w:lastRowFirstColumn="0" w:lastRowLastColumn="0"/>
+            </w:pPr>
+            <w:r>
+              <w:t>Table of feature (ASV) IDs and their taxonomic classifications from 1a-QIIME2-DADA2.sh</w:t>
+            </w:r>
+          </w:p>
+        </w:tc>
+      </w:tr>
+      <w:tr>
+        <w:trPr>
+          <w:cnfStyle w:val="000000100000" w:firstRow="0" w:lastRow="0" w:firstColumn="0" w:lastColumn="0" w:oddVBand="0" w:evenVBand="0" w:oddHBand="1" w:evenHBand="0" w:firstRowFirstColumn="0" w:firstRowLastColumn="0" w:lastRowFirstColumn="0" w:lastRowLastColumn="0"/>
+        </w:trPr>
+        <w:tc>
+          <w:tcPr>
+            <w:cnfStyle w:val="001000000000" w:firstRow="0" w:lastRow="0" w:firstColumn="1" w:lastColumn="0" w:oddVBand="0" w:evenVBand="0" w:oddHBand="0" w:evenHBand="0" w:firstRowFirstColumn="0" w:firstRowLastColumn="0" w:lastRowFirstColumn="0" w:lastRowLastColumn="0"/>
+            <w:tcW w:w="0" w:type="auto"/>
+          </w:tcPr>
+          <w:p>
+            <w:r>
+              <w:t>export/exported-tree/</w:t>
+            </w:r>
+            <w:proofErr w:type="spellStart"/>
+            <w:r>
+              <w:t>tree.nwk</w:t>
+            </w:r>
+            <w:proofErr w:type="spellEnd"/>
+          </w:p>
+        </w:tc>
+        <w:tc>
+          <w:tcPr>
+            <w:tcW w:w="0" w:type="auto"/>
+          </w:tcPr>
+          <w:p>
+            <w:pPr>
+              <w:cnfStyle w:val="000000100000" w:firstRow="0" w:lastRow="0" w:firstColumn="0" w:lastColumn="0" w:oddVBand="0" w:evenVBand="0" w:oddHBand="1" w:evenHBand="0" w:firstRowFirstColumn="0" w:firstRowLastColumn="0" w:lastRowFirstColumn="0" w:lastRowLastColumn="0"/>
+            </w:pPr>
+            <w:r>
+              <w:t>The rooted phylogenetic tree from 1a-QIIME2-DADA2.sh</w:t>
+            </w:r>
+          </w:p>
+        </w:tc>
+      </w:tr>
+      <w:tr>
+        <w:tc>
+          <w:tcPr>
+            <w:cnfStyle w:val="001000000000" w:firstRow="0" w:lastRow="0" w:firstColumn="1" w:lastColumn="0" w:oddVBand="0" w:evenVBand="0" w:oddHBand="0" w:evenHBand="0" w:firstRowFirstColumn="0" w:firstRowLastColumn="0" w:lastRowFirstColumn="0" w:lastRowLastColumn="0"/>
+            <w:tcW w:w="0" w:type="auto"/>
+          </w:tcPr>
+          <w:p>
+            <w:r>
+              <w:t>export/rep-</w:t>
+            </w:r>
+            <w:proofErr w:type="spellStart"/>
+            <w:r>
+              <w:t>seqs.fasta</w:t>
+            </w:r>
+            <w:proofErr w:type="spellEnd"/>
+            <w:r>
+              <w:t>/</w:t>
+            </w:r>
+            <w:proofErr w:type="spellStart"/>
+            <w:r>
+              <w:t>dna-sequences.fasta</w:t>
+            </w:r>
+            <w:proofErr w:type="spellEnd"/>
+          </w:p>
+        </w:tc>
+        <w:tc>
+          <w:tcPr>
+            <w:tcW w:w="0" w:type="auto"/>
+          </w:tcPr>
+          <w:p>
+            <w:pPr>
+              <w:cnfStyle w:val="000000000000" w:firstRow="0" w:lastRow="0" w:firstColumn="0" w:lastColumn="0" w:oddVBand="0" w:evenVBand="0" w:oddHBand="0" w:evenHBand="0" w:firstRowFirstColumn="0" w:firstRowLastColumn="0" w:lastRowFirstColumn="0" w:lastRowLastColumn="0"/>
+            </w:pPr>
+            <w:r>
+              <w:t xml:space="preserve">The remaining representative sequences after denoising (i.e. a list of all the unique base pair sequences present in the denoised dataset), exported as a </w:t>
+            </w:r>
+            <w:proofErr w:type="spellStart"/>
+            <w:r>
+              <w:t>fasta</w:t>
+            </w:r>
+            <w:proofErr w:type="spellEnd"/>
+            <w:r>
+              <w:t xml:space="preserve"> file from 1a-QIIME2-DADA2.sh</w:t>
+            </w:r>
+          </w:p>
+        </w:tc>
+      </w:tr>
+      <w:tr>
+        <w:trPr>
+          <w:cnfStyle w:val="000000100000" w:firstRow="0" w:lastRow="0" w:firstColumn="0" w:lastColumn="0" w:oddVBand="0" w:evenVBand="0" w:oddHBand="1" w:evenHBand="0" w:firstRowFirstColumn="0" w:firstRowLastColumn="0" w:lastRowFirstColumn="0" w:lastRowLastColumn="0"/>
+        </w:trPr>
+        <w:tc>
+          <w:tcPr>
+            <w:cnfStyle w:val="001000000000" w:firstRow="0" w:lastRow="0" w:firstColumn="1" w:lastColumn="0" w:oddVBand="0" w:evenVBand="0" w:oddHBand="0" w:evenHBand="0" w:firstRowFirstColumn="0" w:firstRowLastColumn="0" w:lastRowFirstColumn="0" w:lastRowLastColumn="0"/>
+            <w:tcW w:w="0" w:type="auto"/>
+          </w:tcPr>
+          <w:p>
+            <w:r>
+              <w:t>export/</w:t>
+            </w:r>
+            <w:proofErr w:type="spellStart"/>
+            <w:r>
+              <w:t>SraRunTable-wrangle.tsv</w:t>
+            </w:r>
+            <w:proofErr w:type="spellEnd"/>
+          </w:p>
+        </w:tc>
+        <w:tc>
+          <w:tcPr>
+            <w:tcW w:w="0" w:type="auto"/>
+          </w:tcPr>
+          <w:p>
+            <w:pPr>
+              <w:cnfStyle w:val="000000100000" w:firstRow="0" w:lastRow="0" w:firstColumn="0" w:lastColumn="0" w:oddVBand="0" w:evenVBand="0" w:oddHBand="1" w:evenHBand="0" w:firstRowFirstColumn="0" w:firstRowLastColumn="0" w:lastRowFirstColumn="0" w:lastRowLastColumn="0"/>
+            </w:pPr>
+            <w:r>
+              <w:t>Metadata table with categorical and numerical classification of variables from 1b-metadata-</w:t>
+            </w:r>
+            <w:proofErr w:type="gramStart"/>
+            <w:r>
+              <w:t>wrangle.R</w:t>
+            </w:r>
+            <w:proofErr w:type="gramEnd"/>
           </w:p>
         </w:tc>
       </w:tr>
@@ -7698,15 +7837,16 @@
     <w:p/>
     <w:p>
       <w:pPr>
-        <w:rPr>
-          <w:b/>
-        </w:rPr>
+        <w:pStyle w:val="Heading2"/>
       </w:pPr>
       <w:r>
-        <w:rPr>
-          <w:b/>
-        </w:rPr>
-        <w:t>Output files</w:t>
+        <w:t xml:space="preserve">Output </w:t>
+      </w:r>
+      <w:r>
+        <w:t>F</w:t>
+      </w:r>
+      <w:r>
+        <w:t>iles</w:t>
       </w:r>
     </w:p>
     <w:tbl>
@@ -7772,18 +7912,24 @@
       </w:tr>
     </w:tbl>
     <w:p/>
-    <w:p/>
+    <w:p>
+      <w:pPr>
+        <w:pStyle w:val="Heading2"/>
+      </w:pPr>
+      <w:r>
+        <w:t>Code</w:t>
+      </w:r>
+    </w:p>
     <w:tbl>
       <w:tblPr>
         <w:tblStyle w:val="GridTable2-Accent2"/>
-        <w:tblpPr w:leftFromText="180" w:rightFromText="180" w:vertAnchor="page" w:horzAnchor="margin" w:tblpY="5429"/>
         <w:tblW w:w="0" w:type="auto"/>
         <w:tblLook w:val="04A0" w:firstRow="1" w:lastRow="0" w:firstColumn="1" w:lastColumn="0" w:noHBand="0" w:noVBand="1"/>
       </w:tblPr>
       <w:tblGrid>
-        <w:gridCol w:w="3767"/>
-        <w:gridCol w:w="6681"/>
-        <w:gridCol w:w="4950"/>
+        <w:gridCol w:w="3444"/>
+        <w:gridCol w:w="5954"/>
+        <w:gridCol w:w="6000"/>
       </w:tblGrid>
       <w:tr>
         <w:trPr>
@@ -7964,13 +8110,7 @@
             </w:r>
             <w:proofErr w:type="gramStart"/>
             <w:r>
-              <w:t xml:space="preserve">– </w:t>
-            </w:r>
-            <w:r>
-              <w:rPr>
-                <w:rStyle w:val="TableGrid"/>
-              </w:rPr>
-              <w:t xml:space="preserve"> </w:t>
+              <w:t xml:space="preserve">–  </w:t>
             </w:r>
             <w:proofErr w:type="spellStart"/>
             <w:r>
@@ -7985,19 +8125,7 @@
               <w:rPr>
                 <w:rStyle w:val="hgkelc"/>
               </w:rPr>
-              <w:t xml:space="preserve"> read</w:t>
-            </w:r>
-            <w:r>
-              <w:rPr>
-                <w:rStyle w:val="hgkelc"/>
-              </w:rPr>
-              <w:t>s</w:t>
-            </w:r>
-            <w:r>
-              <w:rPr>
-                <w:rStyle w:val="hgkelc"/>
-              </w:rPr>
-              <w:t xml:space="preserve"> rectangular data (like 'csv', '</w:t>
+              <w:t xml:space="preserve"> reads rectangular data (like 'csv', '</w:t>
             </w:r>
             <w:proofErr w:type="spellStart"/>
             <w:r>
@@ -8042,16 +8170,7 @@
             </w:r>
             <w:proofErr w:type="gramStart"/>
             <w:r>
-              <w:t>–</w:t>
-            </w:r>
-            <w:r>
-              <w:t xml:space="preserve"> </w:t>
-            </w:r>
-            <w:r>
-              <w:rPr>
-                <w:rStyle w:val="TableGrid"/>
-              </w:rPr>
-              <w:t xml:space="preserve"> </w:t>
+              <w:t xml:space="preserve">–  </w:t>
             </w:r>
             <w:r>
               <w:rPr>
@@ -8064,13 +8183,7 @@
               <w:rPr>
                 <w:rStyle w:val="hgkelc"/>
               </w:rPr>
-              <w:t xml:space="preserve"> data analysis and visualization for biological sequence</w:t>
-            </w:r>
-            <w:r>
-              <w:rPr>
-                <w:rStyle w:val="hgkelc"/>
-              </w:rPr>
-              <w:t xml:space="preserve"> data</w:t>
+              <w:t xml:space="preserve"> data analysis and visualization for biological sequence data</w:t>
             </w:r>
           </w:p>
           <w:p>
@@ -8095,10 +8208,7 @@
             </w:r>
             <w:proofErr w:type="gramStart"/>
             <w:r>
-              <w:t xml:space="preserve">– </w:t>
-            </w:r>
-            <w:r>
-              <w:t xml:space="preserve"> F</w:t>
+              <w:t>–  F</w:t>
             </w:r>
             <w:r>
               <w:t>or</w:t>
@@ -8127,10 +8237,7 @@
             </w:r>
             <w:proofErr w:type="spellEnd"/>
             <w:r>
-              <w:t xml:space="preserve"> – </w:t>
-            </w:r>
-            <w:r>
-              <w:t>For improving code readability</w:t>
+              <w:t xml:space="preserve"> – For improving code readability</w:t>
             </w:r>
           </w:p>
           <w:p>
@@ -8143,10 +8250,7 @@
             </w:r>
             <w:proofErr w:type="spellEnd"/>
             <w:r>
-              <w:t xml:space="preserve"> – </w:t>
-            </w:r>
-            <w:r>
-              <w:t xml:space="preserve">An enhanced version of </w:t>
+              <w:t xml:space="preserve"> – An enhanced version of </w:t>
             </w:r>
             <w:proofErr w:type="spellStart"/>
             <w:proofErr w:type="gramStart"/>
@@ -8161,10 +8265,7 @@
               <w:cnfStyle w:val="000000000000" w:firstRow="0" w:lastRow="0" w:firstColumn="0" w:lastColumn="0" w:oddVBand="0" w:evenVBand="0" w:oddHBand="0" w:evenHBand="0" w:firstRowFirstColumn="0" w:firstRowLastColumn="0" w:lastRowFirstColumn="0" w:lastRowLastColumn="0"/>
             </w:pPr>
             <w:r>
-              <w:t xml:space="preserve">Ape – </w:t>
-            </w:r>
-            <w:r>
-              <w:t>For analysis of phylogenetic data</w:t>
+              <w:t>Ape – For analysis of phylogenetic data</w:t>
             </w:r>
           </w:p>
         </w:tc>
@@ -8328,10 +8429,7 @@
               <w:cnfStyle w:val="000000100000" w:firstRow="0" w:lastRow="0" w:firstColumn="0" w:lastColumn="0" w:oddVBand="0" w:evenVBand="0" w:oddHBand="1" w:evenHBand="0" w:firstRowFirstColumn="0" w:firstRowLastColumn="0" w:lastRowFirstColumn="0" w:lastRowLastColumn="0"/>
             </w:pPr>
             <w:r>
-              <w:t>ASV count table with sample as columns and ASV as row</w:t>
-            </w:r>
-            <w:r>
-              <w:t xml:space="preserve">. </w:t>
+              <w:t xml:space="preserve">ASV count table with sample as columns and ASV as row. </w:t>
             </w:r>
             <w:proofErr w:type="spellStart"/>
             <w:r>
@@ -8554,10 +8652,7 @@
             </w:r>
             <w:proofErr w:type="spellEnd"/>
             <w:r>
-              <w:t xml:space="preserve"> file</w:t>
-            </w:r>
-            <w:r>
-              <w:t xml:space="preserve">.  </w:t>
+              <w:t xml:space="preserve"> file.  </w:t>
             </w:r>
             <w:proofErr w:type="spellStart"/>
             <w:r>
@@ -8633,10 +8728,7 @@
           </w:tcPr>
           <w:p>
             <w:r>
-              <w:t>Load the metadata</w:t>
-            </w:r>
-            <w:r>
-              <w:t xml:space="preserve"> table.</w:t>
+              <w:t>Load the metadata table.</w:t>
             </w:r>
           </w:p>
         </w:tc>
@@ -8664,8 +8756,6 @@
             <w:r>
               <w:t>’ package.</w:t>
             </w:r>
-            <w:bookmarkStart w:id="3" w:name="_GoBack"/>
-            <w:bookmarkEnd w:id="3"/>
           </w:p>
         </w:tc>
         <w:tc>
@@ -8704,7 +8794,11 @@
             <w:cnfStyle w:val="001000000000" w:firstRow="0" w:lastRow="0" w:firstColumn="1" w:lastColumn="0" w:oddVBand="0" w:evenVBand="0" w:oddHBand="0" w:evenHBand="0" w:firstRowFirstColumn="0" w:firstRowLastColumn="0" w:lastRowFirstColumn="0" w:lastRowLastColumn="0"/>
             <w:tcW w:w="3767" w:type="dxa"/>
           </w:tcPr>
-          <w:p/>
+          <w:p>
+            <w:r>
+              <w:t>Tell R the first column in our count table is the row names.</w:t>
+            </w:r>
+          </w:p>
         </w:tc>
         <w:tc>
           <w:tcPr>
@@ -8714,6 +8808,9 @@
             <w:pPr>
               <w:cnfStyle w:val="000000000000" w:firstRow="0" w:lastRow="0" w:firstColumn="0" w:lastColumn="0" w:oddVBand="0" w:evenVBand="0" w:oddHBand="0" w:evenHBand="0" w:firstRowFirstColumn="0" w:firstRowLastColumn="0" w:lastRowFirstColumn="0" w:lastRowLastColumn="0"/>
             </w:pPr>
+            <w:r>
+              <w:t>It’ll be easier down the line to tell R what to do if it knows that those are the row names of the table.</w:t>
+            </w:r>
           </w:p>
         </w:tc>
         <w:tc>
@@ -8724,6 +8821,59 @@
             <w:pPr>
               <w:cnfStyle w:val="000000000000" w:firstRow="0" w:lastRow="0" w:firstColumn="0" w:lastColumn="0" w:oddVBand="0" w:evenVBand="0" w:oddHBand="0" w:evenHBand="0" w:firstRowFirstColumn="0" w:firstRowLastColumn="0" w:lastRowFirstColumn="0" w:lastRowLastColumn="0"/>
             </w:pPr>
+            <w:proofErr w:type="spellStart"/>
+            <w:r>
+              <w:t>count_table</w:t>
+            </w:r>
+            <w:proofErr w:type="spellEnd"/>
+            <w:r>
+              <w:t xml:space="preserve"> &lt;- </w:t>
+            </w:r>
+            <w:proofErr w:type="spellStart"/>
+            <w:r>
+              <w:t>column_to_</w:t>
+            </w:r>
+            <w:proofErr w:type="gramStart"/>
+            <w:r>
+              <w:t>rownames</w:t>
+            </w:r>
+            <w:proofErr w:type="spellEnd"/>
+            <w:r>
+              <w:t>(</w:t>
+            </w:r>
+            <w:proofErr w:type="spellStart"/>
+            <w:proofErr w:type="gramEnd"/>
+            <w:r>
+              <w:t>count_table</w:t>
+            </w:r>
+            <w:proofErr w:type="spellEnd"/>
+            <w:r>
+              <w:t xml:space="preserve">, </w:t>
+            </w:r>
+            <w:proofErr w:type="spellStart"/>
+            <w:r>
+              <w:t>var</w:t>
+            </w:r>
+            <w:proofErr w:type="spellEnd"/>
+            <w:r>
+              <w:t xml:space="preserve"> = </w:t>
+            </w:r>
+            <w:proofErr w:type="spellStart"/>
+            <w:r>
+              <w:t>colnames</w:t>
+            </w:r>
+            <w:proofErr w:type="spellEnd"/>
+            <w:r>
+              <w:t>(</w:t>
+            </w:r>
+            <w:proofErr w:type="spellStart"/>
+            <w:r>
+              <w:t>count_table</w:t>
+            </w:r>
+            <w:proofErr w:type="spellEnd"/>
+            <w:r>
+              <w:t>)[1])</w:t>
+            </w:r>
           </w:p>
         </w:tc>
       </w:tr>
@@ -8736,7 +8886,11 @@
             <w:cnfStyle w:val="001000000000" w:firstRow="0" w:lastRow="0" w:firstColumn="1" w:lastColumn="0" w:oddVBand="0" w:evenVBand="0" w:oddHBand="0" w:evenHBand="0" w:firstRowFirstColumn="0" w:firstRowLastColumn="0" w:lastRowFirstColumn="0" w:lastRowLastColumn="0"/>
             <w:tcW w:w="3767" w:type="dxa"/>
           </w:tcPr>
-          <w:p/>
+          <w:p>
+            <w:r>
+              <w:t>Delete unnecessary data from our metadata table.</w:t>
+            </w:r>
+          </w:p>
         </w:tc>
         <w:tc>
           <w:tcPr>
@@ -8746,6 +8900,9 @@
             <w:pPr>
               <w:cnfStyle w:val="000000100000" w:firstRow="0" w:lastRow="0" w:firstColumn="0" w:lastColumn="0" w:oddVBand="0" w:evenVBand="0" w:oddHBand="1" w:evenHBand="0" w:firstRowFirstColumn="0" w:firstRowLastColumn="0" w:lastRowFirstColumn="0" w:lastRowLastColumn="0"/>
             </w:pPr>
+            <w:r>
+              <w:t>It’ll make it easier to work with if we get rid of all the unnecessary stuff (need to move this to metadata wrangle step).</w:t>
+            </w:r>
           </w:p>
         </w:tc>
         <w:tc>
@@ -8756,6 +8913,81 @@
             <w:pPr>
               <w:cnfStyle w:val="000000100000" w:firstRow="0" w:lastRow="0" w:firstColumn="0" w:lastColumn="0" w:oddVBand="0" w:evenVBand="0" w:oddHBand="1" w:evenHBand="0" w:firstRowFirstColumn="0" w:firstRowLastColumn="0" w:lastRowFirstColumn="0" w:lastRowLastColumn="0"/>
             </w:pPr>
+            <w:r>
+              <w:t>metadata &lt;- metadata[-</w:t>
+            </w:r>
+            <w:proofErr w:type="gramStart"/>
+            <w:r>
+              <w:t>c(</w:t>
+            </w:r>
+            <w:proofErr w:type="gramEnd"/>
+            <w:r>
+              <w:t>1),]</w:t>
+            </w:r>
+          </w:p>
+          <w:p>
+            <w:pPr>
+              <w:cnfStyle w:val="000000100000" w:firstRow="0" w:lastRow="0" w:firstColumn="0" w:lastColumn="0" w:oddVBand="0" w:evenVBand="0" w:oddHBand="1" w:evenHBand="0" w:firstRowFirstColumn="0" w:firstRowLastColumn="0" w:lastRowFirstColumn="0" w:lastRowLastColumn="0"/>
+            </w:pPr>
+            <w:r>
+              <w:t>metadata &lt;- metadata</w:t>
+            </w:r>
+            <w:proofErr w:type="gramStart"/>
+            <w:r>
+              <w:t>[,-</w:t>
+            </w:r>
+            <w:proofErr w:type="gramEnd"/>
+            <w:r>
+              <w:t>c(1)]</w:t>
+            </w:r>
+          </w:p>
+          <w:p>
+            <w:pPr>
+              <w:cnfStyle w:val="000000100000" w:firstRow="0" w:lastRow="0" w:firstColumn="0" w:lastColumn="0" w:oddVBand="0" w:evenVBand="0" w:oddHBand="1" w:evenHBand="0" w:firstRowFirstColumn="0" w:firstRowLastColumn="0" w:lastRowFirstColumn="0" w:lastRowLastColumn="0"/>
+            </w:pPr>
+            <w:r>
+              <w:t xml:space="preserve">metadata &lt;- </w:t>
+            </w:r>
+            <w:proofErr w:type="gramStart"/>
+            <w:r>
+              <w:t>metadata[</w:t>
+            </w:r>
+            <w:proofErr w:type="gramEnd"/>
+            <w:r>
+              <w:t>!</w:t>
+            </w:r>
+            <w:proofErr w:type="spellStart"/>
+            <w:r>
+              <w:t>grepl</w:t>
+            </w:r>
+            <w:proofErr w:type="spellEnd"/>
+            <w:r>
+              <w:t xml:space="preserve">("18S", </w:t>
+            </w:r>
+            <w:proofErr w:type="spellStart"/>
+            <w:r>
+              <w:t>metadata$Library.Name</w:t>
+            </w:r>
+            <w:proofErr w:type="spellEnd"/>
+            <w:r>
+              <w:t>),] #only include 16S samples</w:t>
+            </w:r>
+          </w:p>
+          <w:p>
+            <w:pPr>
+              <w:cnfStyle w:val="000000100000" w:firstRow="0" w:lastRow="0" w:firstColumn="0" w:lastColumn="0" w:oddVBand="0" w:evenVBand="0" w:oddHBand="1" w:evenHBand="0" w:firstRowFirstColumn="0" w:firstRowLastColumn="0" w:lastRowFirstColumn="0" w:lastRowLastColumn="0"/>
+            </w:pPr>
+            <w:r>
+              <w:t>metadata &lt;- metadata[-</w:t>
+            </w:r>
+            <w:proofErr w:type="gramStart"/>
+            <w:r>
+              <w:t>c(</w:t>
+            </w:r>
+            <w:proofErr w:type="gramEnd"/>
+            <w:r>
+              <w:t>42:80),] #remove reverse reads so we only have one entry per sample</w:t>
+            </w:r>
           </w:p>
         </w:tc>
       </w:tr>
@@ -8765,7 +8997,11 @@
             <w:cnfStyle w:val="001000000000" w:firstRow="0" w:lastRow="0" w:firstColumn="1" w:lastColumn="0" w:oddVBand="0" w:evenVBand="0" w:oddHBand="0" w:evenHBand="0" w:firstRowFirstColumn="0" w:firstRowLastColumn="0" w:lastRowFirstColumn="0" w:lastRowLastColumn="0"/>
             <w:tcW w:w="3767" w:type="dxa"/>
           </w:tcPr>
-          <w:p/>
+          <w:p>
+            <w:r>
+              <w:t>Rename columns in our metadata table.</w:t>
+            </w:r>
+          </w:p>
         </w:tc>
         <w:tc>
           <w:tcPr>
@@ -8775,6 +9011,9 @@
             <w:pPr>
               <w:cnfStyle w:val="000000000000" w:firstRow="0" w:lastRow="0" w:firstColumn="0" w:lastColumn="0" w:oddVBand="0" w:evenVBand="0" w:oddHBand="0" w:evenHBand="0" w:firstRowFirstColumn="0" w:firstRowLastColumn="0" w:lastRowFirstColumn="0" w:lastRowLastColumn="0"/>
             </w:pPr>
+            <w:r>
+              <w:t>Some of the columns in our metadata table don’t have useful names so we’ll rename them so we know what they’re referring to (need to move this to metadata wrangle step).</w:t>
+            </w:r>
           </w:p>
         </w:tc>
         <w:tc>
@@ -8785,6 +9024,135 @@
             <w:pPr>
               <w:cnfStyle w:val="000000000000" w:firstRow="0" w:lastRow="0" w:firstColumn="0" w:lastColumn="0" w:oddVBand="0" w:evenVBand="0" w:oddHBand="0" w:evenHBand="0" w:firstRowFirstColumn="0" w:firstRowLastColumn="0" w:lastRowFirstColumn="0" w:lastRowLastColumn="0"/>
             </w:pPr>
+            <w:proofErr w:type="spellStart"/>
+            <w:r>
+              <w:t>colnames</w:t>
+            </w:r>
+            <w:proofErr w:type="spellEnd"/>
+            <w:r>
+              <w:t>(metadata</w:t>
+            </w:r>
+            <w:proofErr w:type="gramStart"/>
+            <w:r>
+              <w:t>)[</w:t>
+            </w:r>
+            <w:proofErr w:type="gramEnd"/>
+            <w:r>
+              <w:t>10] &lt;- "Chlorophyll"</w:t>
+            </w:r>
+          </w:p>
+          <w:p>
+            <w:pPr>
+              <w:cnfStyle w:val="000000000000" w:firstRow="0" w:lastRow="0" w:firstColumn="0" w:lastColumn="0" w:oddVBand="0" w:evenVBand="0" w:oddHBand="0" w:evenHBand="0" w:firstRowFirstColumn="0" w:firstRowLastColumn="0" w:lastRowFirstColumn="0" w:lastRowLastColumn="0"/>
+            </w:pPr>
+            <w:proofErr w:type="spellStart"/>
+            <w:r>
+              <w:t>colnames</w:t>
+            </w:r>
+            <w:proofErr w:type="spellEnd"/>
+            <w:r>
+              <w:t>(metadata</w:t>
+            </w:r>
+            <w:proofErr w:type="gramStart"/>
+            <w:r>
+              <w:t>)[</w:t>
+            </w:r>
+            <w:proofErr w:type="gramEnd"/>
+            <w:r>
+              <w:t>11] &lt;- "</w:t>
+            </w:r>
+            <w:proofErr w:type="spellStart"/>
+            <w:r>
+              <w:t>Collection_date</w:t>
+            </w:r>
+            <w:proofErr w:type="spellEnd"/>
+            <w:r>
+              <w:t>"</w:t>
+            </w:r>
+          </w:p>
+          <w:p>
+            <w:pPr>
+              <w:cnfStyle w:val="000000000000" w:firstRow="0" w:lastRow="0" w:firstColumn="0" w:lastColumn="0" w:oddVBand="0" w:evenVBand="0" w:oddHBand="0" w:evenHBand="0" w:firstRowFirstColumn="0" w:firstRowLastColumn="0" w:lastRowFirstColumn="0" w:lastRowLastColumn="0"/>
+            </w:pPr>
+            <w:proofErr w:type="spellStart"/>
+            <w:r>
+              <w:t>colnames</w:t>
+            </w:r>
+            <w:proofErr w:type="spellEnd"/>
+            <w:r>
+              <w:t>(metadata</w:t>
+            </w:r>
+            <w:proofErr w:type="gramStart"/>
+            <w:r>
+              <w:t>)[</w:t>
+            </w:r>
+            <w:proofErr w:type="gramEnd"/>
+            <w:r>
+              <w:t>16] &lt;- "Depth"</w:t>
+            </w:r>
+          </w:p>
+          <w:p>
+            <w:pPr>
+              <w:cnfStyle w:val="000000000000" w:firstRow="0" w:lastRow="0" w:firstColumn="0" w:lastColumn="0" w:oddVBand="0" w:evenVBand="0" w:oddHBand="0" w:evenHBand="0" w:firstRowFirstColumn="0" w:firstRowLastColumn="0" w:lastRowFirstColumn="0" w:lastRowLastColumn="0"/>
+            </w:pPr>
+            <w:proofErr w:type="spellStart"/>
+            <w:r>
+              <w:t>colnames</w:t>
+            </w:r>
+            <w:proofErr w:type="spellEnd"/>
+            <w:r>
+              <w:t>(metadata</w:t>
+            </w:r>
+            <w:proofErr w:type="gramStart"/>
+            <w:r>
+              <w:t>)[</w:t>
+            </w:r>
+            <w:proofErr w:type="gramEnd"/>
+            <w:r>
+              <w:t>36] &lt;- "pH"</w:t>
+            </w:r>
+          </w:p>
+          <w:p>
+            <w:pPr>
+              <w:cnfStyle w:val="000000000000" w:firstRow="0" w:lastRow="0" w:firstColumn="0" w:lastColumn="0" w:oddVBand="0" w:evenVBand="0" w:oddHBand="0" w:evenHBand="0" w:firstRowFirstColumn="0" w:firstRowLastColumn="0" w:lastRowFirstColumn="0" w:lastRowLastColumn="0"/>
+            </w:pPr>
+            <w:proofErr w:type="spellStart"/>
+            <w:r>
+              <w:t>colnames</w:t>
+            </w:r>
+            <w:proofErr w:type="spellEnd"/>
+            <w:r>
+              <w:t>(metadata</w:t>
+            </w:r>
+            <w:proofErr w:type="gramStart"/>
+            <w:r>
+              <w:t>)[</w:t>
+            </w:r>
+            <w:proofErr w:type="gramEnd"/>
+            <w:r>
+              <w:t>39] &lt;- "Replicate"</w:t>
+            </w:r>
+          </w:p>
+          <w:p>
+            <w:pPr>
+              <w:cnfStyle w:val="000000000000" w:firstRow="0" w:lastRow="0" w:firstColumn="0" w:lastColumn="0" w:oddVBand="0" w:evenVBand="0" w:oddHBand="0" w:evenHBand="0" w:firstRowFirstColumn="0" w:firstRowLastColumn="0" w:lastRowFirstColumn="0" w:lastRowLastColumn="0"/>
+            </w:pPr>
+            <w:proofErr w:type="spellStart"/>
+            <w:r>
+              <w:t>colnames</w:t>
+            </w:r>
+            <w:proofErr w:type="spellEnd"/>
+            <w:r>
+              <w:t>(metadata</w:t>
+            </w:r>
+            <w:proofErr w:type="gramStart"/>
+            <w:r>
+              <w:t>)[</w:t>
+            </w:r>
+            <w:proofErr w:type="gramEnd"/>
+            <w:r>
+              <w:t>47] &lt;- "Temp"</w:t>
+            </w:r>
           </w:p>
         </w:tc>
       </w:tr>
@@ -8797,6 +9165,3002 @@
             <w:cnfStyle w:val="001000000000" w:firstRow="0" w:lastRow="0" w:firstColumn="1" w:lastColumn="0" w:oddVBand="0" w:evenVBand="0" w:oddHBand="0" w:evenHBand="0" w:firstRowFirstColumn="0" w:firstRowLastColumn="0" w:lastRowFirstColumn="0" w:lastRowLastColumn="0"/>
             <w:tcW w:w="3767" w:type="dxa"/>
           </w:tcPr>
+          <w:p>
+            <w:r>
+              <w:t>Remove text from numeric columns in metadata table.</w:t>
+            </w:r>
+          </w:p>
+        </w:tc>
+        <w:tc>
+          <w:tcPr>
+            <w:tcW w:w="6681" w:type="dxa"/>
+          </w:tcPr>
+          <w:p>
+            <w:pPr>
+              <w:cnfStyle w:val="000000100000" w:firstRow="0" w:lastRow="0" w:firstColumn="0" w:lastColumn="0" w:oddVBand="0" w:evenVBand="0" w:oddHBand="1" w:evenHBand="0" w:firstRowFirstColumn="0" w:firstRowLastColumn="0" w:lastRowFirstColumn="0" w:lastRowLastColumn="0"/>
+            </w:pPr>
+            <w:r>
+              <w:t>Removing text (e.g. metric units like g) from numeric columns will make them easier to use for downstream analysis (need to move this to metadata wrangle step).</w:t>
+            </w:r>
+          </w:p>
+        </w:tc>
+        <w:tc>
+          <w:tcPr>
+            <w:tcW w:w="4950" w:type="dxa"/>
+          </w:tcPr>
+          <w:p>
+            <w:pPr>
+              <w:cnfStyle w:val="000000100000" w:firstRow="0" w:lastRow="0" w:firstColumn="0" w:lastColumn="0" w:oddVBand="0" w:evenVBand="0" w:oddHBand="1" w:evenHBand="0" w:firstRowFirstColumn="0" w:firstRowLastColumn="0" w:lastRowFirstColumn="0" w:lastRowLastColumn="0"/>
+            </w:pPr>
+            <w:proofErr w:type="spellStart"/>
+            <w:r>
+              <w:t>metadata$Chlorophyll</w:t>
+            </w:r>
+            <w:proofErr w:type="spellEnd"/>
+            <w:r>
+              <w:t xml:space="preserve"> &lt;- </w:t>
+            </w:r>
+            <w:proofErr w:type="spellStart"/>
+            <w:r>
+              <w:t>parse_number</w:t>
+            </w:r>
+            <w:proofErr w:type="spellEnd"/>
+            <w:r>
+              <w:t>(</w:t>
+            </w:r>
+            <w:proofErr w:type="spellStart"/>
+            <w:r>
+              <w:t>metadata$Chlorophyll</w:t>
+            </w:r>
+            <w:proofErr w:type="spellEnd"/>
+            <w:r>
+              <w:t>)</w:t>
+            </w:r>
+          </w:p>
+          <w:p>
+            <w:pPr>
+              <w:cnfStyle w:val="000000100000" w:firstRow="0" w:lastRow="0" w:firstColumn="0" w:lastColumn="0" w:oddVBand="0" w:evenVBand="0" w:oddHBand="1" w:evenHBand="0" w:firstRowFirstColumn="0" w:firstRowLastColumn="0" w:lastRowFirstColumn="0" w:lastRowLastColumn="0"/>
+            </w:pPr>
+            <w:proofErr w:type="spellStart"/>
+            <w:r>
+              <w:t>metadata$org_matter</w:t>
+            </w:r>
+            <w:proofErr w:type="spellEnd"/>
+            <w:r>
+              <w:t xml:space="preserve"> &lt;- </w:t>
+            </w:r>
+            <w:proofErr w:type="spellStart"/>
+            <w:r>
+              <w:t>parse_number</w:t>
+            </w:r>
+            <w:proofErr w:type="spellEnd"/>
+            <w:r>
+              <w:t>(</w:t>
+            </w:r>
+            <w:proofErr w:type="spellStart"/>
+            <w:r>
+              <w:t>metadata$org_matter</w:t>
+            </w:r>
+            <w:proofErr w:type="spellEnd"/>
+            <w:r>
+              <w:t>)</w:t>
+            </w:r>
+          </w:p>
+          <w:p>
+            <w:pPr>
+              <w:cnfStyle w:val="000000100000" w:firstRow="0" w:lastRow="0" w:firstColumn="0" w:lastColumn="0" w:oddVBand="0" w:evenVBand="0" w:oddHBand="1" w:evenHBand="0" w:firstRowFirstColumn="0" w:firstRowLastColumn="0" w:lastRowFirstColumn="0" w:lastRowLastColumn="0"/>
+            </w:pPr>
+            <w:proofErr w:type="spellStart"/>
+            <w:r>
+              <w:t>metadata$water_content</w:t>
+            </w:r>
+            <w:proofErr w:type="spellEnd"/>
+            <w:r>
+              <w:t xml:space="preserve"> &lt;- </w:t>
+            </w:r>
+            <w:proofErr w:type="spellStart"/>
+            <w:r>
+              <w:t>parse_number</w:t>
+            </w:r>
+            <w:proofErr w:type="spellEnd"/>
+            <w:r>
+              <w:t>(</w:t>
+            </w:r>
+            <w:proofErr w:type="spellStart"/>
+            <w:r>
+              <w:t>metadata$water_content</w:t>
+            </w:r>
+            <w:proofErr w:type="spellEnd"/>
+            <w:r>
+              <w:t>)</w:t>
+            </w:r>
+          </w:p>
+        </w:tc>
+      </w:tr>
+      <w:tr>
+        <w:tc>
+          <w:tcPr>
+            <w:cnfStyle w:val="001000000000" w:firstRow="0" w:lastRow="0" w:firstColumn="1" w:lastColumn="0" w:oddVBand="0" w:evenVBand="0" w:oddHBand="0" w:evenHBand="0" w:firstRowFirstColumn="0" w:firstRowLastColumn="0" w:lastRowFirstColumn="0" w:lastRowLastColumn="0"/>
+            <w:tcW w:w="3767" w:type="dxa"/>
+          </w:tcPr>
+          <w:p>
+            <w:r>
+              <w:t>Add column with glacier name to metadata table.</w:t>
+            </w:r>
+          </w:p>
+        </w:tc>
+        <w:tc>
+          <w:tcPr>
+            <w:tcW w:w="6681" w:type="dxa"/>
+          </w:tcPr>
+          <w:p>
+            <w:pPr>
+              <w:cnfStyle w:val="000000000000" w:firstRow="0" w:lastRow="0" w:firstColumn="0" w:lastColumn="0" w:oddVBand="0" w:evenVBand="0" w:oddHBand="0" w:evenHBand="0" w:firstRowFirstColumn="0" w:firstRowLastColumn="0" w:lastRowFirstColumn="0" w:lastRowLastColumn="0"/>
+            </w:pPr>
+            <w:r>
+              <w:t xml:space="preserve">By adding a glacier </w:t>
+            </w:r>
+            <w:proofErr w:type="gramStart"/>
+            <w:r>
+              <w:t>name</w:t>
+            </w:r>
+            <w:proofErr w:type="gramEnd"/>
+            <w:r>
+              <w:t xml:space="preserve"> we can group the data by glacier and see if there is a significant difference between the two locations (need to move this to metadata wrangle step).</w:t>
+            </w:r>
+          </w:p>
+        </w:tc>
+        <w:tc>
+          <w:tcPr>
+            <w:tcW w:w="4950" w:type="dxa"/>
+          </w:tcPr>
+          <w:p>
+            <w:pPr>
+              <w:cnfStyle w:val="000000000000" w:firstRow="0" w:lastRow="0" w:firstColumn="0" w:lastColumn="0" w:oddVBand="0" w:evenVBand="0" w:oddHBand="0" w:evenHBand="0" w:firstRowFirstColumn="0" w:firstRowLastColumn="0" w:lastRowFirstColumn="0" w:lastRowLastColumn="0"/>
+            </w:pPr>
+            <w:r>
+              <w:t>Glacier &lt;- NULL</w:t>
+            </w:r>
+          </w:p>
+          <w:p>
+            <w:pPr>
+              <w:cnfStyle w:val="000000000000" w:firstRow="0" w:lastRow="0" w:firstColumn="0" w:lastColumn="0" w:oddVBand="0" w:evenVBand="0" w:oddHBand="0" w:evenHBand="0" w:firstRowFirstColumn="0" w:firstRowLastColumn="0" w:lastRowFirstColumn="0" w:lastRowLastColumn="0"/>
+            </w:pPr>
+            <w:r>
+              <w:t>for (</w:t>
+            </w:r>
+            <w:proofErr w:type="spellStart"/>
+            <w:r>
+              <w:t>i</w:t>
+            </w:r>
+            <w:proofErr w:type="spellEnd"/>
+            <w:r>
+              <w:t xml:space="preserve"> in </w:t>
+            </w:r>
+            <w:proofErr w:type="gramStart"/>
+            <w:r>
+              <w:t>1:nrow</w:t>
+            </w:r>
+            <w:proofErr w:type="gramEnd"/>
+            <w:r>
+              <w:t>(metadata)){</w:t>
+            </w:r>
+          </w:p>
+          <w:p>
+            <w:pPr>
+              <w:cnfStyle w:val="000000000000" w:firstRow="0" w:lastRow="0" w:firstColumn="0" w:lastColumn="0" w:oddVBand="0" w:evenVBand="0" w:oddHBand="0" w:evenHBand="0" w:firstRowFirstColumn="0" w:firstRowLastColumn="0" w:lastRowFirstColumn="0" w:lastRowLastColumn="0"/>
+            </w:pPr>
+            <w:r>
+              <w:t xml:space="preserve">  if (</w:t>
+            </w:r>
+            <w:proofErr w:type="spellStart"/>
+            <w:proofErr w:type="gramStart"/>
+            <w:r>
+              <w:t>startsWith</w:t>
+            </w:r>
+            <w:proofErr w:type="spellEnd"/>
+            <w:r>
+              <w:t>(</w:t>
+            </w:r>
+            <w:proofErr w:type="spellStart"/>
+            <w:proofErr w:type="gramEnd"/>
+            <w:r>
+              <w:t>metadata$Sample.Name</w:t>
+            </w:r>
+            <w:proofErr w:type="spellEnd"/>
+            <w:r>
+              <w:t>[[</w:t>
+            </w:r>
+            <w:proofErr w:type="spellStart"/>
+            <w:r>
+              <w:t>i</w:t>
+            </w:r>
+            <w:proofErr w:type="spellEnd"/>
+            <w:r>
+              <w:t>]], "C")){</w:t>
+            </w:r>
+          </w:p>
+          <w:p>
+            <w:pPr>
+              <w:cnfStyle w:val="000000000000" w:firstRow="0" w:lastRow="0" w:firstColumn="0" w:lastColumn="0" w:oddVBand="0" w:evenVBand="0" w:oddHBand="0" w:evenHBand="0" w:firstRowFirstColumn="0" w:firstRowLastColumn="0" w:lastRowFirstColumn="0" w:lastRowLastColumn="0"/>
+            </w:pPr>
+            <w:r>
+              <w:t xml:space="preserve">    Glacier &lt;- </w:t>
+            </w:r>
+            <w:proofErr w:type="gramStart"/>
+            <w:r>
+              <w:t>c(</w:t>
+            </w:r>
+            <w:proofErr w:type="gramEnd"/>
+            <w:r>
+              <w:t>Glacier, "Canada")</w:t>
+            </w:r>
+          </w:p>
+          <w:p>
+            <w:pPr>
+              <w:cnfStyle w:val="000000000000" w:firstRow="0" w:lastRow="0" w:firstColumn="0" w:lastColumn="0" w:oddVBand="0" w:evenVBand="0" w:oddHBand="0" w:evenHBand="0" w:firstRowFirstColumn="0" w:firstRowLastColumn="0" w:lastRowFirstColumn="0" w:lastRowLastColumn="0"/>
+            </w:pPr>
+            <w:r>
+              <w:t xml:space="preserve">  } else {</w:t>
+            </w:r>
+          </w:p>
+          <w:p>
+            <w:pPr>
+              <w:cnfStyle w:val="000000000000" w:firstRow="0" w:lastRow="0" w:firstColumn="0" w:lastColumn="0" w:oddVBand="0" w:evenVBand="0" w:oddHBand="0" w:evenHBand="0" w:firstRowFirstColumn="0" w:firstRowLastColumn="0" w:lastRowFirstColumn="0" w:lastRowLastColumn="0"/>
+            </w:pPr>
+            <w:r>
+              <w:t xml:space="preserve">    Glacier &lt;- </w:t>
+            </w:r>
+            <w:proofErr w:type="gramStart"/>
+            <w:r>
+              <w:t>c(</w:t>
+            </w:r>
+            <w:proofErr w:type="gramEnd"/>
+            <w:r>
+              <w:t>Glacier, "Taylor")</w:t>
+            </w:r>
+          </w:p>
+          <w:p>
+            <w:pPr>
+              <w:cnfStyle w:val="000000000000" w:firstRow="0" w:lastRow="0" w:firstColumn="0" w:lastColumn="0" w:oddVBand="0" w:evenVBand="0" w:oddHBand="0" w:evenHBand="0" w:firstRowFirstColumn="0" w:firstRowLastColumn="0" w:lastRowFirstColumn="0" w:lastRowLastColumn="0"/>
+            </w:pPr>
+            <w:r>
+              <w:lastRenderedPageBreak/>
+              <w:t xml:space="preserve">  }</w:t>
+            </w:r>
+          </w:p>
+          <w:p>
+            <w:pPr>
+              <w:cnfStyle w:val="000000000000" w:firstRow="0" w:lastRow="0" w:firstColumn="0" w:lastColumn="0" w:oddVBand="0" w:evenVBand="0" w:oddHBand="0" w:evenHBand="0" w:firstRowFirstColumn="0" w:firstRowLastColumn="0" w:lastRowFirstColumn="0" w:lastRowLastColumn="0"/>
+            </w:pPr>
+            <w:r>
+              <w:t>}</w:t>
+            </w:r>
+          </w:p>
+          <w:p>
+            <w:pPr>
+              <w:cnfStyle w:val="000000000000" w:firstRow="0" w:lastRow="0" w:firstColumn="0" w:lastColumn="0" w:oddVBand="0" w:evenVBand="0" w:oddHBand="0" w:evenHBand="0" w:firstRowFirstColumn="0" w:firstRowLastColumn="0" w:lastRowFirstColumn="0" w:lastRowLastColumn="0"/>
+            </w:pPr>
+          </w:p>
+          <w:p>
+            <w:pPr>
+              <w:cnfStyle w:val="000000000000" w:firstRow="0" w:lastRow="0" w:firstColumn="0" w:lastColumn="0" w:oddVBand="0" w:evenVBand="0" w:oddHBand="0" w:evenHBand="0" w:firstRowFirstColumn="0" w:firstRowLastColumn="0" w:lastRowFirstColumn="0" w:lastRowLastColumn="0"/>
+            </w:pPr>
+            <w:r>
+              <w:t xml:space="preserve">metadata &lt;- </w:t>
+            </w:r>
+            <w:proofErr w:type="spellStart"/>
+            <w:proofErr w:type="gramStart"/>
+            <w:r>
+              <w:t>cbind</w:t>
+            </w:r>
+            <w:proofErr w:type="spellEnd"/>
+            <w:r>
+              <w:t>(</w:t>
+            </w:r>
+            <w:proofErr w:type="gramEnd"/>
+            <w:r>
+              <w:t>metadata, Glacier)</w:t>
+            </w:r>
+          </w:p>
+        </w:tc>
+      </w:tr>
+      <w:tr>
+        <w:trPr>
+          <w:cnfStyle w:val="000000100000" w:firstRow="0" w:lastRow="0" w:firstColumn="0" w:lastColumn="0" w:oddVBand="0" w:evenVBand="0" w:oddHBand="1" w:evenHBand="0" w:firstRowFirstColumn="0" w:firstRowLastColumn="0" w:lastRowFirstColumn="0" w:lastRowLastColumn="0"/>
+        </w:trPr>
+        <w:tc>
+          <w:tcPr>
+            <w:cnfStyle w:val="001000000000" w:firstRow="0" w:lastRow="0" w:firstColumn="1" w:lastColumn="0" w:oddVBand="0" w:evenVBand="0" w:oddHBand="0" w:evenHBand="0" w:firstRowFirstColumn="0" w:firstRowLastColumn="0" w:lastRowFirstColumn="0" w:lastRowLastColumn="0"/>
+            <w:tcW w:w="3767" w:type="dxa"/>
+          </w:tcPr>
+          <w:p>
+            <w:r>
+              <w:lastRenderedPageBreak/>
+              <w:t>Create a logical vector showing which entries are ‘TRUE’ for blanks and FALSE for genuine samples.</w:t>
+            </w:r>
+          </w:p>
+        </w:tc>
+        <w:tc>
+          <w:tcPr>
+            <w:tcW w:w="6681" w:type="dxa"/>
+          </w:tcPr>
+          <w:p>
+            <w:pPr>
+              <w:cnfStyle w:val="000000100000" w:firstRow="0" w:lastRow="0" w:firstColumn="0" w:lastColumn="0" w:oddVBand="0" w:evenVBand="0" w:oddHBand="1" w:evenHBand="0" w:firstRowFirstColumn="0" w:firstRowLastColumn="0" w:lastRowFirstColumn="0" w:lastRowLastColumn="0"/>
+            </w:pPr>
+            <w:r>
+              <w:t>We want to identify the ASVs in the procedural blanks so we can remove these from the genuine samples. The metadata table tells us which samples are blanks/controls so we can use this to create our logical vector.</w:t>
+            </w:r>
+          </w:p>
+        </w:tc>
+        <w:tc>
+          <w:tcPr>
+            <w:tcW w:w="4950" w:type="dxa"/>
+          </w:tcPr>
+          <w:p>
+            <w:pPr>
+              <w:cnfStyle w:val="000000100000" w:firstRow="0" w:lastRow="0" w:firstColumn="0" w:lastColumn="0" w:oddVBand="0" w:evenVBand="0" w:oddHBand="1" w:evenHBand="0" w:firstRowFirstColumn="0" w:firstRowLastColumn="0" w:lastRowFirstColumn="0" w:lastRowLastColumn="0"/>
+            </w:pPr>
+            <w:proofErr w:type="spellStart"/>
+            <w:r>
+              <w:t>decontam</w:t>
+            </w:r>
+            <w:proofErr w:type="spellEnd"/>
+            <w:r>
+              <w:t xml:space="preserve"> &lt;- </w:t>
+            </w:r>
+            <w:proofErr w:type="spellStart"/>
+            <w:proofErr w:type="gramStart"/>
+            <w:r>
+              <w:t>startsWith</w:t>
+            </w:r>
+            <w:proofErr w:type="spellEnd"/>
+            <w:r>
+              <w:t>(</w:t>
+            </w:r>
+            <w:proofErr w:type="spellStart"/>
+            <w:proofErr w:type="gramEnd"/>
+            <w:r>
+              <w:t>metadata$Sample.Name</w:t>
+            </w:r>
+            <w:proofErr w:type="spellEnd"/>
+            <w:r>
+              <w:t>, "NT")</w:t>
+            </w:r>
+          </w:p>
+        </w:tc>
+      </w:tr>
+      <w:tr>
+        <w:tc>
+          <w:tcPr>
+            <w:cnfStyle w:val="001000000000" w:firstRow="0" w:lastRow="0" w:firstColumn="1" w:lastColumn="0" w:oddVBand="0" w:evenVBand="0" w:oddHBand="0" w:evenHBand="0" w:firstRowFirstColumn="0" w:firstRowLastColumn="0" w:lastRowFirstColumn="0" w:lastRowLastColumn="0"/>
+            <w:tcW w:w="3767" w:type="dxa"/>
+          </w:tcPr>
+          <w:p>
+            <w:r>
+              <w:t xml:space="preserve">Convert the table into a </w:t>
+            </w:r>
+            <w:proofErr w:type="spellStart"/>
+            <w:r>
+              <w:t>dataframe</w:t>
+            </w:r>
+            <w:proofErr w:type="spellEnd"/>
+            <w:r>
+              <w:t>.</w:t>
+            </w:r>
+          </w:p>
+        </w:tc>
+        <w:tc>
+          <w:tcPr>
+            <w:tcW w:w="6681" w:type="dxa"/>
+          </w:tcPr>
+          <w:p>
+            <w:pPr>
+              <w:cnfStyle w:val="000000000000" w:firstRow="0" w:lastRow="0" w:firstColumn="0" w:lastColumn="0" w:oddVBand="0" w:evenVBand="0" w:oddHBand="0" w:evenHBand="0" w:firstRowFirstColumn="0" w:firstRowLastColumn="0" w:lastRowFirstColumn="0" w:lastRowLastColumn="0"/>
+            </w:pPr>
+            <w:r>
+              <w:t xml:space="preserve">We need to table to be a </w:t>
+            </w:r>
+            <w:proofErr w:type="spellStart"/>
+            <w:r>
+              <w:t>dataframe</w:t>
+            </w:r>
+            <w:proofErr w:type="spellEnd"/>
+            <w:r>
+              <w:t xml:space="preserve"> in order to use the ‘</w:t>
+            </w:r>
+            <w:proofErr w:type="spellStart"/>
+            <w:r>
+              <w:t>isContaminent</w:t>
+            </w:r>
+            <w:proofErr w:type="spellEnd"/>
+            <w:r>
+              <w:t>’ function next.</w:t>
+            </w:r>
+          </w:p>
+        </w:tc>
+        <w:tc>
+          <w:tcPr>
+            <w:tcW w:w="4950" w:type="dxa"/>
+          </w:tcPr>
+          <w:p>
+            <w:pPr>
+              <w:cnfStyle w:val="000000000000" w:firstRow="0" w:lastRow="0" w:firstColumn="0" w:lastColumn="0" w:oddVBand="0" w:evenVBand="0" w:oddHBand="0" w:evenHBand="0" w:firstRowFirstColumn="0" w:firstRowLastColumn="0" w:lastRowFirstColumn="0" w:lastRowLastColumn="0"/>
+            </w:pPr>
+            <w:proofErr w:type="spellStart"/>
+            <w:r>
+              <w:t>count_table_df</w:t>
+            </w:r>
+            <w:proofErr w:type="spellEnd"/>
+            <w:r>
+              <w:t xml:space="preserve"> &lt;- </w:t>
+            </w:r>
+            <w:proofErr w:type="spellStart"/>
+            <w:r>
+              <w:t>as.</w:t>
+            </w:r>
+            <w:proofErr w:type="gramStart"/>
+            <w:r>
+              <w:t>data.frame</w:t>
+            </w:r>
+            <w:proofErr w:type="spellEnd"/>
+            <w:proofErr w:type="gramEnd"/>
+            <w:r>
+              <w:t>(</w:t>
+            </w:r>
+            <w:proofErr w:type="spellStart"/>
+            <w:r>
+              <w:t>count_table</w:t>
+            </w:r>
+            <w:proofErr w:type="spellEnd"/>
+            <w:r>
+              <w:t>)</w:t>
+            </w:r>
+          </w:p>
+        </w:tc>
+      </w:tr>
+      <w:tr>
+        <w:trPr>
+          <w:cnfStyle w:val="000000100000" w:firstRow="0" w:lastRow="0" w:firstColumn="0" w:lastColumn="0" w:oddVBand="0" w:evenVBand="0" w:oddHBand="1" w:evenHBand="0" w:firstRowFirstColumn="0" w:firstRowLastColumn="0" w:lastRowFirstColumn="0" w:lastRowLastColumn="0"/>
+        </w:trPr>
+        <w:tc>
+          <w:tcPr>
+            <w:cnfStyle w:val="001000000000" w:firstRow="0" w:lastRow="0" w:firstColumn="1" w:lastColumn="0" w:oddVBand="0" w:evenVBand="0" w:oddHBand="0" w:evenHBand="0" w:firstRowFirstColumn="0" w:firstRowLastColumn="0" w:lastRowFirstColumn="0" w:lastRowLastColumn="0"/>
+            <w:tcW w:w="3767" w:type="dxa"/>
+          </w:tcPr>
+          <w:p>
+            <w:r>
+              <w:t xml:space="preserve">Run </w:t>
+            </w:r>
+            <w:proofErr w:type="spellStart"/>
+            <w:r>
+              <w:t>isContaminant</w:t>
+            </w:r>
+            <w:proofErr w:type="spellEnd"/>
+            <w:r>
+              <w:t>, while transforming the matrix</w:t>
+            </w:r>
+          </w:p>
+        </w:tc>
+        <w:tc>
+          <w:tcPr>
+            <w:tcW w:w="6681" w:type="dxa"/>
+          </w:tcPr>
+          <w:p>
+            <w:pPr>
+              <w:cnfStyle w:val="000000100000" w:firstRow="0" w:lastRow="0" w:firstColumn="0" w:lastColumn="0" w:oddVBand="0" w:evenVBand="0" w:oddHBand="1" w:evenHBand="0" w:firstRowFirstColumn="0" w:firstRowLastColumn="0" w:lastRowFirstColumn="0" w:lastRowLastColumn="0"/>
+            </w:pPr>
+            <w:proofErr w:type="spellStart"/>
+            <w:r>
+              <w:t>isContaminent</w:t>
+            </w:r>
+            <w:proofErr w:type="spellEnd"/>
+            <w:r>
+              <w:t xml:space="preserve"> expects the data to be the other way </w:t>
+            </w:r>
+            <w:proofErr w:type="gramStart"/>
+            <w:r>
+              <w:t>round</w:t>
+            </w:r>
+            <w:proofErr w:type="gramEnd"/>
+            <w:r>
+              <w:t xml:space="preserve"> (i.e. samples as rows and ASVs as columns)</w:t>
+            </w:r>
+            <w:r>
+              <w:t xml:space="preserve"> </w:t>
+            </w:r>
+            <w:proofErr w:type="spellStart"/>
+            <w:r>
+              <w:t>Decontam</w:t>
+            </w:r>
+            <w:proofErr w:type="spellEnd"/>
+            <w:r>
+              <w:t xml:space="preserve"> package is used here.</w:t>
+            </w:r>
+          </w:p>
+        </w:tc>
+        <w:tc>
+          <w:tcPr>
+            <w:tcW w:w="4950" w:type="dxa"/>
+          </w:tcPr>
+          <w:p>
+            <w:pPr>
+              <w:cnfStyle w:val="000000100000" w:firstRow="0" w:lastRow="0" w:firstColumn="0" w:lastColumn="0" w:oddVBand="0" w:evenVBand="0" w:oddHBand="1" w:evenHBand="0" w:firstRowFirstColumn="0" w:firstRowLastColumn="0" w:lastRowFirstColumn="0" w:lastRowLastColumn="0"/>
+            </w:pPr>
+            <w:proofErr w:type="spellStart"/>
+            <w:r>
+              <w:t>contam_df</w:t>
+            </w:r>
+            <w:proofErr w:type="spellEnd"/>
+            <w:r>
+              <w:t xml:space="preserve"> &lt;- </w:t>
+            </w:r>
+            <w:proofErr w:type="spellStart"/>
+            <w:r>
+              <w:t>isContaminant</w:t>
+            </w:r>
+            <w:proofErr w:type="spellEnd"/>
+            <w:r>
+              <w:t>(t(</w:t>
+            </w:r>
+            <w:proofErr w:type="spellStart"/>
+            <w:r>
+              <w:t>count_table_df</w:t>
+            </w:r>
+            <w:proofErr w:type="spellEnd"/>
+            <w:r>
+              <w:t>), neg=</w:t>
+            </w:r>
+            <w:proofErr w:type="spellStart"/>
+            <w:r>
+              <w:t>decontam</w:t>
+            </w:r>
+            <w:proofErr w:type="spellEnd"/>
+            <w:r>
+              <w:t>)</w:t>
+            </w:r>
+          </w:p>
+        </w:tc>
+      </w:tr>
+      <w:tr>
+        <w:tc>
+          <w:tcPr>
+            <w:cnfStyle w:val="001000000000" w:firstRow="0" w:lastRow="0" w:firstColumn="1" w:lastColumn="0" w:oddVBand="0" w:evenVBand="0" w:oddHBand="0" w:evenHBand="0" w:firstRowFirstColumn="0" w:firstRowLastColumn="0" w:lastRowFirstColumn="0" w:lastRowLastColumn="0"/>
+            <w:tcW w:w="3767" w:type="dxa"/>
+          </w:tcPr>
+          <w:p>
+            <w:r>
+              <w:t>Check our results.</w:t>
+            </w:r>
+          </w:p>
+        </w:tc>
+        <w:tc>
+          <w:tcPr>
+            <w:tcW w:w="6681" w:type="dxa"/>
+          </w:tcPr>
+          <w:p>
+            <w:pPr>
+              <w:cnfStyle w:val="000000000000" w:firstRow="0" w:lastRow="0" w:firstColumn="0" w:lastColumn="0" w:oddVBand="0" w:evenVBand="0" w:oddHBand="0" w:evenHBand="0" w:firstRowFirstColumn="0" w:firstRowLastColumn="0" w:lastRowFirstColumn="0" w:lastRowLastColumn="0"/>
+            </w:pPr>
+            <w:r>
+              <w:t>Let’s see how many of our ASVs were FALSE (actually in our samples) or TRUE (contamination as indicated by procedural blanks)</w:t>
+            </w:r>
+          </w:p>
+        </w:tc>
+        <w:tc>
+          <w:tcPr>
+            <w:tcW w:w="4950" w:type="dxa"/>
+          </w:tcPr>
+          <w:p>
+            <w:pPr>
+              <w:cnfStyle w:val="000000000000" w:firstRow="0" w:lastRow="0" w:firstColumn="0" w:lastColumn="0" w:oddVBand="0" w:evenVBand="0" w:oddHBand="0" w:evenHBand="0" w:firstRowFirstColumn="0" w:firstRowLastColumn="0" w:lastRowFirstColumn="0" w:lastRowLastColumn="0"/>
+            </w:pPr>
+            <w:r>
+              <w:t>table(</w:t>
+            </w:r>
+            <w:proofErr w:type="spellStart"/>
+            <w:r>
+              <w:t>contam_df$contaminant</w:t>
+            </w:r>
+            <w:proofErr w:type="spellEnd"/>
+            <w:r>
+              <w:t>)</w:t>
+            </w:r>
+          </w:p>
+        </w:tc>
+      </w:tr>
+      <w:tr>
+        <w:trPr>
+          <w:cnfStyle w:val="000000100000" w:firstRow="0" w:lastRow="0" w:firstColumn="0" w:lastColumn="0" w:oddVBand="0" w:evenVBand="0" w:oddHBand="1" w:evenHBand="0" w:firstRowFirstColumn="0" w:firstRowLastColumn="0" w:lastRowFirstColumn="0" w:lastRowLastColumn="0"/>
+        </w:trPr>
+        <w:tc>
+          <w:tcPr>
+            <w:cnfStyle w:val="001000000000" w:firstRow="0" w:lastRow="0" w:firstColumn="1" w:lastColumn="0" w:oddVBand="0" w:evenVBand="0" w:oddHBand="0" w:evenHBand="0" w:firstRowFirstColumn="0" w:firstRowLastColumn="0" w:lastRowFirstColumn="0" w:lastRowLastColumn="0"/>
+            <w:tcW w:w="3767" w:type="dxa"/>
+          </w:tcPr>
+          <w:p>
+            <w:r>
+              <w:t>Make a vector holding contaminant IDs</w:t>
+            </w:r>
+          </w:p>
+        </w:tc>
+        <w:tc>
+          <w:tcPr>
+            <w:tcW w:w="6681" w:type="dxa"/>
+          </w:tcPr>
+          <w:p>
+            <w:pPr>
+              <w:cnfStyle w:val="000000100000" w:firstRow="0" w:lastRow="0" w:firstColumn="0" w:lastColumn="0" w:oddVBand="0" w:evenVBand="0" w:oddHBand="1" w:evenHBand="0" w:firstRowFirstColumn="0" w:firstRowLastColumn="0" w:lastRowFirstColumn="0" w:lastRowLastColumn="0"/>
+            </w:pPr>
+            <w:proofErr w:type="gramStart"/>
+            <w:r>
+              <w:t>So</w:t>
+            </w:r>
+            <w:proofErr w:type="gramEnd"/>
+            <w:r>
+              <w:t xml:space="preserve"> we can see which ASVs were contaminants and remove them.</w:t>
+            </w:r>
+          </w:p>
+        </w:tc>
+        <w:tc>
+          <w:tcPr>
+            <w:tcW w:w="4950" w:type="dxa"/>
+          </w:tcPr>
+          <w:p>
+            <w:pPr>
+              <w:cnfStyle w:val="000000100000" w:firstRow="0" w:lastRow="0" w:firstColumn="0" w:lastColumn="0" w:oddVBand="0" w:evenVBand="0" w:oddHBand="1" w:evenHBand="0" w:firstRowFirstColumn="0" w:firstRowLastColumn="0" w:lastRowFirstColumn="0" w:lastRowLastColumn="0"/>
+            </w:pPr>
+            <w:proofErr w:type="spellStart"/>
+            <w:r>
+              <w:t>contam_asvs</w:t>
+            </w:r>
+            <w:proofErr w:type="spellEnd"/>
+            <w:r>
+              <w:t xml:space="preserve"> &lt;- </w:t>
+            </w:r>
+            <w:proofErr w:type="spellStart"/>
+            <w:proofErr w:type="gramStart"/>
+            <w:r>
+              <w:t>row.names</w:t>
+            </w:r>
+            <w:proofErr w:type="spellEnd"/>
+            <w:proofErr w:type="gramEnd"/>
+            <w:r>
+              <w:t>(</w:t>
+            </w:r>
+            <w:proofErr w:type="spellStart"/>
+            <w:r>
+              <w:t>contam_df</w:t>
+            </w:r>
+            <w:proofErr w:type="spellEnd"/>
+            <w:r>
+              <w:t>[</w:t>
+            </w:r>
+            <w:proofErr w:type="spellStart"/>
+            <w:r>
+              <w:t>contam_df$contaminant</w:t>
+            </w:r>
+            <w:proofErr w:type="spellEnd"/>
+            <w:r>
+              <w:t xml:space="preserve"> == TRUE, ])</w:t>
+            </w:r>
+          </w:p>
+        </w:tc>
+      </w:tr>
+      <w:tr>
+        <w:tc>
+          <w:tcPr>
+            <w:cnfStyle w:val="001000000000" w:firstRow="0" w:lastRow="0" w:firstColumn="1" w:lastColumn="0" w:oddVBand="0" w:evenVBand="0" w:oddHBand="0" w:evenHBand="0" w:firstRowFirstColumn="0" w:firstRowLastColumn="0" w:lastRowFirstColumn="0" w:lastRowLastColumn="0"/>
+            <w:tcW w:w="3767" w:type="dxa"/>
+          </w:tcPr>
+          <w:p>
+            <w:r>
+              <w:t>Check the taxonomy of these contaminants</w:t>
+            </w:r>
+          </w:p>
+        </w:tc>
+        <w:tc>
+          <w:tcPr>
+            <w:tcW w:w="6681" w:type="dxa"/>
+          </w:tcPr>
+          <w:p>
+            <w:pPr>
+              <w:cnfStyle w:val="000000000000" w:firstRow="0" w:lastRow="0" w:firstColumn="0" w:lastColumn="0" w:oddVBand="0" w:evenVBand="0" w:oddHBand="0" w:evenHBand="0" w:firstRowFirstColumn="0" w:firstRowLastColumn="0" w:lastRowFirstColumn="0" w:lastRowLastColumn="0"/>
+            </w:pPr>
+            <w:proofErr w:type="gramStart"/>
+            <w:r>
+              <w:t>So</w:t>
+            </w:r>
+            <w:proofErr w:type="gramEnd"/>
+            <w:r>
+              <w:t xml:space="preserve"> we can see which ASVs were contaminants and remove them.</w:t>
+            </w:r>
+            <w:r>
+              <w:t xml:space="preserve"> </w:t>
+            </w:r>
+            <w:proofErr w:type="spellStart"/>
+            <w:r>
+              <w:t>Tidyverse</w:t>
+            </w:r>
+            <w:proofErr w:type="spellEnd"/>
+            <w:r>
+              <w:t xml:space="preserve"> package is used here for %in% function.</w:t>
+            </w:r>
+          </w:p>
+        </w:tc>
+        <w:tc>
+          <w:tcPr>
+            <w:tcW w:w="4950" w:type="dxa"/>
+          </w:tcPr>
+          <w:p>
+            <w:pPr>
+              <w:cnfStyle w:val="000000000000" w:firstRow="0" w:lastRow="0" w:firstColumn="0" w:lastColumn="0" w:oddVBand="0" w:evenVBand="0" w:oddHBand="0" w:evenHBand="0" w:firstRowFirstColumn="0" w:firstRowLastColumn="0" w:lastRowFirstColumn="0" w:lastRowLastColumn="0"/>
+            </w:pPr>
+            <w:proofErr w:type="gramStart"/>
+            <w:r>
+              <w:t>taxonomy[</w:t>
+            </w:r>
+            <w:proofErr w:type="spellStart"/>
+            <w:proofErr w:type="gramEnd"/>
+            <w:r>
+              <w:t>taxonomy$`Feature</w:t>
+            </w:r>
+            <w:proofErr w:type="spellEnd"/>
+            <w:r>
+              <w:t xml:space="preserve"> ID` %in% </w:t>
+            </w:r>
+            <w:proofErr w:type="spellStart"/>
+            <w:r>
+              <w:t>contam_asvs</w:t>
+            </w:r>
+            <w:proofErr w:type="spellEnd"/>
+            <w:r>
+              <w:t>, ]</w:t>
+            </w:r>
+          </w:p>
+        </w:tc>
+      </w:tr>
+      <w:tr>
+        <w:trPr>
+          <w:cnfStyle w:val="000000100000" w:firstRow="0" w:lastRow="0" w:firstColumn="0" w:lastColumn="0" w:oddVBand="0" w:evenVBand="0" w:oddHBand="1" w:evenHBand="0" w:firstRowFirstColumn="0" w:firstRowLastColumn="0" w:lastRowFirstColumn="0" w:lastRowLastColumn="0"/>
+        </w:trPr>
+        <w:tc>
+          <w:tcPr>
+            <w:cnfStyle w:val="001000000000" w:firstRow="0" w:lastRow="0" w:firstColumn="1" w:lastColumn="0" w:oddVBand="0" w:evenVBand="0" w:oddHBand="0" w:evenHBand="0" w:firstRowFirstColumn="0" w:firstRowLastColumn="0" w:lastRowFirstColumn="0" w:lastRowLastColumn="0"/>
+            <w:tcW w:w="3767" w:type="dxa"/>
+          </w:tcPr>
+          <w:p>
+            <w:r>
+              <w:t xml:space="preserve">Save to ‘x’ variable which rows </w:t>
+            </w:r>
+            <w:r>
+              <w:t>of the count table are contaminant ASVs</w:t>
+            </w:r>
+          </w:p>
+        </w:tc>
+        <w:tc>
+          <w:tcPr>
+            <w:tcW w:w="6681" w:type="dxa"/>
+          </w:tcPr>
+          <w:p>
+            <w:pPr>
+              <w:cnfStyle w:val="000000100000" w:firstRow="0" w:lastRow="0" w:firstColumn="0" w:lastColumn="0" w:oddVBand="0" w:evenVBand="0" w:oddHBand="1" w:evenHBand="0" w:firstRowFirstColumn="0" w:firstRowLastColumn="0" w:lastRowFirstColumn="0" w:lastRowLastColumn="0"/>
+            </w:pPr>
+            <w:proofErr w:type="gramStart"/>
+            <w:r>
+              <w:t>So</w:t>
+            </w:r>
+            <w:proofErr w:type="gramEnd"/>
+            <w:r>
+              <w:t xml:space="preserve"> we know which rows (ASVs) to remove. </w:t>
+            </w:r>
+            <w:proofErr w:type="spellStart"/>
+            <w:r>
+              <w:t>Tidyverse</w:t>
+            </w:r>
+            <w:proofErr w:type="spellEnd"/>
+            <w:r>
+              <w:t xml:space="preserve"> package is used here for %in% function.</w:t>
+            </w:r>
+          </w:p>
+        </w:tc>
+        <w:tc>
+          <w:tcPr>
+            <w:tcW w:w="4950" w:type="dxa"/>
+          </w:tcPr>
+          <w:p>
+            <w:pPr>
+              <w:cnfStyle w:val="000000100000" w:firstRow="0" w:lastRow="0" w:firstColumn="0" w:lastColumn="0" w:oddVBand="0" w:evenVBand="0" w:oddHBand="1" w:evenHBand="0" w:firstRowFirstColumn="0" w:firstRowLastColumn="0" w:lastRowFirstColumn="0" w:lastRowLastColumn="0"/>
+            </w:pPr>
+            <w:r>
+              <w:t xml:space="preserve">x &lt;- </w:t>
+            </w:r>
+            <w:proofErr w:type="spellStart"/>
+            <w:r>
+              <w:t>rownames</w:t>
+            </w:r>
+            <w:proofErr w:type="spellEnd"/>
+            <w:r>
+              <w:t>(</w:t>
+            </w:r>
+            <w:proofErr w:type="spellStart"/>
+            <w:r>
+              <w:t>count_table</w:t>
+            </w:r>
+            <w:proofErr w:type="spellEnd"/>
+            <w:r>
+              <w:t xml:space="preserve">) %in% </w:t>
+            </w:r>
+            <w:proofErr w:type="spellStart"/>
+            <w:r>
+              <w:t>contam_asvs</w:t>
+            </w:r>
+            <w:proofErr w:type="spellEnd"/>
+          </w:p>
+        </w:tc>
+      </w:tr>
+      <w:tr>
+        <w:tc>
+          <w:tcPr>
+            <w:cnfStyle w:val="001000000000" w:firstRow="0" w:lastRow="0" w:firstColumn="1" w:lastColumn="0" w:oddVBand="0" w:evenVBand="0" w:oddHBand="0" w:evenHBand="0" w:firstRowFirstColumn="0" w:firstRowLastColumn="0" w:lastRowFirstColumn="0" w:lastRowLastColumn="0"/>
+            <w:tcW w:w="3767" w:type="dxa"/>
+          </w:tcPr>
+          <w:p>
+            <w:r>
+              <w:t>Remove these rows</w:t>
+            </w:r>
+          </w:p>
+        </w:tc>
+        <w:tc>
+          <w:tcPr>
+            <w:tcW w:w="6681" w:type="dxa"/>
+          </w:tcPr>
+          <w:p>
+            <w:pPr>
+              <w:cnfStyle w:val="000000000000" w:firstRow="0" w:lastRow="0" w:firstColumn="0" w:lastColumn="0" w:oddVBand="0" w:evenVBand="0" w:oddHBand="0" w:evenHBand="0" w:firstRowFirstColumn="0" w:firstRowLastColumn="0" w:lastRowFirstColumn="0" w:lastRowLastColumn="0"/>
+            </w:pPr>
+          </w:p>
+        </w:tc>
+        <w:tc>
+          <w:tcPr>
+            <w:tcW w:w="4950" w:type="dxa"/>
+          </w:tcPr>
+          <w:p>
+            <w:pPr>
+              <w:cnfStyle w:val="000000000000" w:firstRow="0" w:lastRow="0" w:firstColumn="0" w:lastColumn="0" w:oddVBand="0" w:evenVBand="0" w:oddHBand="0" w:evenHBand="0" w:firstRowFirstColumn="0" w:firstRowLastColumn="0" w:lastRowFirstColumn="0" w:lastRowLastColumn="0"/>
+            </w:pPr>
+            <w:proofErr w:type="spellStart"/>
+            <w:r>
+              <w:t>count_table_clean</w:t>
+            </w:r>
+            <w:proofErr w:type="spellEnd"/>
+            <w:r>
+              <w:t xml:space="preserve"> &lt;- </w:t>
+            </w:r>
+            <w:proofErr w:type="spellStart"/>
+            <w:r>
+              <w:t>count_table</w:t>
+            </w:r>
+            <w:proofErr w:type="spellEnd"/>
+            <w:proofErr w:type="gramStart"/>
+            <w:r>
+              <w:t>[!x</w:t>
+            </w:r>
+            <w:proofErr w:type="gramEnd"/>
+            <w:r>
+              <w:t>,]</w:t>
+            </w:r>
+          </w:p>
+        </w:tc>
+      </w:tr>
+      <w:tr>
+        <w:trPr>
+          <w:cnfStyle w:val="000000100000" w:firstRow="0" w:lastRow="0" w:firstColumn="0" w:lastColumn="0" w:oddVBand="0" w:evenVBand="0" w:oddHBand="1" w:evenHBand="0" w:firstRowFirstColumn="0" w:firstRowLastColumn="0" w:lastRowFirstColumn="0" w:lastRowLastColumn="0"/>
+        </w:trPr>
+        <w:tc>
+          <w:tcPr>
+            <w:cnfStyle w:val="001000000000" w:firstRow="0" w:lastRow="0" w:firstColumn="1" w:lastColumn="0" w:oddVBand="0" w:evenVBand="0" w:oddHBand="0" w:evenHBand="0" w:firstRowFirstColumn="0" w:firstRowLastColumn="0" w:lastRowFirstColumn="0" w:lastRowLastColumn="0"/>
+            <w:tcW w:w="3767" w:type="dxa"/>
+          </w:tcPr>
+          <w:p>
+            <w:r>
+              <w:t>Get the indexes of which columns in the count table represent blank samples.</w:t>
+            </w:r>
+          </w:p>
+        </w:tc>
+        <w:tc>
+          <w:tcPr>
+            <w:tcW w:w="6681" w:type="dxa"/>
+          </w:tcPr>
+          <w:p>
+            <w:pPr>
+              <w:cnfStyle w:val="000000100000" w:firstRow="0" w:lastRow="0" w:firstColumn="0" w:lastColumn="0" w:oddVBand="0" w:evenVBand="0" w:oddHBand="1" w:evenHBand="0" w:firstRowFirstColumn="0" w:firstRowLastColumn="0" w:lastRowFirstColumn="0" w:lastRowLastColumn="0"/>
+            </w:pPr>
+            <w:proofErr w:type="gramStart"/>
+            <w:r>
+              <w:t>So</w:t>
+            </w:r>
+            <w:proofErr w:type="gramEnd"/>
+            <w:r>
+              <w:t xml:space="preserve"> we know which columns (samples to remove).</w:t>
+            </w:r>
+          </w:p>
+        </w:tc>
+        <w:tc>
+          <w:tcPr>
+            <w:tcW w:w="4950" w:type="dxa"/>
+          </w:tcPr>
+          <w:p>
+            <w:pPr>
+              <w:cnfStyle w:val="000000100000" w:firstRow="0" w:lastRow="0" w:firstColumn="0" w:lastColumn="0" w:oddVBand="0" w:evenVBand="0" w:oddHBand="1" w:evenHBand="0" w:firstRowFirstColumn="0" w:firstRowLastColumn="0" w:lastRowFirstColumn="0" w:lastRowLastColumn="0"/>
+            </w:pPr>
+            <w:proofErr w:type="spellStart"/>
+            <w:r>
+              <w:t>true_index</w:t>
+            </w:r>
+            <w:proofErr w:type="spellEnd"/>
+            <w:r>
+              <w:t xml:space="preserve"> &lt;- NULL</w:t>
+            </w:r>
+          </w:p>
+          <w:p>
+            <w:pPr>
+              <w:cnfStyle w:val="000000100000" w:firstRow="0" w:lastRow="0" w:firstColumn="0" w:lastColumn="0" w:oddVBand="0" w:evenVBand="0" w:oddHBand="1" w:evenHBand="0" w:firstRowFirstColumn="0" w:firstRowLastColumn="0" w:lastRowFirstColumn="0" w:lastRowLastColumn="0"/>
+            </w:pPr>
+            <w:r>
+              <w:t>for (</w:t>
+            </w:r>
+            <w:proofErr w:type="spellStart"/>
+            <w:r>
+              <w:t>i</w:t>
+            </w:r>
+            <w:proofErr w:type="spellEnd"/>
+            <w:r>
+              <w:t xml:space="preserve"> in </w:t>
+            </w:r>
+            <w:proofErr w:type="gramStart"/>
+            <w:r>
+              <w:t>1:length</w:t>
+            </w:r>
+            <w:proofErr w:type="gramEnd"/>
+            <w:r>
+              <w:t>(</w:t>
+            </w:r>
+            <w:proofErr w:type="spellStart"/>
+            <w:r>
+              <w:t>decontam</w:t>
+            </w:r>
+            <w:proofErr w:type="spellEnd"/>
+            <w:r>
+              <w:t>)){</w:t>
+            </w:r>
+          </w:p>
+          <w:p>
+            <w:pPr>
+              <w:cnfStyle w:val="000000100000" w:firstRow="0" w:lastRow="0" w:firstColumn="0" w:lastColumn="0" w:oddVBand="0" w:evenVBand="0" w:oddHBand="1" w:evenHBand="0" w:firstRowFirstColumn="0" w:firstRowLastColumn="0" w:lastRowFirstColumn="0" w:lastRowLastColumn="0"/>
+            </w:pPr>
+            <w:r>
+              <w:t xml:space="preserve">  if (</w:t>
+            </w:r>
+            <w:proofErr w:type="spellStart"/>
+            <w:r>
+              <w:t>decontam</w:t>
+            </w:r>
+            <w:proofErr w:type="spellEnd"/>
+            <w:r>
+              <w:t>[[</w:t>
+            </w:r>
+            <w:proofErr w:type="spellStart"/>
+            <w:r>
+              <w:t>i</w:t>
+            </w:r>
+            <w:proofErr w:type="spellEnd"/>
+            <w:r>
+              <w:t>]] == "TRUE</w:t>
+            </w:r>
+            <w:proofErr w:type="gramStart"/>
+            <w:r>
+              <w:t>"){</w:t>
+            </w:r>
+            <w:proofErr w:type="gramEnd"/>
+          </w:p>
+          <w:p>
+            <w:pPr>
+              <w:cnfStyle w:val="000000100000" w:firstRow="0" w:lastRow="0" w:firstColumn="0" w:lastColumn="0" w:oddVBand="0" w:evenVBand="0" w:oddHBand="1" w:evenHBand="0" w:firstRowFirstColumn="0" w:firstRowLastColumn="0" w:lastRowFirstColumn="0" w:lastRowLastColumn="0"/>
+            </w:pPr>
+            <w:r>
+              <w:t xml:space="preserve">    </w:t>
+            </w:r>
+            <w:proofErr w:type="spellStart"/>
+            <w:r>
+              <w:t>true_index</w:t>
+            </w:r>
+            <w:proofErr w:type="spellEnd"/>
+            <w:r>
+              <w:t xml:space="preserve"> &lt;- </w:t>
+            </w:r>
+            <w:proofErr w:type="gramStart"/>
+            <w:r>
+              <w:t>c(</w:t>
+            </w:r>
+            <w:proofErr w:type="spellStart"/>
+            <w:proofErr w:type="gramEnd"/>
+            <w:r>
+              <w:t>true_index</w:t>
+            </w:r>
+            <w:proofErr w:type="spellEnd"/>
+            <w:r>
+              <w:t xml:space="preserve">, </w:t>
+            </w:r>
+            <w:proofErr w:type="spellStart"/>
+            <w:r>
+              <w:t>i</w:t>
+            </w:r>
+            <w:proofErr w:type="spellEnd"/>
+            <w:r>
+              <w:t>)</w:t>
+            </w:r>
+          </w:p>
+          <w:p>
+            <w:pPr>
+              <w:cnfStyle w:val="000000100000" w:firstRow="0" w:lastRow="0" w:firstColumn="0" w:lastColumn="0" w:oddVBand="0" w:evenVBand="0" w:oddHBand="1" w:evenHBand="0" w:firstRowFirstColumn="0" w:firstRowLastColumn="0" w:lastRowFirstColumn="0" w:lastRowLastColumn="0"/>
+            </w:pPr>
+            <w:r>
+              <w:t xml:space="preserve">  }</w:t>
+            </w:r>
+          </w:p>
+          <w:p>
+            <w:pPr>
+              <w:cnfStyle w:val="000000100000" w:firstRow="0" w:lastRow="0" w:firstColumn="0" w:lastColumn="0" w:oddVBand="0" w:evenVBand="0" w:oddHBand="1" w:evenHBand="0" w:firstRowFirstColumn="0" w:firstRowLastColumn="0" w:lastRowFirstColumn="0" w:lastRowLastColumn="0"/>
+            </w:pPr>
+            <w:r>
+              <w:t>}</w:t>
+            </w:r>
+          </w:p>
+        </w:tc>
+      </w:tr>
+      <w:tr>
+        <w:tc>
+          <w:tcPr>
+            <w:cnfStyle w:val="001000000000" w:firstRow="0" w:lastRow="0" w:firstColumn="1" w:lastColumn="0" w:oddVBand="0" w:evenVBand="0" w:oddHBand="0" w:evenHBand="0" w:firstRowFirstColumn="0" w:firstRowLastColumn="0" w:lastRowFirstColumn="0" w:lastRowLastColumn="0"/>
+            <w:tcW w:w="3767" w:type="dxa"/>
+          </w:tcPr>
+          <w:p>
+            <w:r>
+              <w:t>Remove the blank samples from the count table.</w:t>
+            </w:r>
+          </w:p>
+        </w:tc>
+        <w:tc>
+          <w:tcPr>
+            <w:tcW w:w="6681" w:type="dxa"/>
+          </w:tcPr>
+          <w:p>
+            <w:pPr>
+              <w:cnfStyle w:val="000000000000" w:firstRow="0" w:lastRow="0" w:firstColumn="0" w:lastColumn="0" w:oddVBand="0" w:evenVBand="0" w:oddHBand="0" w:evenHBand="0" w:firstRowFirstColumn="0" w:firstRowLastColumn="0" w:lastRowFirstColumn="0" w:lastRowLastColumn="0"/>
+            </w:pPr>
+            <w:r>
+              <w:t>We only want to analyse genuine ASVs from genuine samples, not blanks and contaminants.</w:t>
+            </w:r>
+          </w:p>
+        </w:tc>
+        <w:tc>
+          <w:tcPr>
+            <w:tcW w:w="4950" w:type="dxa"/>
+          </w:tcPr>
+          <w:p>
+            <w:pPr>
+              <w:cnfStyle w:val="000000000000" w:firstRow="0" w:lastRow="0" w:firstColumn="0" w:lastColumn="0" w:oddVBand="0" w:evenVBand="0" w:oddHBand="0" w:evenHBand="0" w:firstRowFirstColumn="0" w:firstRowLastColumn="0" w:lastRowFirstColumn="0" w:lastRowLastColumn="0"/>
+            </w:pPr>
+            <w:proofErr w:type="spellStart"/>
+            <w:r>
+              <w:t>count_table_clean</w:t>
+            </w:r>
+            <w:proofErr w:type="spellEnd"/>
+            <w:r>
+              <w:t xml:space="preserve"> &lt;- </w:t>
+            </w:r>
+            <w:proofErr w:type="spellStart"/>
+            <w:r>
+              <w:t>count_table_clean</w:t>
+            </w:r>
+            <w:proofErr w:type="spellEnd"/>
+            <w:proofErr w:type="gramStart"/>
+            <w:r>
+              <w:t>[,-</w:t>
+            </w:r>
+            <w:proofErr w:type="gramEnd"/>
+            <w:r>
+              <w:t>c(</w:t>
+            </w:r>
+            <w:proofErr w:type="spellStart"/>
+            <w:r>
+              <w:t>true_index</w:t>
+            </w:r>
+            <w:proofErr w:type="spellEnd"/>
+            <w:r>
+              <w:t>)]</w:t>
+            </w:r>
+          </w:p>
+        </w:tc>
+      </w:tr>
+      <w:tr>
+        <w:trPr>
+          <w:cnfStyle w:val="000000100000" w:firstRow="0" w:lastRow="0" w:firstColumn="0" w:lastColumn="0" w:oddVBand="0" w:evenVBand="0" w:oddHBand="1" w:evenHBand="0" w:firstRowFirstColumn="0" w:firstRowLastColumn="0" w:lastRowFirstColumn="0" w:lastRowLastColumn="0"/>
+        </w:trPr>
+        <w:tc>
+          <w:tcPr>
+            <w:cnfStyle w:val="001000000000" w:firstRow="0" w:lastRow="0" w:firstColumn="1" w:lastColumn="0" w:oddVBand="0" w:evenVBand="0" w:oddHBand="0" w:evenHBand="0" w:firstRowFirstColumn="0" w:firstRowLastColumn="0" w:lastRowFirstColumn="0" w:lastRowLastColumn="0"/>
+            <w:tcW w:w="3767" w:type="dxa"/>
+          </w:tcPr>
+          <w:p>
+            <w:r>
+              <w:t>Remove contaminating ASVs from the taxonomy table.</w:t>
+            </w:r>
+          </w:p>
+        </w:tc>
+        <w:tc>
+          <w:tcPr>
+            <w:tcW w:w="6681" w:type="dxa"/>
+          </w:tcPr>
+          <w:p>
+            <w:pPr>
+              <w:cnfStyle w:val="000000100000" w:firstRow="0" w:lastRow="0" w:firstColumn="0" w:lastColumn="0" w:oddVBand="0" w:evenVBand="0" w:oddHBand="1" w:evenHBand="0" w:firstRowFirstColumn="0" w:firstRowLastColumn="0" w:lastRowFirstColumn="0" w:lastRowLastColumn="0"/>
+            </w:pPr>
+            <w:r>
+              <w:t>We only want to analyse genuine ASVs from genuine samples, not blanks and contaminants.</w:t>
+            </w:r>
+            <w:r>
+              <w:t xml:space="preserve"> </w:t>
+            </w:r>
+            <w:proofErr w:type="spellStart"/>
+            <w:r>
+              <w:t>Tidyverse</w:t>
+            </w:r>
+            <w:proofErr w:type="spellEnd"/>
+            <w:r>
+              <w:t xml:space="preserve"> package is used here for %in% function.</w:t>
+            </w:r>
+          </w:p>
+        </w:tc>
+        <w:tc>
+          <w:tcPr>
+            <w:tcW w:w="4950" w:type="dxa"/>
+          </w:tcPr>
+          <w:p>
+            <w:pPr>
+              <w:cnfStyle w:val="000000100000" w:firstRow="0" w:lastRow="0" w:firstColumn="0" w:lastColumn="0" w:oddVBand="0" w:evenVBand="0" w:oddHBand="1" w:evenHBand="0" w:firstRowFirstColumn="0" w:firstRowLastColumn="0" w:lastRowFirstColumn="0" w:lastRowLastColumn="0"/>
+            </w:pPr>
+            <w:r>
+              <w:t xml:space="preserve">z &lt;- </w:t>
+            </w:r>
+            <w:proofErr w:type="spellStart"/>
+            <w:r>
+              <w:t>taxonomy$`Feature</w:t>
+            </w:r>
+            <w:proofErr w:type="spellEnd"/>
+            <w:r>
+              <w:t xml:space="preserve"> ID` %in% </w:t>
+            </w:r>
+            <w:proofErr w:type="spellStart"/>
+            <w:r>
+              <w:t>contam_asvs</w:t>
+            </w:r>
+            <w:proofErr w:type="spellEnd"/>
+          </w:p>
+          <w:p>
+            <w:pPr>
+              <w:cnfStyle w:val="000000100000" w:firstRow="0" w:lastRow="0" w:firstColumn="0" w:lastColumn="0" w:oddVBand="0" w:evenVBand="0" w:oddHBand="1" w:evenHBand="0" w:firstRowFirstColumn="0" w:firstRowLastColumn="0" w:lastRowFirstColumn="0" w:lastRowLastColumn="0"/>
+            </w:pPr>
+            <w:proofErr w:type="spellStart"/>
+            <w:r>
+              <w:t>taxonomy_clean</w:t>
+            </w:r>
+            <w:proofErr w:type="spellEnd"/>
+            <w:r>
+              <w:t xml:space="preserve"> &lt;- taxonomy</w:t>
+            </w:r>
+            <w:proofErr w:type="gramStart"/>
+            <w:r>
+              <w:t>[!</w:t>
+            </w:r>
+            <w:proofErr w:type="spellStart"/>
+            <w:r>
+              <w:t>row</w:t>
+            </w:r>
+            <w:proofErr w:type="gramEnd"/>
+            <w:r>
+              <w:t>.names</w:t>
+            </w:r>
+            <w:proofErr w:type="spellEnd"/>
+            <w:r>
+              <w:t>(taxonomy) %in% z,]</w:t>
+            </w:r>
+          </w:p>
+        </w:tc>
+      </w:tr>
+      <w:tr>
+        <w:tc>
+          <w:tcPr>
+            <w:cnfStyle w:val="001000000000" w:firstRow="0" w:lastRow="0" w:firstColumn="1" w:lastColumn="0" w:oddVBand="0" w:evenVBand="0" w:oddHBand="0" w:evenHBand="0" w:firstRowFirstColumn="0" w:firstRowLastColumn="0" w:lastRowFirstColumn="0" w:lastRowLastColumn="0"/>
+            <w:tcW w:w="3767" w:type="dxa"/>
+          </w:tcPr>
+          <w:p>
+            <w:r>
+              <w:t xml:space="preserve">Remove contaminating ASVs from the </w:t>
+            </w:r>
+            <w:proofErr w:type="spellStart"/>
+            <w:r>
+              <w:t>fasta</w:t>
+            </w:r>
+            <w:proofErr w:type="spellEnd"/>
+            <w:r>
+              <w:t xml:space="preserve"> file</w:t>
+            </w:r>
+            <w:r>
+              <w:t>.</w:t>
+            </w:r>
+          </w:p>
+        </w:tc>
+        <w:tc>
+          <w:tcPr>
+            <w:tcW w:w="6681" w:type="dxa"/>
+          </w:tcPr>
+          <w:p>
+            <w:pPr>
+              <w:cnfStyle w:val="000000000000" w:firstRow="0" w:lastRow="0" w:firstColumn="0" w:lastColumn="0" w:oddVBand="0" w:evenVBand="0" w:oddHBand="0" w:evenHBand="0" w:firstRowFirstColumn="0" w:firstRowLastColumn="0" w:lastRowFirstColumn="0" w:lastRowLastColumn="0"/>
+            </w:pPr>
+            <w:r>
+              <w:t>We only want to analyse genuine ASVs from genuine samples, not blanks and contaminants.</w:t>
+            </w:r>
+          </w:p>
+        </w:tc>
+        <w:tc>
+          <w:tcPr>
+            <w:tcW w:w="4950" w:type="dxa"/>
+          </w:tcPr>
+          <w:p>
+            <w:pPr>
+              <w:cnfStyle w:val="000000000000" w:firstRow="0" w:lastRow="0" w:firstColumn="0" w:lastColumn="0" w:oddVBand="0" w:evenVBand="0" w:oddHBand="0" w:evenHBand="0" w:firstRowFirstColumn="0" w:firstRowLastColumn="0" w:lastRowFirstColumn="0" w:lastRowLastColumn="0"/>
+            </w:pPr>
+            <w:proofErr w:type="spellStart"/>
+            <w:r>
+              <w:t>fasta_clean</w:t>
+            </w:r>
+            <w:proofErr w:type="spellEnd"/>
+            <w:r>
+              <w:t xml:space="preserve"> &lt;- </w:t>
+            </w:r>
+            <w:proofErr w:type="spellStart"/>
+            <w:r>
+              <w:t>fasta</w:t>
+            </w:r>
+            <w:proofErr w:type="spellEnd"/>
+          </w:p>
+          <w:p>
+            <w:pPr>
+              <w:cnfStyle w:val="000000000000" w:firstRow="0" w:lastRow="0" w:firstColumn="0" w:lastColumn="0" w:oddVBand="0" w:evenVBand="0" w:oddHBand="0" w:evenHBand="0" w:firstRowFirstColumn="0" w:firstRowLastColumn="0" w:lastRowFirstColumn="0" w:lastRowLastColumn="0"/>
+            </w:pPr>
+            <w:proofErr w:type="spellStart"/>
+            <w:r>
+              <w:t>fasta_clean</w:t>
+            </w:r>
+            <w:proofErr w:type="spellEnd"/>
+            <w:r>
+              <w:t>[</w:t>
+            </w:r>
+            <w:proofErr w:type="spellStart"/>
+            <w:r>
+              <w:t>contam_asvs</w:t>
+            </w:r>
+            <w:proofErr w:type="spellEnd"/>
+            <w:r>
+              <w:t>] &lt;- NULL</w:t>
+            </w:r>
+          </w:p>
+        </w:tc>
+      </w:tr>
+      <w:tr>
+        <w:trPr>
+          <w:cnfStyle w:val="000000100000" w:firstRow="0" w:lastRow="0" w:firstColumn="0" w:lastColumn="0" w:oddVBand="0" w:evenVBand="0" w:oddHBand="1" w:evenHBand="0" w:firstRowFirstColumn="0" w:firstRowLastColumn="0" w:lastRowFirstColumn="0" w:lastRowLastColumn="0"/>
+        </w:trPr>
+        <w:tc>
+          <w:tcPr>
+            <w:cnfStyle w:val="001000000000" w:firstRow="0" w:lastRow="0" w:firstColumn="1" w:lastColumn="0" w:oddVBand="0" w:evenVBand="0" w:oddHBand="0" w:evenHBand="0" w:firstRowFirstColumn="0" w:firstRowLastColumn="0" w:lastRowFirstColumn="0" w:lastRowLastColumn="0"/>
+            <w:tcW w:w="3767" w:type="dxa"/>
+          </w:tcPr>
+          <w:p>
+            <w:r>
+              <w:t xml:space="preserve">Remove the blank samples from the </w:t>
+            </w:r>
+            <w:r>
+              <w:t>metadata</w:t>
+            </w:r>
+            <w:r>
+              <w:t xml:space="preserve"> table.</w:t>
+            </w:r>
+          </w:p>
+        </w:tc>
+        <w:tc>
+          <w:tcPr>
+            <w:tcW w:w="6681" w:type="dxa"/>
+          </w:tcPr>
+          <w:p>
+            <w:pPr>
+              <w:cnfStyle w:val="000000100000" w:firstRow="0" w:lastRow="0" w:firstColumn="0" w:lastColumn="0" w:oddVBand="0" w:evenVBand="0" w:oddHBand="1" w:evenHBand="0" w:firstRowFirstColumn="0" w:firstRowLastColumn="0" w:lastRowFirstColumn="0" w:lastRowLastColumn="0"/>
+            </w:pPr>
+            <w:r>
+              <w:t>We only want to analyse genuine ASVs from genuine samples, not blanks and contaminants.</w:t>
+            </w:r>
+          </w:p>
+        </w:tc>
+        <w:tc>
+          <w:tcPr>
+            <w:tcW w:w="4950" w:type="dxa"/>
+          </w:tcPr>
+          <w:p>
+            <w:pPr>
+              <w:cnfStyle w:val="000000100000" w:firstRow="0" w:lastRow="0" w:firstColumn="0" w:lastColumn="0" w:oddVBand="0" w:evenVBand="0" w:oddHBand="1" w:evenHBand="0" w:firstRowFirstColumn="0" w:firstRowLastColumn="0" w:lastRowFirstColumn="0" w:lastRowLastColumn="0"/>
+            </w:pPr>
+            <w:r>
+              <w:t xml:space="preserve">y &lt;- </w:t>
+            </w:r>
+            <w:proofErr w:type="spellStart"/>
+            <w:proofErr w:type="gramStart"/>
+            <w:r>
+              <w:t>startsWith</w:t>
+            </w:r>
+            <w:proofErr w:type="spellEnd"/>
+            <w:r>
+              <w:t>(</w:t>
+            </w:r>
+            <w:proofErr w:type="spellStart"/>
+            <w:proofErr w:type="gramEnd"/>
+            <w:r>
+              <w:t>metadata$Sample.Name</w:t>
+            </w:r>
+            <w:proofErr w:type="spellEnd"/>
+            <w:r>
+              <w:t>, "NT")</w:t>
+            </w:r>
+          </w:p>
+          <w:p>
+            <w:pPr>
+              <w:cnfStyle w:val="000000100000" w:firstRow="0" w:lastRow="0" w:firstColumn="0" w:lastColumn="0" w:oddVBand="0" w:evenVBand="0" w:oddHBand="1" w:evenHBand="0" w:firstRowFirstColumn="0" w:firstRowLastColumn="0" w:lastRowFirstColumn="0" w:lastRowLastColumn="0"/>
+            </w:pPr>
+            <w:proofErr w:type="spellStart"/>
+            <w:r>
+              <w:t>true_index</w:t>
+            </w:r>
+            <w:proofErr w:type="spellEnd"/>
+            <w:r>
+              <w:t xml:space="preserve"> &lt;- NULL</w:t>
+            </w:r>
+          </w:p>
+          <w:p>
+            <w:pPr>
+              <w:cnfStyle w:val="000000100000" w:firstRow="0" w:lastRow="0" w:firstColumn="0" w:lastColumn="0" w:oddVBand="0" w:evenVBand="0" w:oddHBand="1" w:evenHBand="0" w:firstRowFirstColumn="0" w:firstRowLastColumn="0" w:lastRowFirstColumn="0" w:lastRowLastColumn="0"/>
+            </w:pPr>
+            <w:r>
+              <w:t>for (</w:t>
+            </w:r>
+            <w:proofErr w:type="spellStart"/>
+            <w:r>
+              <w:t>i</w:t>
+            </w:r>
+            <w:proofErr w:type="spellEnd"/>
+            <w:r>
+              <w:t xml:space="preserve"> in </w:t>
+            </w:r>
+            <w:proofErr w:type="gramStart"/>
+            <w:r>
+              <w:t>1:length</w:t>
+            </w:r>
+            <w:proofErr w:type="gramEnd"/>
+            <w:r>
+              <w:t>(y)){</w:t>
+            </w:r>
+          </w:p>
+          <w:p>
+            <w:pPr>
+              <w:cnfStyle w:val="000000100000" w:firstRow="0" w:lastRow="0" w:firstColumn="0" w:lastColumn="0" w:oddVBand="0" w:evenVBand="0" w:oddHBand="1" w:evenHBand="0" w:firstRowFirstColumn="0" w:firstRowLastColumn="0" w:lastRowFirstColumn="0" w:lastRowLastColumn="0"/>
+            </w:pPr>
+            <w:r>
+              <w:t xml:space="preserve">  if (y[[</w:t>
+            </w:r>
+            <w:proofErr w:type="spellStart"/>
+            <w:r>
+              <w:t>i</w:t>
+            </w:r>
+            <w:proofErr w:type="spellEnd"/>
+            <w:r>
+              <w:t>]] == "TRUE</w:t>
+            </w:r>
+            <w:proofErr w:type="gramStart"/>
+            <w:r>
+              <w:t>"){</w:t>
+            </w:r>
+            <w:proofErr w:type="gramEnd"/>
+          </w:p>
+          <w:p>
+            <w:pPr>
+              <w:cnfStyle w:val="000000100000" w:firstRow="0" w:lastRow="0" w:firstColumn="0" w:lastColumn="0" w:oddVBand="0" w:evenVBand="0" w:oddHBand="1" w:evenHBand="0" w:firstRowFirstColumn="0" w:firstRowLastColumn="0" w:lastRowFirstColumn="0" w:lastRowLastColumn="0"/>
+            </w:pPr>
+            <w:r>
+              <w:t xml:space="preserve">    </w:t>
+            </w:r>
+            <w:proofErr w:type="spellStart"/>
+            <w:r>
+              <w:t>true_index</w:t>
+            </w:r>
+            <w:proofErr w:type="spellEnd"/>
+            <w:r>
+              <w:t xml:space="preserve"> &lt;- </w:t>
+            </w:r>
+            <w:proofErr w:type="gramStart"/>
+            <w:r>
+              <w:t>c(</w:t>
+            </w:r>
+            <w:proofErr w:type="spellStart"/>
+            <w:proofErr w:type="gramEnd"/>
+            <w:r>
+              <w:t>true_index</w:t>
+            </w:r>
+            <w:proofErr w:type="spellEnd"/>
+            <w:r>
+              <w:t xml:space="preserve">, </w:t>
+            </w:r>
+            <w:proofErr w:type="spellStart"/>
+            <w:r>
+              <w:t>i</w:t>
+            </w:r>
+            <w:proofErr w:type="spellEnd"/>
+            <w:r>
+              <w:t>)</w:t>
+            </w:r>
+          </w:p>
+          <w:p>
+            <w:pPr>
+              <w:cnfStyle w:val="000000100000" w:firstRow="0" w:lastRow="0" w:firstColumn="0" w:lastColumn="0" w:oddVBand="0" w:evenVBand="0" w:oddHBand="1" w:evenHBand="0" w:firstRowFirstColumn="0" w:firstRowLastColumn="0" w:lastRowFirstColumn="0" w:lastRowLastColumn="0"/>
+            </w:pPr>
+            <w:r>
+              <w:t xml:space="preserve">  }</w:t>
+            </w:r>
+          </w:p>
+          <w:p>
+            <w:pPr>
+              <w:cnfStyle w:val="000000100000" w:firstRow="0" w:lastRow="0" w:firstColumn="0" w:lastColumn="0" w:oddVBand="0" w:evenVBand="0" w:oddHBand="1" w:evenHBand="0" w:firstRowFirstColumn="0" w:firstRowLastColumn="0" w:lastRowFirstColumn="0" w:lastRowLastColumn="0"/>
+            </w:pPr>
+            <w:r>
+              <w:t>}</w:t>
+            </w:r>
+          </w:p>
+          <w:p>
+            <w:pPr>
+              <w:cnfStyle w:val="000000100000" w:firstRow="0" w:lastRow="0" w:firstColumn="0" w:lastColumn="0" w:oddVBand="0" w:evenVBand="0" w:oddHBand="1" w:evenHBand="0" w:firstRowFirstColumn="0" w:firstRowLastColumn="0" w:lastRowFirstColumn="0" w:lastRowLastColumn="0"/>
+            </w:pPr>
+            <w:r>
+              <w:t>metadata &lt;- metadata[-c(</w:t>
+            </w:r>
+            <w:proofErr w:type="spellStart"/>
+            <w:r>
+              <w:t>true_index</w:t>
+            </w:r>
+            <w:proofErr w:type="spellEnd"/>
+            <w:r>
+              <w:t>),]</w:t>
+            </w:r>
+          </w:p>
+        </w:tc>
+      </w:tr>
+      <w:tr>
+        <w:tc>
+          <w:tcPr>
+            <w:cnfStyle w:val="001000000000" w:firstRow="0" w:lastRow="0" w:firstColumn="1" w:lastColumn="0" w:oddVBand="0" w:evenVBand="0" w:oddHBand="0" w:evenHBand="0" w:firstRowFirstColumn="0" w:firstRowLastColumn="0" w:lastRowFirstColumn="0" w:lastRowLastColumn="0"/>
+            <w:tcW w:w="3767" w:type="dxa"/>
+          </w:tcPr>
+          <w:p>
+            <w:r>
+              <w:t xml:space="preserve">Remove contaminating ASVs from the </w:t>
+            </w:r>
+            <w:r>
+              <w:t>phylogenetic tree</w:t>
+            </w:r>
+            <w:r>
+              <w:t>.</w:t>
+            </w:r>
+          </w:p>
+        </w:tc>
+        <w:tc>
+          <w:tcPr>
+            <w:tcW w:w="6681" w:type="dxa"/>
+          </w:tcPr>
+          <w:p>
+            <w:pPr>
+              <w:cnfStyle w:val="000000000000" w:firstRow="0" w:lastRow="0" w:firstColumn="0" w:lastColumn="0" w:oddVBand="0" w:evenVBand="0" w:oddHBand="0" w:evenHBand="0" w:firstRowFirstColumn="0" w:firstRowLastColumn="0" w:lastRowFirstColumn="0" w:lastRowLastColumn="0"/>
+            </w:pPr>
+            <w:r>
+              <w:t>We only want to analyse genuine ASVs from genuine samples, not blanks and contaminants.</w:t>
+            </w:r>
+            <w:r>
+              <w:t xml:space="preserve"> </w:t>
+            </w:r>
+            <w:proofErr w:type="spellStart"/>
+            <w:r>
+              <w:t>Prune_taxa</w:t>
+            </w:r>
+            <w:proofErr w:type="spellEnd"/>
+            <w:r>
+              <w:t xml:space="preserve"> is from the </w:t>
+            </w:r>
+            <w:proofErr w:type="spellStart"/>
+            <w:r>
+              <w:t>phyloseq</w:t>
+            </w:r>
+            <w:proofErr w:type="spellEnd"/>
+            <w:r>
+              <w:t xml:space="preserve"> package.</w:t>
+            </w:r>
+          </w:p>
+        </w:tc>
+        <w:tc>
+          <w:tcPr>
+            <w:tcW w:w="4950" w:type="dxa"/>
+          </w:tcPr>
+          <w:p>
+            <w:pPr>
+              <w:cnfStyle w:val="000000000000" w:firstRow="0" w:lastRow="0" w:firstColumn="0" w:lastColumn="0" w:oddVBand="0" w:evenVBand="0" w:oddHBand="0" w:evenHBand="0" w:firstRowFirstColumn="0" w:firstRowLastColumn="0" w:lastRowFirstColumn="0" w:lastRowLastColumn="0"/>
+            </w:pPr>
+            <w:proofErr w:type="spellStart"/>
+            <w:r>
+              <w:t>tree_clean</w:t>
+            </w:r>
+            <w:proofErr w:type="spellEnd"/>
+            <w:r>
+              <w:t xml:space="preserve"> &lt;- </w:t>
+            </w:r>
+            <w:proofErr w:type="spellStart"/>
+            <w:r>
+              <w:t>prune_</w:t>
+            </w:r>
+            <w:proofErr w:type="gramStart"/>
+            <w:r>
+              <w:t>taxa</w:t>
+            </w:r>
+            <w:proofErr w:type="spellEnd"/>
+            <w:r>
+              <w:t>(</w:t>
+            </w:r>
+            <w:proofErr w:type="spellStart"/>
+            <w:proofErr w:type="gramEnd"/>
+            <w:r>
+              <w:t>count_table_clean</w:t>
+            </w:r>
+            <w:proofErr w:type="spellEnd"/>
+            <w:r>
+              <w:t>$`#OTU ID`, tree)</w:t>
+            </w:r>
+          </w:p>
+        </w:tc>
+      </w:tr>
+      <w:tr>
+        <w:trPr>
+          <w:cnfStyle w:val="000000100000" w:firstRow="0" w:lastRow="0" w:firstColumn="0" w:lastColumn="0" w:oddVBand="0" w:evenVBand="0" w:oddHBand="1" w:evenHBand="0" w:firstRowFirstColumn="0" w:firstRowLastColumn="0" w:lastRowFirstColumn="0" w:lastRowLastColumn="0"/>
+        </w:trPr>
+        <w:tc>
+          <w:tcPr>
+            <w:cnfStyle w:val="001000000000" w:firstRow="0" w:lastRow="0" w:firstColumn="1" w:lastColumn="0" w:oddVBand="0" w:evenVBand="0" w:oddHBand="0" w:evenHBand="0" w:firstRowFirstColumn="0" w:firstRowLastColumn="0" w:lastRowFirstColumn="0" w:lastRowLastColumn="0"/>
+            <w:tcW w:w="3767" w:type="dxa"/>
+          </w:tcPr>
+          <w:p>
+            <w:r>
+              <w:t>Plot rarefaction curves of the data and save.</w:t>
+            </w:r>
+          </w:p>
+        </w:tc>
+        <w:tc>
+          <w:tcPr>
+            <w:tcW w:w="6681" w:type="dxa"/>
+          </w:tcPr>
+          <w:p>
+            <w:pPr>
+              <w:cnfStyle w:val="000000100000" w:firstRow="0" w:lastRow="0" w:firstColumn="0" w:lastColumn="0" w:oddVBand="0" w:evenVBand="0" w:oddHBand="1" w:evenHBand="0" w:firstRowFirstColumn="0" w:firstRowLastColumn="0" w:lastRowFirstColumn="0" w:lastRowLastColumn="0"/>
+            </w:pPr>
+            <w:r>
+              <w:t xml:space="preserve">This plots the number of </w:t>
+            </w:r>
+            <w:proofErr w:type="gramStart"/>
+            <w:r>
+              <w:t>sequence</w:t>
+            </w:r>
+            <w:proofErr w:type="gramEnd"/>
+            <w:r>
+              <w:t xml:space="preserve"> reads (individual microbes) per sample (x-axis) by the number of ASVs in that sample. We can use this to see what our smallest number of </w:t>
+            </w:r>
+            <w:proofErr w:type="gramStart"/>
+            <w:r>
+              <w:t>sequence</w:t>
+            </w:r>
+            <w:proofErr w:type="gramEnd"/>
+            <w:r>
+              <w:t xml:space="preserve"> reads in a sample was. A</w:t>
+            </w:r>
+            <w:r>
+              <w:t xml:space="preserve"> technique to assess species richness from the results of sampling</w:t>
+            </w:r>
+            <w:r>
+              <w:t xml:space="preserve"> depth.   </w:t>
+            </w:r>
+          </w:p>
+        </w:tc>
+        <w:tc>
+          <w:tcPr>
+            <w:tcW w:w="4950" w:type="dxa"/>
+          </w:tcPr>
+          <w:p>
+            <w:pPr>
+              <w:cnfStyle w:val="000000100000" w:firstRow="0" w:lastRow="0" w:firstColumn="0" w:lastColumn="0" w:oddVBand="0" w:evenVBand="0" w:oddHBand="1" w:evenHBand="0" w:firstRowFirstColumn="0" w:firstRowLastColumn="0" w:lastRowFirstColumn="0" w:lastRowLastColumn="0"/>
+            </w:pPr>
+            <w:r>
+              <w:t xml:space="preserve">pdf("results/rplot.pdf") </w:t>
+            </w:r>
+          </w:p>
+          <w:p>
+            <w:pPr>
+              <w:cnfStyle w:val="000000100000" w:firstRow="0" w:lastRow="0" w:firstColumn="0" w:lastColumn="0" w:oddVBand="0" w:evenVBand="0" w:oddHBand="1" w:evenHBand="0" w:firstRowFirstColumn="0" w:firstRowLastColumn="0" w:lastRowFirstColumn="0" w:lastRowLastColumn="0"/>
+            </w:pPr>
+            <w:proofErr w:type="spellStart"/>
+            <w:r>
+              <w:t>rarecurve</w:t>
+            </w:r>
+            <w:proofErr w:type="spellEnd"/>
+            <w:r>
+              <w:t>(t(</w:t>
+            </w:r>
+            <w:proofErr w:type="spellStart"/>
+            <w:r>
+              <w:t>count_table_clean</w:t>
+            </w:r>
+            <w:proofErr w:type="spellEnd"/>
+            <w:r>
+              <w:t xml:space="preserve">), step=100, </w:t>
+            </w:r>
+            <w:proofErr w:type="spellStart"/>
+            <w:r>
+              <w:t>cex</w:t>
+            </w:r>
+            <w:proofErr w:type="spellEnd"/>
+            <w:r>
+              <w:t>=0.5, col=palette(rainbow(</w:t>
+            </w:r>
+            <w:proofErr w:type="spellStart"/>
+            <w:r>
+              <w:t>nrow</w:t>
+            </w:r>
+            <w:proofErr w:type="spellEnd"/>
+            <w:r>
+              <w:t xml:space="preserve">(metadata))), </w:t>
+            </w:r>
+            <w:proofErr w:type="spellStart"/>
+            <w:r>
+              <w:t>lwd</w:t>
+            </w:r>
+            <w:proofErr w:type="spellEnd"/>
+            <w:r>
+              <w:t xml:space="preserve">=2, </w:t>
+            </w:r>
+            <w:proofErr w:type="spellStart"/>
+            <w:r>
+              <w:t>ylab</w:t>
+            </w:r>
+            <w:proofErr w:type="spellEnd"/>
+            <w:r>
+              <w:t>="ASVs", label=T)</w:t>
+            </w:r>
+          </w:p>
+          <w:p>
+            <w:pPr>
+              <w:cnfStyle w:val="000000100000" w:firstRow="0" w:lastRow="0" w:firstColumn="0" w:lastColumn="0" w:oddVBand="0" w:evenVBand="0" w:oddHBand="1" w:evenHBand="0" w:firstRowFirstColumn="0" w:firstRowLastColumn="0" w:lastRowFirstColumn="0" w:lastRowLastColumn="0"/>
+            </w:pPr>
+            <w:r>
+              <w:t># Add line to indicate the fewest # of sequences</w:t>
+            </w:r>
+          </w:p>
+          <w:p>
+            <w:pPr>
+              <w:cnfStyle w:val="000000100000" w:firstRow="0" w:lastRow="0" w:firstColumn="0" w:lastColumn="0" w:oddVBand="0" w:evenVBand="0" w:oddHBand="1" w:evenHBand="0" w:firstRowFirstColumn="0" w:firstRowLastColumn="0" w:lastRowFirstColumn="0" w:lastRowLastColumn="0"/>
+            </w:pPr>
+            <w:proofErr w:type="spellStart"/>
+            <w:r>
+              <w:t>abline</w:t>
+            </w:r>
+            <w:proofErr w:type="spellEnd"/>
+            <w:r>
+              <w:t>(v=(min(</w:t>
+            </w:r>
+            <w:proofErr w:type="spellStart"/>
+            <w:r>
+              <w:t>rowSums</w:t>
+            </w:r>
+            <w:proofErr w:type="spellEnd"/>
+            <w:r>
+              <w:t>(t(</w:t>
+            </w:r>
+            <w:proofErr w:type="spellStart"/>
+            <w:r>
+              <w:t>count_table_clean</w:t>
+            </w:r>
+            <w:proofErr w:type="spellEnd"/>
+            <w:r>
+              <w:t>)))))</w:t>
+            </w:r>
+          </w:p>
+          <w:p>
+            <w:pPr>
+              <w:cnfStyle w:val="000000100000" w:firstRow="0" w:lastRow="0" w:firstColumn="0" w:lastColumn="0" w:oddVBand="0" w:evenVBand="0" w:oddHBand="1" w:evenHBand="0" w:firstRowFirstColumn="0" w:firstRowLastColumn="0" w:lastRowFirstColumn="0" w:lastRowLastColumn="0"/>
+            </w:pPr>
+            <w:proofErr w:type="spellStart"/>
+            <w:proofErr w:type="gramStart"/>
+            <w:r>
+              <w:t>dev.off</w:t>
+            </w:r>
+            <w:proofErr w:type="spellEnd"/>
+            <w:r>
+              <w:t>(</w:t>
+            </w:r>
+            <w:proofErr w:type="gramEnd"/>
+            <w:r>
+              <w:t>)</w:t>
+            </w:r>
+          </w:p>
+        </w:tc>
+      </w:tr>
+      <w:tr>
+        <w:tc>
+          <w:tcPr>
+            <w:cnfStyle w:val="001000000000" w:firstRow="0" w:lastRow="0" w:firstColumn="1" w:lastColumn="0" w:oddVBand="0" w:evenVBand="0" w:oddHBand="0" w:evenHBand="0" w:firstRowFirstColumn="0" w:firstRowLastColumn="0" w:lastRowFirstColumn="0" w:lastRowLastColumn="0"/>
+            <w:tcW w:w="3767" w:type="dxa"/>
+          </w:tcPr>
+          <w:p>
+            <w:r>
+              <w:t xml:space="preserve">Convert the count table with contaminants removed to a </w:t>
+            </w:r>
+            <w:proofErr w:type="spellStart"/>
+            <w:r>
+              <w:t>phyloseq</w:t>
+            </w:r>
+            <w:proofErr w:type="spellEnd"/>
+            <w:r>
+              <w:t xml:space="preserve"> object.</w:t>
+            </w:r>
+          </w:p>
+        </w:tc>
+        <w:tc>
+          <w:tcPr>
+            <w:tcW w:w="6681" w:type="dxa"/>
+          </w:tcPr>
+          <w:p>
+            <w:pPr>
+              <w:cnfStyle w:val="000000000000" w:firstRow="0" w:lastRow="0" w:firstColumn="0" w:lastColumn="0" w:oddVBand="0" w:evenVBand="0" w:oddHBand="0" w:evenHBand="0" w:firstRowFirstColumn="0" w:firstRowLastColumn="0" w:lastRowFirstColumn="0" w:lastRowLastColumn="0"/>
+            </w:pPr>
+            <w:proofErr w:type="spellStart"/>
+            <w:r>
+              <w:t>Otu_table</w:t>
+            </w:r>
+            <w:proofErr w:type="spellEnd"/>
+            <w:r>
+              <w:t xml:space="preserve"> uses the </w:t>
+            </w:r>
+            <w:proofErr w:type="spellStart"/>
+            <w:r>
+              <w:t>phyloseq</w:t>
+            </w:r>
+            <w:proofErr w:type="spellEnd"/>
+            <w:r>
+              <w:t xml:space="preserve"> package. This function </w:t>
+            </w:r>
+            <w:r>
+              <w:t>construct</w:t>
+            </w:r>
+            <w:r>
+              <w:t>s</w:t>
+            </w:r>
+            <w:r>
+              <w:t xml:space="preserve"> and</w:t>
+            </w:r>
+            <w:r>
+              <w:t>/or</w:t>
+            </w:r>
+            <w:r>
+              <w:t xml:space="preserve"> access</w:t>
+            </w:r>
+            <w:r>
+              <w:t>es</w:t>
+            </w:r>
+            <w:r>
+              <w:t xml:space="preserve"> Operational Taxonomic Unit (OTU) abundance (</w:t>
+            </w:r>
+            <w:proofErr w:type="spellStart"/>
+            <w:r>
+              <w:t>otu_table</w:t>
+            </w:r>
+            <w:proofErr w:type="spellEnd"/>
+            <w:r>
+              <w:t>-class) objects.</w:t>
+            </w:r>
+            <w:r>
+              <w:t xml:space="preserve"> Because we told R that the first column in the count table was the row names earlier, it’s easier to convert it to a </w:t>
+            </w:r>
+            <w:proofErr w:type="spellStart"/>
+            <w:r>
+              <w:t>phyloseq</w:t>
+            </w:r>
+            <w:proofErr w:type="spellEnd"/>
+            <w:r>
+              <w:t xml:space="preserve"> object here.</w:t>
+            </w:r>
+          </w:p>
+        </w:tc>
+        <w:tc>
+          <w:tcPr>
+            <w:tcW w:w="4950" w:type="dxa"/>
+          </w:tcPr>
+          <w:p>
+            <w:pPr>
+              <w:cnfStyle w:val="000000000000" w:firstRow="0" w:lastRow="0" w:firstColumn="0" w:lastColumn="0" w:oddVBand="0" w:evenVBand="0" w:oddHBand="0" w:evenHBand="0" w:firstRowFirstColumn="0" w:firstRowLastColumn="0" w:lastRowFirstColumn="0" w:lastRowLastColumn="0"/>
+            </w:pPr>
+            <w:proofErr w:type="spellStart"/>
+            <w:r>
+              <w:t>count_table_no_contam_phyloseq</w:t>
+            </w:r>
+            <w:proofErr w:type="spellEnd"/>
+            <w:r>
+              <w:t xml:space="preserve"> &lt;- </w:t>
+            </w:r>
+            <w:proofErr w:type="spellStart"/>
+            <w:r>
+              <w:t>otu_</w:t>
+            </w:r>
+            <w:proofErr w:type="gramStart"/>
+            <w:r>
+              <w:t>table</w:t>
+            </w:r>
+            <w:proofErr w:type="spellEnd"/>
+            <w:r>
+              <w:t>(</w:t>
+            </w:r>
+            <w:proofErr w:type="spellStart"/>
+            <w:proofErr w:type="gramEnd"/>
+            <w:r>
+              <w:t>count_table_clean</w:t>
+            </w:r>
+            <w:proofErr w:type="spellEnd"/>
+            <w:r>
+              <w:t xml:space="preserve">, </w:t>
+            </w:r>
+            <w:proofErr w:type="spellStart"/>
+            <w:r>
+              <w:t>taxa_are_rows</w:t>
+            </w:r>
+            <w:proofErr w:type="spellEnd"/>
+            <w:r>
+              <w:t xml:space="preserve"> = TRUE)</w:t>
+            </w:r>
+          </w:p>
+        </w:tc>
+      </w:tr>
+      <w:tr>
+        <w:trPr>
+          <w:cnfStyle w:val="000000100000" w:firstRow="0" w:lastRow="0" w:firstColumn="0" w:lastColumn="0" w:oddVBand="0" w:evenVBand="0" w:oddHBand="1" w:evenHBand="0" w:firstRowFirstColumn="0" w:firstRowLastColumn="0" w:lastRowFirstColumn="0" w:lastRowLastColumn="0"/>
+        </w:trPr>
+        <w:tc>
+          <w:tcPr>
+            <w:cnfStyle w:val="001000000000" w:firstRow="0" w:lastRow="0" w:firstColumn="1" w:lastColumn="0" w:oddVBand="0" w:evenVBand="0" w:oddHBand="0" w:evenHBand="0" w:firstRowFirstColumn="0" w:firstRowLastColumn="0" w:lastRowFirstColumn="0" w:lastRowLastColumn="0"/>
+            <w:tcW w:w="3767" w:type="dxa"/>
+          </w:tcPr>
+          <w:p>
+            <w:r>
+              <w:t>Filter out ASVs that have an abundance of 1 (i.e. singletons)</w:t>
+            </w:r>
+          </w:p>
+        </w:tc>
+        <w:tc>
+          <w:tcPr>
+            <w:tcW w:w="6681" w:type="dxa"/>
+          </w:tcPr>
+          <w:p>
+            <w:pPr>
+              <w:cnfStyle w:val="000000100000" w:firstRow="0" w:lastRow="0" w:firstColumn="0" w:lastColumn="0" w:oddVBand="0" w:evenVBand="0" w:oddHBand="1" w:evenHBand="0" w:firstRowFirstColumn="0" w:firstRowLastColumn="0" w:lastRowFirstColumn="0" w:lastRowLastColumn="0"/>
+            </w:pPr>
+            <w:proofErr w:type="spellStart"/>
+            <w:r>
+              <w:t>Prune_taxa</w:t>
+            </w:r>
+            <w:proofErr w:type="spellEnd"/>
+            <w:r>
+              <w:t xml:space="preserve"> is from the </w:t>
+            </w:r>
+            <w:proofErr w:type="spellStart"/>
+            <w:r>
+              <w:t>phyloseq</w:t>
+            </w:r>
+            <w:proofErr w:type="spellEnd"/>
+            <w:r>
+              <w:t xml:space="preserve"> package.</w:t>
+            </w:r>
+            <w:r>
+              <w:t xml:space="preserve"> We also might want to avoid this step when it comes to carrying out the analysis for rare taxa. Singletons are removed as they are assumed to play no ecological role.</w:t>
+            </w:r>
+          </w:p>
+        </w:tc>
+        <w:tc>
+          <w:tcPr>
+            <w:tcW w:w="4950" w:type="dxa"/>
+          </w:tcPr>
+          <w:p>
+            <w:pPr>
+              <w:cnfStyle w:val="000000100000" w:firstRow="0" w:lastRow="0" w:firstColumn="0" w:lastColumn="0" w:oddVBand="0" w:evenVBand="0" w:oddHBand="1" w:evenHBand="0" w:firstRowFirstColumn="0" w:firstRowLastColumn="0" w:lastRowFirstColumn="0" w:lastRowLastColumn="0"/>
+            </w:pPr>
+            <w:proofErr w:type="spellStart"/>
+            <w:r>
+              <w:t>count_table_no_contam_no_singletons_phyloseq</w:t>
+            </w:r>
+            <w:proofErr w:type="spellEnd"/>
+            <w:r>
+              <w:t xml:space="preserve"> &lt;- </w:t>
+            </w:r>
+            <w:proofErr w:type="spellStart"/>
+            <w:r>
+              <w:t>prune_taxa</w:t>
+            </w:r>
+            <w:proofErr w:type="spellEnd"/>
+            <w:r>
+              <w:t>(</w:t>
+            </w:r>
+            <w:proofErr w:type="spellStart"/>
+            <w:r>
+              <w:t>taxa_sums</w:t>
+            </w:r>
+            <w:proofErr w:type="spellEnd"/>
+            <w:r>
+              <w:t>(</w:t>
+            </w:r>
+            <w:proofErr w:type="spellStart"/>
+            <w:r>
+              <w:t>count_table_no_contam_phyloseq</w:t>
+            </w:r>
+            <w:proofErr w:type="spellEnd"/>
+            <w:r>
+              <w:t xml:space="preserve">) &gt; 1, </w:t>
+            </w:r>
+            <w:proofErr w:type="spellStart"/>
+            <w:r>
+              <w:t>count_table_no_contam_phyloseq</w:t>
+            </w:r>
+            <w:proofErr w:type="spellEnd"/>
+            <w:r>
+              <w:t>)</w:t>
+            </w:r>
+          </w:p>
+        </w:tc>
+      </w:tr>
+      <w:tr>
+        <w:tc>
+          <w:tcPr>
+            <w:cnfStyle w:val="001000000000" w:firstRow="0" w:lastRow="0" w:firstColumn="1" w:lastColumn="0" w:oddVBand="0" w:evenVBand="0" w:oddHBand="0" w:evenHBand="0" w:firstRowFirstColumn="0" w:firstRowLastColumn="0" w:lastRowFirstColumn="0" w:lastRowLastColumn="0"/>
+            <w:tcW w:w="3767" w:type="dxa"/>
+          </w:tcPr>
+          <w:p>
+            <w:r>
+              <w:t>Remove singletons from the taxonomy table.</w:t>
+            </w:r>
+          </w:p>
+        </w:tc>
+        <w:tc>
+          <w:tcPr>
+            <w:tcW w:w="6681" w:type="dxa"/>
+          </w:tcPr>
+          <w:p>
+            <w:pPr>
+              <w:cnfStyle w:val="000000000000" w:firstRow="0" w:lastRow="0" w:firstColumn="0" w:lastColumn="0" w:oddVBand="0" w:evenVBand="0" w:oddHBand="0" w:evenHBand="0" w:firstRowFirstColumn="0" w:firstRowLastColumn="0" w:lastRowFirstColumn="0" w:lastRowLastColumn="0"/>
+            </w:pPr>
+            <w:proofErr w:type="gramStart"/>
+            <w:r>
+              <w:t>So</w:t>
+            </w:r>
+            <w:proofErr w:type="gramEnd"/>
+            <w:r>
+              <w:t xml:space="preserve"> the taxonomy table ASVs will match the count table ASVs.</w:t>
+            </w:r>
+          </w:p>
+        </w:tc>
+        <w:tc>
+          <w:tcPr>
+            <w:tcW w:w="4950" w:type="dxa"/>
+          </w:tcPr>
+          <w:p>
+            <w:pPr>
+              <w:cnfStyle w:val="000000000000" w:firstRow="0" w:lastRow="0" w:firstColumn="0" w:lastColumn="0" w:oddVBand="0" w:evenVBand="0" w:oddHBand="0" w:evenHBand="0" w:firstRowFirstColumn="0" w:firstRowLastColumn="0" w:lastRowFirstColumn="0" w:lastRowLastColumn="0"/>
+            </w:pPr>
+            <w:proofErr w:type="spellStart"/>
+            <w:r>
+              <w:t>count_table_no_contam_no_singletons</w:t>
+            </w:r>
+            <w:proofErr w:type="spellEnd"/>
+            <w:r>
+              <w:t xml:space="preserve"> &lt;- </w:t>
+            </w:r>
+            <w:proofErr w:type="gramStart"/>
+            <w:r>
+              <w:t>filter(</w:t>
+            </w:r>
+            <w:proofErr w:type="spellStart"/>
+            <w:proofErr w:type="gramEnd"/>
+            <w:r>
+              <w:t>count_table_clean</w:t>
+            </w:r>
+            <w:proofErr w:type="spellEnd"/>
+            <w:r>
+              <w:t xml:space="preserve">, </w:t>
+            </w:r>
+            <w:proofErr w:type="spellStart"/>
+            <w:r>
+              <w:t>rowSums</w:t>
+            </w:r>
+            <w:proofErr w:type="spellEnd"/>
+            <w:r>
+              <w:t>(</w:t>
+            </w:r>
+            <w:proofErr w:type="spellStart"/>
+            <w:r>
+              <w:t>count_table_clean</w:t>
+            </w:r>
+            <w:proofErr w:type="spellEnd"/>
+            <w:r>
+              <w:t>)&gt;1)</w:t>
+            </w:r>
+          </w:p>
+          <w:p>
+            <w:pPr>
+              <w:cnfStyle w:val="000000000000" w:firstRow="0" w:lastRow="0" w:firstColumn="0" w:lastColumn="0" w:oddVBand="0" w:evenVBand="0" w:oddHBand="0" w:evenHBand="0" w:firstRowFirstColumn="0" w:firstRowLastColumn="0" w:lastRowFirstColumn="0" w:lastRowLastColumn="0"/>
+            </w:pPr>
+          </w:p>
+          <w:p>
+            <w:pPr>
+              <w:cnfStyle w:val="000000000000" w:firstRow="0" w:lastRow="0" w:firstColumn="0" w:lastColumn="0" w:oddVBand="0" w:evenVBand="0" w:oddHBand="0" w:evenHBand="0" w:firstRowFirstColumn="0" w:firstRowLastColumn="0" w:lastRowFirstColumn="0" w:lastRowLastColumn="0"/>
+            </w:pPr>
+            <w:proofErr w:type="spellStart"/>
+            <w:r>
+              <w:t>taxonomy_no_contam_no_singletons</w:t>
+            </w:r>
+            <w:proofErr w:type="spellEnd"/>
+            <w:r>
+              <w:t xml:space="preserve"> &lt;- </w:t>
+            </w:r>
+            <w:proofErr w:type="gramStart"/>
+            <w:r>
+              <w:t>subset(</w:t>
+            </w:r>
+            <w:proofErr w:type="spellStart"/>
+            <w:proofErr w:type="gramEnd"/>
+            <w:r>
+              <w:t>taxonomy_clean</w:t>
+            </w:r>
+            <w:proofErr w:type="spellEnd"/>
+            <w:r>
+              <w:t xml:space="preserve">, `Feature ID` %in% </w:t>
+            </w:r>
+            <w:proofErr w:type="spellStart"/>
+            <w:r>
+              <w:t>row.names</w:t>
+            </w:r>
+            <w:proofErr w:type="spellEnd"/>
+            <w:r>
+              <w:t>(</w:t>
+            </w:r>
+            <w:proofErr w:type="spellStart"/>
+            <w:r>
+              <w:t>count_table_no_contam_no_singletons</w:t>
+            </w:r>
+            <w:proofErr w:type="spellEnd"/>
+            <w:r>
+              <w:t>))</w:t>
+            </w:r>
+          </w:p>
+        </w:tc>
+      </w:tr>
+      <w:tr>
+        <w:trPr>
+          <w:cnfStyle w:val="000000100000" w:firstRow="0" w:lastRow="0" w:firstColumn="0" w:lastColumn="0" w:oddVBand="0" w:evenVBand="0" w:oddHBand="1" w:evenHBand="0" w:firstRowFirstColumn="0" w:firstRowLastColumn="0" w:lastRowFirstColumn="0" w:lastRowLastColumn="0"/>
+        </w:trPr>
+        <w:tc>
+          <w:tcPr>
+            <w:cnfStyle w:val="001000000000" w:firstRow="0" w:lastRow="0" w:firstColumn="1" w:lastColumn="0" w:oddVBand="0" w:evenVBand="0" w:oddHBand="0" w:evenHBand="0" w:firstRowFirstColumn="0" w:firstRowLastColumn="0" w:lastRowFirstColumn="0" w:lastRowLastColumn="0"/>
+            <w:tcW w:w="3767" w:type="dxa"/>
+          </w:tcPr>
+          <w:p>
+            <w:r>
+              <w:t>Modify the taxonomy table.</w:t>
+            </w:r>
+          </w:p>
+        </w:tc>
+        <w:tc>
+          <w:tcPr>
+            <w:tcW w:w="6681" w:type="dxa"/>
+          </w:tcPr>
+          <w:p>
+            <w:pPr>
+              <w:cnfStyle w:val="000000100000" w:firstRow="0" w:lastRow="0" w:firstColumn="0" w:lastColumn="0" w:oddVBand="0" w:evenVBand="0" w:oddHBand="1" w:evenHBand="0" w:firstRowFirstColumn="0" w:firstRowLastColumn="0" w:lastRowFirstColumn="0" w:lastRowLastColumn="0"/>
+            </w:pPr>
+            <w:r>
+              <w:t>By separating the levels of taxonomy it’s easier to use this in downstream analyses.</w:t>
+            </w:r>
+          </w:p>
+        </w:tc>
+        <w:tc>
+          <w:tcPr>
+            <w:tcW w:w="4950" w:type="dxa"/>
+          </w:tcPr>
+          <w:p>
+            <w:pPr>
+              <w:cnfStyle w:val="000000100000" w:firstRow="0" w:lastRow="0" w:firstColumn="0" w:lastColumn="0" w:oddVBand="0" w:evenVBand="0" w:oddHBand="1" w:evenHBand="0" w:firstRowFirstColumn="0" w:firstRowLastColumn="0" w:lastRowFirstColumn="0" w:lastRowLastColumn="0"/>
+            </w:pPr>
+            <w:r>
+              <w:t xml:space="preserve">taxonomy &lt;- </w:t>
+            </w:r>
+            <w:proofErr w:type="spellStart"/>
+            <w:r>
+              <w:t>taxonomy_no_contam_no_singletons</w:t>
+            </w:r>
+            <w:proofErr w:type="spellEnd"/>
+            <w:r>
+              <w:t xml:space="preserve"> %&gt;%</w:t>
+            </w:r>
+          </w:p>
+          <w:p>
+            <w:pPr>
+              <w:cnfStyle w:val="000000100000" w:firstRow="0" w:lastRow="0" w:firstColumn="0" w:lastColumn="0" w:oddVBand="0" w:evenVBand="0" w:oddHBand="1" w:evenHBand="0" w:firstRowFirstColumn="0" w:firstRowLastColumn="0" w:lastRowFirstColumn="0" w:lastRowLastColumn="0"/>
+            </w:pPr>
+            <w:r>
+              <w:t xml:space="preserve">  </w:t>
+            </w:r>
+            <w:proofErr w:type="gramStart"/>
+            <w:r>
+              <w:t>mutate(</w:t>
+            </w:r>
+            <w:proofErr w:type="gramEnd"/>
+            <w:r>
+              <w:t>taxonomy=</w:t>
+            </w:r>
+            <w:proofErr w:type="spellStart"/>
+            <w:r>
+              <w:t>str_replace_all</w:t>
+            </w:r>
+            <w:proofErr w:type="spellEnd"/>
+            <w:r>
+              <w:t>(string=Taxon, pattern="D_\\d*\\__", replacement="")) %&gt;%</w:t>
+            </w:r>
+          </w:p>
+          <w:p>
+            <w:pPr>
+              <w:cnfStyle w:val="000000100000" w:firstRow="0" w:lastRow="0" w:firstColumn="0" w:lastColumn="0" w:oddVBand="0" w:evenVBand="0" w:oddHBand="1" w:evenHBand="0" w:firstRowFirstColumn="0" w:firstRowLastColumn="0" w:lastRowFirstColumn="0" w:lastRowLastColumn="0"/>
+            </w:pPr>
+            <w:r>
+              <w:lastRenderedPageBreak/>
+              <w:t xml:space="preserve">  </w:t>
+            </w:r>
+            <w:proofErr w:type="gramStart"/>
+            <w:r>
+              <w:t>mutate(</w:t>
+            </w:r>
+            <w:proofErr w:type="gramEnd"/>
+            <w:r>
+              <w:t>taxonomy=</w:t>
+            </w:r>
+            <w:proofErr w:type="spellStart"/>
+            <w:r>
+              <w:t>str_replace_all</w:t>
+            </w:r>
+            <w:proofErr w:type="spellEnd"/>
+            <w:r>
+              <w:t>(string=taxonomy, pattern=";$", replacement="")) %&gt;%</w:t>
+            </w:r>
+          </w:p>
+          <w:p>
+            <w:pPr>
+              <w:cnfStyle w:val="000000100000" w:firstRow="0" w:lastRow="0" w:firstColumn="0" w:lastColumn="0" w:oddVBand="0" w:evenVBand="0" w:oddHBand="1" w:evenHBand="0" w:firstRowFirstColumn="0" w:firstRowLastColumn="0" w:lastRowFirstColumn="0" w:lastRowLastColumn="0"/>
+            </w:pPr>
+            <w:proofErr w:type="gramStart"/>
+            <w:r>
+              <w:t>separate(</w:t>
+            </w:r>
+            <w:proofErr w:type="gramEnd"/>
+            <w:r>
+              <w:t xml:space="preserve">taxonomy, into=c("Kingdom", "Phylum", "Class", "Order", "Family", "Genus", "Species"), </w:t>
+            </w:r>
+            <w:proofErr w:type="spellStart"/>
+            <w:r>
+              <w:t>sep</w:t>
+            </w:r>
+            <w:proofErr w:type="spellEnd"/>
+            <w:r>
+              <w:t>=";") %&gt;%</w:t>
+            </w:r>
+          </w:p>
+          <w:p>
+            <w:pPr>
+              <w:cnfStyle w:val="000000100000" w:firstRow="0" w:lastRow="0" w:firstColumn="0" w:lastColumn="0" w:oddVBand="0" w:evenVBand="0" w:oddHBand="1" w:evenHBand="0" w:firstRowFirstColumn="0" w:firstRowLastColumn="0" w:lastRowFirstColumn="0" w:lastRowLastColumn="0"/>
+            </w:pPr>
+            <w:r>
+              <w:t xml:space="preserve">  </w:t>
+            </w:r>
+            <w:proofErr w:type="gramStart"/>
+            <w:r>
+              <w:t>select(</w:t>
+            </w:r>
+            <w:proofErr w:type="gramEnd"/>
+            <w:r>
+              <w:t>-Taxon, -Confidence) %&gt;%</w:t>
+            </w:r>
+          </w:p>
+          <w:p>
+            <w:pPr>
+              <w:cnfStyle w:val="000000100000" w:firstRow="0" w:lastRow="0" w:firstColumn="0" w:lastColumn="0" w:oddVBand="0" w:evenVBand="0" w:oddHBand="1" w:evenHBand="0" w:firstRowFirstColumn="0" w:firstRowLastColumn="0" w:lastRowFirstColumn="0" w:lastRowLastColumn="0"/>
+            </w:pPr>
+            <w:r>
+              <w:t xml:space="preserve">  </w:t>
+            </w:r>
+            <w:proofErr w:type="spellStart"/>
+            <w:r>
+              <w:t>column_to_</w:t>
+            </w:r>
+            <w:proofErr w:type="gramStart"/>
+            <w:r>
+              <w:t>rownames</w:t>
+            </w:r>
+            <w:proofErr w:type="spellEnd"/>
+            <w:r>
+              <w:t>(</w:t>
+            </w:r>
+            <w:proofErr w:type="spellStart"/>
+            <w:proofErr w:type="gramEnd"/>
+            <w:r>
+              <w:t>var</w:t>
+            </w:r>
+            <w:proofErr w:type="spellEnd"/>
+            <w:r>
+              <w:t>='Feature ID')</w:t>
+            </w:r>
+          </w:p>
+          <w:p>
+            <w:pPr>
+              <w:cnfStyle w:val="000000100000" w:firstRow="0" w:lastRow="0" w:firstColumn="0" w:lastColumn="0" w:oddVBand="0" w:evenVBand="0" w:oddHBand="1" w:evenHBand="0" w:firstRowFirstColumn="0" w:firstRowLastColumn="0" w:lastRowFirstColumn="0" w:lastRowLastColumn="0"/>
+            </w:pPr>
+          </w:p>
+          <w:p>
+            <w:pPr>
+              <w:cnfStyle w:val="000000100000" w:firstRow="0" w:lastRow="0" w:firstColumn="0" w:lastColumn="0" w:oddVBand="0" w:evenVBand="0" w:oddHBand="1" w:evenHBand="0" w:firstRowFirstColumn="0" w:firstRowLastColumn="0" w:lastRowFirstColumn="0" w:lastRowLastColumn="0"/>
+            </w:pPr>
+            <w:proofErr w:type="spellStart"/>
+            <w:r>
+              <w:t>rownames</w:t>
+            </w:r>
+            <w:proofErr w:type="spellEnd"/>
+            <w:r>
+              <w:t xml:space="preserve">(taxonomy) &lt;- </w:t>
+            </w:r>
+            <w:proofErr w:type="spellStart"/>
+            <w:r>
+              <w:t>rownames</w:t>
+            </w:r>
+            <w:proofErr w:type="spellEnd"/>
+            <w:r>
+              <w:t>(</w:t>
+            </w:r>
+            <w:proofErr w:type="spellStart"/>
+            <w:r>
+              <w:t>count_table_no_contam_no_singletons</w:t>
+            </w:r>
+            <w:proofErr w:type="spellEnd"/>
+            <w:r>
+              <w:t>)</w:t>
+            </w:r>
+          </w:p>
+        </w:tc>
+      </w:tr>
+      <w:tr>
+        <w:tc>
+          <w:tcPr>
+            <w:cnfStyle w:val="001000000000" w:firstRow="0" w:lastRow="0" w:firstColumn="1" w:lastColumn="0" w:oddVBand="0" w:evenVBand="0" w:oddHBand="0" w:evenHBand="0" w:firstRowFirstColumn="0" w:firstRowLastColumn="0" w:lastRowFirstColumn="0" w:lastRowLastColumn="0"/>
+            <w:tcW w:w="3767" w:type="dxa"/>
+          </w:tcPr>
+          <w:p>
+            <w:r>
+              <w:lastRenderedPageBreak/>
+              <w:t>Perform Hellinger transformation of the count data.</w:t>
+            </w:r>
+          </w:p>
+        </w:tc>
+        <w:tc>
+          <w:tcPr>
+            <w:tcW w:w="6681" w:type="dxa"/>
+          </w:tcPr>
+          <w:p>
+            <w:pPr>
+              <w:cnfStyle w:val="000000000000" w:firstRow="0" w:lastRow="0" w:firstColumn="0" w:lastColumn="0" w:oddVBand="0" w:evenVBand="0" w:oddHBand="0" w:evenHBand="0" w:firstRowFirstColumn="0" w:firstRowLastColumn="0" w:lastRowFirstColumn="0" w:lastRowLastColumn="0"/>
+            </w:pPr>
+            <w:r>
+              <w:t xml:space="preserve">As ecological data are often not normally distributed, it is necessary to transform them for use in further statistical analyses such as principal components analysis (PCA) and redundancy analysis (RDA). </w:t>
+            </w:r>
+            <w:r>
+              <w:t xml:space="preserve">These analyses use simple Euclidean distances in their ordinations which are often not appropriate for count data. Hence, these transformations may improve the effectiveness of many analyses in representing ecological relationships. </w:t>
+            </w:r>
+            <w:r>
+              <w:t>Hellinger is p</w:t>
+            </w:r>
+            <w:r>
+              <w:t xml:space="preserve">articularly suited to species abundance </w:t>
+            </w:r>
+            <w:proofErr w:type="gramStart"/>
+            <w:r>
+              <w:t>data,</w:t>
+            </w:r>
+            <w:proofErr w:type="gramEnd"/>
+            <w:r>
+              <w:t xml:space="preserve"> this transformation gives low weights to variables with low counts and many zeros. The transformation itself comprises dividing each value in a data matrix by its row sum, and taking the square root of the quotient.</w:t>
+            </w:r>
+            <w:r>
+              <w:t xml:space="preserve"> The </w:t>
+            </w:r>
+            <w:proofErr w:type="spellStart"/>
+            <w:r>
+              <w:t>decostand</w:t>
+            </w:r>
+            <w:proofErr w:type="spellEnd"/>
+            <w:r>
+              <w:t xml:space="preserve"> function is from the vegan package.</w:t>
+            </w:r>
+          </w:p>
+        </w:tc>
+        <w:tc>
+          <w:tcPr>
+            <w:tcW w:w="4950" w:type="dxa"/>
+          </w:tcPr>
+          <w:p>
+            <w:pPr>
+              <w:cnfStyle w:val="000000000000" w:firstRow="0" w:lastRow="0" w:firstColumn="0" w:lastColumn="0" w:oddVBand="0" w:evenVBand="0" w:oddHBand="0" w:evenHBand="0" w:firstRowFirstColumn="0" w:firstRowLastColumn="0" w:lastRowFirstColumn="0" w:lastRowLastColumn="0"/>
+            </w:pPr>
+            <w:proofErr w:type="spellStart"/>
+            <w:r>
+              <w:t>count_table_hellinger</w:t>
+            </w:r>
+            <w:proofErr w:type="spellEnd"/>
+            <w:r>
+              <w:t xml:space="preserve"> &lt;- </w:t>
+            </w:r>
+            <w:proofErr w:type="spellStart"/>
+            <w:r>
+              <w:t>decostand</w:t>
+            </w:r>
+            <w:proofErr w:type="spellEnd"/>
+            <w:r>
+              <w:t>(t(</w:t>
+            </w:r>
+            <w:proofErr w:type="spellStart"/>
+            <w:r>
+              <w:t>count_table_no_contam_no_singletons</w:t>
+            </w:r>
+            <w:proofErr w:type="spellEnd"/>
+            <w:r>
+              <w:t>), "</w:t>
+            </w:r>
+            <w:proofErr w:type="spellStart"/>
+            <w:r>
+              <w:t>hellinger</w:t>
+            </w:r>
+            <w:proofErr w:type="spellEnd"/>
+            <w:r>
+              <w:t>")</w:t>
+            </w:r>
+          </w:p>
+        </w:tc>
+      </w:tr>
+      <w:tr>
+        <w:trPr>
+          <w:cnfStyle w:val="000000100000" w:firstRow="0" w:lastRow="0" w:firstColumn="0" w:lastColumn="0" w:oddVBand="0" w:evenVBand="0" w:oddHBand="1" w:evenHBand="0" w:firstRowFirstColumn="0" w:firstRowLastColumn="0" w:lastRowFirstColumn="0" w:lastRowLastColumn="0"/>
+        </w:trPr>
+        <w:tc>
+          <w:tcPr>
+            <w:cnfStyle w:val="001000000000" w:firstRow="0" w:lastRow="0" w:firstColumn="1" w:lastColumn="0" w:oddVBand="0" w:evenVBand="0" w:oddHBand="0" w:evenHBand="0" w:firstRowFirstColumn="0" w:firstRowLastColumn="0" w:lastRowFirstColumn="0" w:lastRowLastColumn="0"/>
+            <w:tcW w:w="3767" w:type="dxa"/>
+          </w:tcPr>
+          <w:p>
+            <w:r>
+              <w:t xml:space="preserve">Convert the transformed data to a </w:t>
+            </w:r>
+            <w:proofErr w:type="spellStart"/>
+            <w:r>
+              <w:t>tibble</w:t>
+            </w:r>
+            <w:proofErr w:type="spellEnd"/>
+            <w:r>
+              <w:t>.</w:t>
+            </w:r>
+          </w:p>
+        </w:tc>
+        <w:tc>
+          <w:tcPr>
+            <w:tcW w:w="6681" w:type="dxa"/>
+          </w:tcPr>
+          <w:p>
+            <w:pPr>
+              <w:cnfStyle w:val="000000100000" w:firstRow="0" w:lastRow="0" w:firstColumn="0" w:lastColumn="0" w:oddVBand="0" w:evenVBand="0" w:oddHBand="1" w:evenHBand="0" w:firstRowFirstColumn="0" w:firstRowLastColumn="0" w:lastRowFirstColumn="0" w:lastRowLastColumn="0"/>
+            </w:pPr>
+            <w:r>
+              <w:t xml:space="preserve">There are two main differences in the usage of a data frame vs a </w:t>
+            </w:r>
+            <w:proofErr w:type="spellStart"/>
+            <w:r>
+              <w:t>tibble</w:t>
+            </w:r>
+            <w:proofErr w:type="spellEnd"/>
+            <w:r>
+              <w:t xml:space="preserve">: printing, and </w:t>
+            </w:r>
+            <w:proofErr w:type="spellStart"/>
+            <w:r>
+              <w:t>subsetting</w:t>
+            </w:r>
+            <w:proofErr w:type="spellEnd"/>
+            <w:r>
+              <w:t>. Tibbles have a refined print method that shows only the first 10 rows, and all the columns that fit on screen. This makes it much easier to work with large data.</w:t>
+            </w:r>
+            <w:r>
+              <w:t xml:space="preserve"> Tibble basically looks better but is very similar to an R </w:t>
+            </w:r>
+            <w:proofErr w:type="spellStart"/>
+            <w:r>
+              <w:t>dataframe</w:t>
+            </w:r>
+            <w:proofErr w:type="spellEnd"/>
+            <w:r>
+              <w:t xml:space="preserve">. </w:t>
+            </w:r>
+            <w:proofErr w:type="spellStart"/>
+            <w:r>
+              <w:t>As_tibble</w:t>
+            </w:r>
+            <w:proofErr w:type="spellEnd"/>
+            <w:r>
+              <w:t xml:space="preserve"> is from the </w:t>
+            </w:r>
+            <w:proofErr w:type="spellStart"/>
+            <w:r>
+              <w:t>tidyverse</w:t>
+            </w:r>
+            <w:proofErr w:type="spellEnd"/>
+            <w:r>
+              <w:t xml:space="preserve"> package.</w:t>
+            </w:r>
+          </w:p>
+        </w:tc>
+        <w:tc>
+          <w:tcPr>
+            <w:tcW w:w="4950" w:type="dxa"/>
+          </w:tcPr>
+          <w:p>
+            <w:pPr>
+              <w:cnfStyle w:val="000000100000" w:firstRow="0" w:lastRow="0" w:firstColumn="0" w:lastColumn="0" w:oddVBand="0" w:evenVBand="0" w:oddHBand="1" w:evenHBand="0" w:firstRowFirstColumn="0" w:firstRowLastColumn="0" w:lastRowFirstColumn="0" w:lastRowLastColumn="0"/>
+            </w:pPr>
+            <w:proofErr w:type="spellStart"/>
+            <w:r>
+              <w:t>count_table_hellinger</w:t>
+            </w:r>
+            <w:proofErr w:type="spellEnd"/>
+            <w:r>
+              <w:t xml:space="preserve"> &lt;- </w:t>
+            </w:r>
+            <w:proofErr w:type="spellStart"/>
+            <w:r>
+              <w:t>as_tibble</w:t>
+            </w:r>
+            <w:proofErr w:type="spellEnd"/>
+            <w:r>
+              <w:t>(t(</w:t>
+            </w:r>
+            <w:proofErr w:type="spellStart"/>
+            <w:r>
+              <w:t>count_table_hellinger</w:t>
+            </w:r>
+            <w:proofErr w:type="spellEnd"/>
+            <w:r>
+              <w:t xml:space="preserve">), </w:t>
+            </w:r>
+            <w:proofErr w:type="spellStart"/>
+            <w:r>
+              <w:t>rownames</w:t>
+            </w:r>
+            <w:proofErr w:type="spellEnd"/>
+            <w:r>
+              <w:t xml:space="preserve"> = NA)</w:t>
+            </w:r>
+          </w:p>
+        </w:tc>
+      </w:tr>
+      <w:tr>
+        <w:tc>
+          <w:tcPr>
+            <w:cnfStyle w:val="001000000000" w:firstRow="0" w:lastRow="0" w:firstColumn="1" w:lastColumn="0" w:oddVBand="0" w:evenVBand="0" w:oddHBand="0" w:evenHBand="0" w:firstRowFirstColumn="0" w:firstRowLastColumn="0" w:lastRowFirstColumn="0" w:lastRowLastColumn="0"/>
+            <w:tcW w:w="3767" w:type="dxa"/>
+          </w:tcPr>
+          <w:p>
+            <w:r>
+              <w:t>Compare the transformed and untransformed data.</w:t>
+            </w:r>
+          </w:p>
+        </w:tc>
+        <w:tc>
+          <w:tcPr>
+            <w:tcW w:w="6681" w:type="dxa"/>
+          </w:tcPr>
+          <w:p>
+            <w:pPr>
+              <w:cnfStyle w:val="000000000000" w:firstRow="0" w:lastRow="0" w:firstColumn="0" w:lastColumn="0" w:oddVBand="0" w:evenVBand="0" w:oddHBand="0" w:evenHBand="0" w:firstRowFirstColumn="0" w:firstRowLastColumn="0" w:lastRowFirstColumn="0" w:lastRowLastColumn="0"/>
+            </w:pPr>
+            <w:r>
+              <w:t>Let’s look at them to see how different they are.</w:t>
+            </w:r>
+          </w:p>
+        </w:tc>
+        <w:tc>
+          <w:tcPr>
+            <w:tcW w:w="4950" w:type="dxa"/>
+          </w:tcPr>
+          <w:p>
+            <w:pPr>
+              <w:tabs>
+                <w:tab w:val="left" w:pos="1529"/>
+              </w:tabs>
+              <w:cnfStyle w:val="000000000000" w:firstRow="0" w:lastRow="0" w:firstColumn="0" w:lastColumn="0" w:oddVBand="0" w:evenVBand="0" w:oddHBand="0" w:evenHBand="0" w:firstRowFirstColumn="0" w:firstRowLastColumn="0" w:lastRowFirstColumn="0" w:lastRowLastColumn="0"/>
+            </w:pPr>
+            <w:r>
+              <w:t>head(</w:t>
+            </w:r>
+            <w:proofErr w:type="spellStart"/>
+            <w:r>
+              <w:t>count_table_no_contam_no_singletons</w:t>
+            </w:r>
+            <w:proofErr w:type="spellEnd"/>
+            <w:r>
+              <w:t xml:space="preserve">) </w:t>
+            </w:r>
+          </w:p>
+          <w:p>
+            <w:pPr>
+              <w:tabs>
+                <w:tab w:val="left" w:pos="1529"/>
+              </w:tabs>
+              <w:cnfStyle w:val="000000000000" w:firstRow="0" w:lastRow="0" w:firstColumn="0" w:lastColumn="0" w:oddVBand="0" w:evenVBand="0" w:oddHBand="0" w:evenHBand="0" w:firstRowFirstColumn="0" w:firstRowLastColumn="0" w:lastRowFirstColumn="0" w:lastRowLastColumn="0"/>
+            </w:pPr>
+            <w:r>
+              <w:t>head(</w:t>
+            </w:r>
+            <w:proofErr w:type="spellStart"/>
+            <w:r>
+              <w:t>count_table_hellinger</w:t>
+            </w:r>
+            <w:proofErr w:type="spellEnd"/>
+            <w:r>
+              <w:t>)</w:t>
+            </w:r>
+          </w:p>
+        </w:tc>
+      </w:tr>
+      <w:tr>
+        <w:trPr>
+          <w:cnfStyle w:val="000000100000" w:firstRow="0" w:lastRow="0" w:firstColumn="0" w:lastColumn="0" w:oddVBand="0" w:evenVBand="0" w:oddHBand="1" w:evenHBand="0" w:firstRowFirstColumn="0" w:firstRowLastColumn="0" w:lastRowFirstColumn="0" w:lastRowLastColumn="0"/>
+        </w:trPr>
+        <w:tc>
+          <w:tcPr>
+            <w:cnfStyle w:val="001000000000" w:firstRow="0" w:lastRow="0" w:firstColumn="1" w:lastColumn="0" w:oddVBand="0" w:evenVBand="0" w:oddHBand="0" w:evenHBand="0" w:firstRowFirstColumn="0" w:firstRowLastColumn="0" w:lastRowFirstColumn="0" w:lastRowLastColumn="0"/>
+            <w:tcW w:w="3767" w:type="dxa"/>
+          </w:tcPr>
+          <w:p>
+            <w:r>
+              <w:t xml:space="preserve">Convert the Hellinger transformed data into a </w:t>
+            </w:r>
+            <w:proofErr w:type="spellStart"/>
+            <w:r>
+              <w:t>phyloseq</w:t>
+            </w:r>
+            <w:proofErr w:type="spellEnd"/>
+            <w:r>
+              <w:t xml:space="preserve"> object.</w:t>
+            </w:r>
+          </w:p>
+        </w:tc>
+        <w:tc>
+          <w:tcPr>
+            <w:tcW w:w="6681" w:type="dxa"/>
+          </w:tcPr>
+          <w:p>
+            <w:pPr>
+              <w:cnfStyle w:val="000000100000" w:firstRow="0" w:lastRow="0" w:firstColumn="0" w:lastColumn="0" w:oddVBand="0" w:evenVBand="0" w:oddHBand="1" w:evenHBand="0" w:firstRowFirstColumn="0" w:firstRowLastColumn="0" w:lastRowFirstColumn="0" w:lastRowLastColumn="0"/>
+            </w:pPr>
+            <w:proofErr w:type="spellStart"/>
+            <w:r>
+              <w:t>Otu_table</w:t>
+            </w:r>
+            <w:proofErr w:type="spellEnd"/>
+            <w:r>
+              <w:t xml:space="preserve"> is a function of the </w:t>
+            </w:r>
+            <w:proofErr w:type="spellStart"/>
+            <w:r>
+              <w:t>phyloseq</w:t>
+            </w:r>
+            <w:proofErr w:type="spellEnd"/>
+            <w:r>
+              <w:t xml:space="preserve"> package.</w:t>
+            </w:r>
+          </w:p>
+        </w:tc>
+        <w:tc>
+          <w:tcPr>
+            <w:tcW w:w="4950" w:type="dxa"/>
+          </w:tcPr>
+          <w:p>
+            <w:pPr>
+              <w:tabs>
+                <w:tab w:val="left" w:pos="1484"/>
+              </w:tabs>
+              <w:cnfStyle w:val="000000100000" w:firstRow="0" w:lastRow="0" w:firstColumn="0" w:lastColumn="0" w:oddVBand="0" w:evenVBand="0" w:oddHBand="1" w:evenHBand="0" w:firstRowFirstColumn="0" w:firstRowLastColumn="0" w:lastRowFirstColumn="0" w:lastRowLastColumn="0"/>
+            </w:pPr>
+            <w:r>
+              <w:t xml:space="preserve">ASV = </w:t>
+            </w:r>
+            <w:proofErr w:type="spellStart"/>
+            <w:r>
+              <w:t>otu_table</w:t>
+            </w:r>
+            <w:proofErr w:type="spellEnd"/>
+            <w:r>
+              <w:t>(</w:t>
+            </w:r>
+            <w:proofErr w:type="spellStart"/>
+            <w:proofErr w:type="gramStart"/>
+            <w:r>
+              <w:t>data.frame</w:t>
+            </w:r>
+            <w:proofErr w:type="spellEnd"/>
+            <w:proofErr w:type="gramEnd"/>
+            <w:r>
+              <w:t>(</w:t>
+            </w:r>
+            <w:proofErr w:type="spellStart"/>
+            <w:r>
+              <w:t>count_table_hellinger</w:t>
+            </w:r>
+            <w:proofErr w:type="spellEnd"/>
+            <w:r>
+              <w:t xml:space="preserve">), </w:t>
+            </w:r>
+            <w:proofErr w:type="spellStart"/>
+            <w:r>
+              <w:t>taxa_are_rows</w:t>
+            </w:r>
+            <w:proofErr w:type="spellEnd"/>
+            <w:r>
+              <w:t xml:space="preserve"> = TRUE)</w:t>
+            </w:r>
+          </w:p>
+        </w:tc>
+      </w:tr>
+      <w:tr>
+        <w:tc>
+          <w:tcPr>
+            <w:cnfStyle w:val="001000000000" w:firstRow="0" w:lastRow="0" w:firstColumn="1" w:lastColumn="0" w:oddVBand="0" w:evenVBand="0" w:oddHBand="0" w:evenHBand="0" w:firstRowFirstColumn="0" w:firstRowLastColumn="0" w:lastRowFirstColumn="0" w:lastRowLastColumn="0"/>
+            <w:tcW w:w="3767" w:type="dxa"/>
+          </w:tcPr>
+          <w:p>
+            <w:r>
+              <w:t xml:space="preserve">Convert the </w:t>
+            </w:r>
+            <w:r>
+              <w:t>taxonomy table</w:t>
+            </w:r>
+            <w:r>
+              <w:t xml:space="preserve"> into a </w:t>
+            </w:r>
+            <w:proofErr w:type="spellStart"/>
+            <w:r>
+              <w:t>phyloseq</w:t>
+            </w:r>
+            <w:proofErr w:type="spellEnd"/>
+            <w:r>
+              <w:t xml:space="preserve"> object.</w:t>
+            </w:r>
+          </w:p>
+        </w:tc>
+        <w:tc>
+          <w:tcPr>
+            <w:tcW w:w="6681" w:type="dxa"/>
+          </w:tcPr>
+          <w:p>
+            <w:pPr>
+              <w:cnfStyle w:val="000000000000" w:firstRow="0" w:lastRow="0" w:firstColumn="0" w:lastColumn="0" w:oddVBand="0" w:evenVBand="0" w:oddHBand="0" w:evenHBand="0" w:firstRowFirstColumn="0" w:firstRowLastColumn="0" w:lastRowFirstColumn="0" w:lastRowLastColumn="0"/>
+            </w:pPr>
+            <w:proofErr w:type="spellStart"/>
+            <w:r>
+              <w:t>tax</w:t>
+            </w:r>
+            <w:r>
+              <w:t>_table</w:t>
+            </w:r>
+            <w:proofErr w:type="spellEnd"/>
+            <w:r>
+              <w:t xml:space="preserve"> is a function of the </w:t>
+            </w:r>
+            <w:proofErr w:type="spellStart"/>
+            <w:r>
+              <w:t>phyloseq</w:t>
+            </w:r>
+            <w:proofErr w:type="spellEnd"/>
+            <w:r>
+              <w:t xml:space="preserve"> package.</w:t>
+            </w:r>
+          </w:p>
+        </w:tc>
+        <w:tc>
+          <w:tcPr>
+            <w:tcW w:w="4950" w:type="dxa"/>
+          </w:tcPr>
+          <w:p>
+            <w:pPr>
+              <w:cnfStyle w:val="000000000000" w:firstRow="0" w:lastRow="0" w:firstColumn="0" w:lastColumn="0" w:oddVBand="0" w:evenVBand="0" w:oddHBand="0" w:evenHBand="0" w:firstRowFirstColumn="0" w:firstRowLastColumn="0" w:lastRowFirstColumn="0" w:lastRowLastColumn="0"/>
+            </w:pPr>
+            <w:r>
+              <w:t xml:space="preserve">TAX = </w:t>
+            </w:r>
+            <w:proofErr w:type="spellStart"/>
+            <w:r>
+              <w:t>tax_table</w:t>
+            </w:r>
+            <w:proofErr w:type="spellEnd"/>
+            <w:r>
+              <w:t>(</w:t>
+            </w:r>
+            <w:proofErr w:type="spellStart"/>
+            <w:proofErr w:type="gramStart"/>
+            <w:r>
+              <w:t>as.matrix</w:t>
+            </w:r>
+            <w:proofErr w:type="spellEnd"/>
+            <w:proofErr w:type="gramEnd"/>
+            <w:r>
+              <w:t>(taxonomy))</w:t>
+            </w:r>
+          </w:p>
+        </w:tc>
+      </w:tr>
+      <w:tr>
+        <w:trPr>
+          <w:cnfStyle w:val="000000100000" w:firstRow="0" w:lastRow="0" w:firstColumn="0" w:lastColumn="0" w:oddVBand="0" w:evenVBand="0" w:oddHBand="1" w:evenHBand="0" w:firstRowFirstColumn="0" w:firstRowLastColumn="0" w:lastRowFirstColumn="0" w:lastRowLastColumn="0"/>
+        </w:trPr>
+        <w:tc>
+          <w:tcPr>
+            <w:cnfStyle w:val="001000000000" w:firstRow="0" w:lastRow="0" w:firstColumn="1" w:lastColumn="0" w:oddVBand="0" w:evenVBand="0" w:oddHBand="0" w:evenHBand="0" w:firstRowFirstColumn="0" w:firstRowLastColumn="0" w:lastRowFirstColumn="0" w:lastRowLastColumn="0"/>
+            <w:tcW w:w="3767" w:type="dxa"/>
+          </w:tcPr>
+          <w:p>
+            <w:r>
+              <w:t xml:space="preserve">Convert the </w:t>
+            </w:r>
+            <w:r>
+              <w:t>metadata table</w:t>
+            </w:r>
+            <w:r>
+              <w:t xml:space="preserve"> into a </w:t>
+            </w:r>
+            <w:proofErr w:type="spellStart"/>
+            <w:r>
+              <w:t>phyloseq</w:t>
+            </w:r>
+            <w:proofErr w:type="spellEnd"/>
+            <w:r>
+              <w:t xml:space="preserve"> object.</w:t>
+            </w:r>
+          </w:p>
+        </w:tc>
+        <w:tc>
+          <w:tcPr>
+            <w:tcW w:w="6681" w:type="dxa"/>
+          </w:tcPr>
+          <w:p>
+            <w:pPr>
+              <w:cnfStyle w:val="000000100000" w:firstRow="0" w:lastRow="0" w:firstColumn="0" w:lastColumn="0" w:oddVBand="0" w:evenVBand="0" w:oddHBand="1" w:evenHBand="0" w:firstRowFirstColumn="0" w:firstRowLastColumn="0" w:lastRowFirstColumn="0" w:lastRowLastColumn="0"/>
+            </w:pPr>
+            <w:proofErr w:type="spellStart"/>
+            <w:r>
+              <w:t>Sample_data</w:t>
+            </w:r>
+            <w:proofErr w:type="spellEnd"/>
+            <w:r>
+              <w:t xml:space="preserve"> is a function of the </w:t>
+            </w:r>
+            <w:proofErr w:type="spellStart"/>
+            <w:r>
+              <w:t>phyloseq</w:t>
+            </w:r>
+            <w:proofErr w:type="spellEnd"/>
+            <w:r>
+              <w:t xml:space="preserve"> package.</w:t>
+            </w:r>
+          </w:p>
+        </w:tc>
+        <w:tc>
+          <w:tcPr>
+            <w:tcW w:w="4950" w:type="dxa"/>
+          </w:tcPr>
+          <w:p>
+            <w:pPr>
+              <w:cnfStyle w:val="000000100000" w:firstRow="0" w:lastRow="0" w:firstColumn="0" w:lastColumn="0" w:oddVBand="0" w:evenVBand="0" w:oddHBand="1" w:evenHBand="0" w:firstRowFirstColumn="0" w:firstRowLastColumn="0" w:lastRowFirstColumn="0" w:lastRowLastColumn="0"/>
+            </w:pPr>
+            <w:r>
+              <w:t>META</w:t>
+            </w:r>
+            <w:r>
+              <w:tab/>
+              <w:t>=</w:t>
+            </w:r>
+            <w:r>
+              <w:t xml:space="preserve"> </w:t>
+            </w:r>
+            <w:proofErr w:type="spellStart"/>
+            <w:r>
+              <w:t>sample_</w:t>
+            </w:r>
+            <w:proofErr w:type="gramStart"/>
+            <w:r>
+              <w:t>data</w:t>
+            </w:r>
+            <w:proofErr w:type="spellEnd"/>
+            <w:r>
+              <w:t>(</w:t>
+            </w:r>
+            <w:proofErr w:type="spellStart"/>
+            <w:proofErr w:type="gramEnd"/>
+            <w:r>
+              <w:t>data.frame</w:t>
+            </w:r>
+            <w:proofErr w:type="spellEnd"/>
+            <w:r>
+              <w:t xml:space="preserve">(metadata, </w:t>
+            </w:r>
+            <w:proofErr w:type="spellStart"/>
+            <w:r>
+              <w:t>row.names</w:t>
+            </w:r>
+            <w:proofErr w:type="spellEnd"/>
+            <w:r>
+              <w:t xml:space="preserve"> = </w:t>
+            </w:r>
+            <w:proofErr w:type="spellStart"/>
+            <w:r>
+              <w:t>metadata$Run</w:t>
+            </w:r>
+            <w:proofErr w:type="spellEnd"/>
+            <w:r>
+              <w:t>))</w:t>
+            </w:r>
+          </w:p>
+        </w:tc>
+      </w:tr>
+      <w:tr>
+        <w:tc>
+          <w:tcPr>
+            <w:cnfStyle w:val="001000000000" w:firstRow="0" w:lastRow="0" w:firstColumn="1" w:lastColumn="0" w:oddVBand="0" w:evenVBand="0" w:oddHBand="0" w:evenHBand="0" w:firstRowFirstColumn="0" w:firstRowLastColumn="0" w:lastRowFirstColumn="0" w:lastRowLastColumn="0"/>
+            <w:tcW w:w="3767" w:type="dxa"/>
+          </w:tcPr>
+          <w:p>
+            <w:r>
+              <w:t xml:space="preserve">Combine the Hellinger transformed data, taxonomy table, metadata table and phylogenetic tree into one </w:t>
+            </w:r>
+            <w:proofErr w:type="spellStart"/>
+            <w:r>
+              <w:t>phyloseq</w:t>
+            </w:r>
+            <w:proofErr w:type="spellEnd"/>
+            <w:r>
+              <w:t xml:space="preserve"> object</w:t>
+            </w:r>
+          </w:p>
+        </w:tc>
+        <w:tc>
+          <w:tcPr>
+            <w:tcW w:w="6681" w:type="dxa"/>
+          </w:tcPr>
+          <w:p>
+            <w:pPr>
+              <w:cnfStyle w:val="000000000000" w:firstRow="0" w:lastRow="0" w:firstColumn="0" w:lastColumn="0" w:oddVBand="0" w:evenVBand="0" w:oddHBand="0" w:evenHBand="0" w:firstRowFirstColumn="0" w:firstRowLastColumn="0" w:lastRowFirstColumn="0" w:lastRowLastColumn="0"/>
+            </w:pPr>
+            <w:proofErr w:type="spellStart"/>
+            <w:r>
+              <w:t>phyloseq</w:t>
+            </w:r>
+            <w:proofErr w:type="spellEnd"/>
+            <w:r>
+              <w:t xml:space="preserve"> is a function of the </w:t>
+            </w:r>
+            <w:proofErr w:type="spellStart"/>
+            <w:r>
+              <w:t>phyloseq</w:t>
+            </w:r>
+            <w:proofErr w:type="spellEnd"/>
+            <w:r>
+              <w:t xml:space="preserve"> package.</w:t>
+            </w:r>
+            <w:r>
+              <w:t xml:space="preserve"> O</w:t>
+            </w:r>
+            <w:r>
+              <w:t xml:space="preserve">ne of the key advantages of working with </w:t>
+            </w:r>
+            <w:proofErr w:type="spellStart"/>
+            <w:r>
+              <w:t>phyloseq</w:t>
+            </w:r>
+            <w:proofErr w:type="spellEnd"/>
+            <w:r>
+              <w:t xml:space="preserve"> objects in R</w:t>
+            </w:r>
+            <w:r>
+              <w:t xml:space="preserve"> is that e</w:t>
+            </w:r>
+            <w:r>
+              <w:t>ach of these data structures is contained in a single object. This makes it easy to keep all of your data together and to share it with colleagues or include it as a supplemental file to a publication</w:t>
+            </w:r>
+          </w:p>
+        </w:tc>
+        <w:tc>
+          <w:tcPr>
+            <w:tcW w:w="4950" w:type="dxa"/>
+          </w:tcPr>
+          <w:p>
+            <w:pPr>
+              <w:cnfStyle w:val="000000000000" w:firstRow="0" w:lastRow="0" w:firstColumn="0" w:lastColumn="0" w:oddVBand="0" w:evenVBand="0" w:oddHBand="0" w:evenHBand="0" w:firstRowFirstColumn="0" w:firstRowLastColumn="0" w:lastRowFirstColumn="0" w:lastRowLastColumn="0"/>
+            </w:pPr>
+            <w:proofErr w:type="spellStart"/>
+            <w:r>
+              <w:t>my_phyloseq</w:t>
+            </w:r>
+            <w:proofErr w:type="spellEnd"/>
+            <w:r>
+              <w:t xml:space="preserve"> &lt;- </w:t>
+            </w:r>
+            <w:proofErr w:type="spellStart"/>
+            <w:r>
+              <w:t>phyloseq</w:t>
+            </w:r>
+            <w:proofErr w:type="spellEnd"/>
+            <w:r>
+              <w:t>(ASV, TAX, META, tree_clean)</w:t>
+            </w:r>
+            <w:bookmarkStart w:id="3" w:name="_GoBack"/>
+            <w:bookmarkEnd w:id="3"/>
+          </w:p>
+        </w:tc>
+      </w:tr>
+      <w:tr>
+        <w:trPr>
+          <w:cnfStyle w:val="000000100000" w:firstRow="0" w:lastRow="0" w:firstColumn="0" w:lastColumn="0" w:oddVBand="0" w:evenVBand="0" w:oddHBand="1" w:evenHBand="0" w:firstRowFirstColumn="0" w:firstRowLastColumn="0" w:lastRowFirstColumn="0" w:lastRowLastColumn="0"/>
+        </w:trPr>
+        <w:tc>
+          <w:tcPr>
+            <w:cnfStyle w:val="001000000000" w:firstRow="0" w:lastRow="0" w:firstColumn="1" w:lastColumn="0" w:oddVBand="0" w:evenVBand="0" w:oddHBand="0" w:evenHBand="0" w:firstRowFirstColumn="0" w:firstRowLastColumn="0" w:lastRowFirstColumn="0" w:lastRowLastColumn="0"/>
+            <w:tcW w:w="3767" w:type="dxa"/>
+          </w:tcPr>
           <w:p/>
         </w:tc>
         <w:tc>
@@ -8820,8 +12184,97 @@
           </w:p>
         </w:tc>
       </w:tr>
+      <w:tr>
+        <w:tc>
+          <w:tcPr>
+            <w:cnfStyle w:val="001000000000" w:firstRow="0" w:lastRow="0" w:firstColumn="1" w:lastColumn="0" w:oddVBand="0" w:evenVBand="0" w:oddHBand="0" w:evenHBand="0" w:firstRowFirstColumn="0" w:firstRowLastColumn="0" w:lastRowFirstColumn="0" w:lastRowLastColumn="0"/>
+            <w:tcW w:w="3767" w:type="dxa"/>
+          </w:tcPr>
+          <w:p/>
+        </w:tc>
+        <w:tc>
+          <w:tcPr>
+            <w:tcW w:w="6681" w:type="dxa"/>
+          </w:tcPr>
+          <w:p>
+            <w:pPr>
+              <w:cnfStyle w:val="000000000000" w:firstRow="0" w:lastRow="0" w:firstColumn="0" w:lastColumn="0" w:oddVBand="0" w:evenVBand="0" w:oddHBand="0" w:evenHBand="0" w:firstRowFirstColumn="0" w:firstRowLastColumn="0" w:lastRowFirstColumn="0" w:lastRowLastColumn="0"/>
+            </w:pPr>
+          </w:p>
+        </w:tc>
+        <w:tc>
+          <w:tcPr>
+            <w:tcW w:w="4950" w:type="dxa"/>
+          </w:tcPr>
+          <w:p>
+            <w:pPr>
+              <w:cnfStyle w:val="000000000000" w:firstRow="0" w:lastRow="0" w:firstColumn="0" w:lastColumn="0" w:oddVBand="0" w:evenVBand="0" w:oddHBand="0" w:evenHBand="0" w:firstRowFirstColumn="0" w:firstRowLastColumn="0" w:lastRowFirstColumn="0" w:lastRowLastColumn="0"/>
+            </w:pPr>
+          </w:p>
+        </w:tc>
+      </w:tr>
+      <w:tr>
+        <w:trPr>
+          <w:cnfStyle w:val="000000100000" w:firstRow="0" w:lastRow="0" w:firstColumn="0" w:lastColumn="0" w:oddVBand="0" w:evenVBand="0" w:oddHBand="1" w:evenHBand="0" w:firstRowFirstColumn="0" w:firstRowLastColumn="0" w:lastRowFirstColumn="0" w:lastRowLastColumn="0"/>
+        </w:trPr>
+        <w:tc>
+          <w:tcPr>
+            <w:cnfStyle w:val="001000000000" w:firstRow="0" w:lastRow="0" w:firstColumn="1" w:lastColumn="0" w:oddVBand="0" w:evenVBand="0" w:oddHBand="0" w:evenHBand="0" w:firstRowFirstColumn="0" w:firstRowLastColumn="0" w:lastRowFirstColumn="0" w:lastRowLastColumn="0"/>
+            <w:tcW w:w="3767" w:type="dxa"/>
+          </w:tcPr>
+          <w:p/>
+        </w:tc>
+        <w:tc>
+          <w:tcPr>
+            <w:tcW w:w="6681" w:type="dxa"/>
+          </w:tcPr>
+          <w:p>
+            <w:pPr>
+              <w:cnfStyle w:val="000000100000" w:firstRow="0" w:lastRow="0" w:firstColumn="0" w:lastColumn="0" w:oddVBand="0" w:evenVBand="0" w:oddHBand="1" w:evenHBand="0" w:firstRowFirstColumn="0" w:firstRowLastColumn="0" w:lastRowFirstColumn="0" w:lastRowLastColumn="0"/>
+            </w:pPr>
+          </w:p>
+        </w:tc>
+        <w:tc>
+          <w:tcPr>
+            <w:tcW w:w="4950" w:type="dxa"/>
+          </w:tcPr>
+          <w:p>
+            <w:pPr>
+              <w:cnfStyle w:val="000000100000" w:firstRow="0" w:lastRow="0" w:firstColumn="0" w:lastColumn="0" w:oddVBand="0" w:evenVBand="0" w:oddHBand="1" w:evenHBand="0" w:firstRowFirstColumn="0" w:firstRowLastColumn="0" w:lastRowFirstColumn="0" w:lastRowLastColumn="0"/>
+            </w:pPr>
+          </w:p>
+        </w:tc>
+      </w:tr>
+      <w:tr>
+        <w:tc>
+          <w:tcPr>
+            <w:cnfStyle w:val="001000000000" w:firstRow="0" w:lastRow="0" w:firstColumn="1" w:lastColumn="0" w:oddVBand="0" w:evenVBand="0" w:oddHBand="0" w:evenHBand="0" w:firstRowFirstColumn="0" w:firstRowLastColumn="0" w:lastRowFirstColumn="0" w:lastRowLastColumn="0"/>
+            <w:tcW w:w="3767" w:type="dxa"/>
+          </w:tcPr>
+          <w:p/>
+        </w:tc>
+        <w:tc>
+          <w:tcPr>
+            <w:tcW w:w="6681" w:type="dxa"/>
+          </w:tcPr>
+          <w:p>
+            <w:pPr>
+              <w:cnfStyle w:val="000000000000" w:firstRow="0" w:lastRow="0" w:firstColumn="0" w:lastColumn="0" w:oddVBand="0" w:evenVBand="0" w:oddHBand="0" w:evenHBand="0" w:firstRowFirstColumn="0" w:firstRowLastColumn="0" w:lastRowFirstColumn="0" w:lastRowLastColumn="0"/>
+            </w:pPr>
+          </w:p>
+        </w:tc>
+        <w:tc>
+          <w:tcPr>
+            <w:tcW w:w="4950" w:type="dxa"/>
+          </w:tcPr>
+          <w:p>
+            <w:pPr>
+              <w:cnfStyle w:val="000000000000" w:firstRow="0" w:lastRow="0" w:firstColumn="0" w:lastColumn="0" w:oddVBand="0" w:evenVBand="0" w:oddHBand="0" w:evenHBand="0" w:firstRowFirstColumn="0" w:firstRowLastColumn="0" w:lastRowFirstColumn="0" w:lastRowLastColumn="0"/>
+            </w:pPr>
+          </w:p>
+        </w:tc>
+      </w:tr>
     </w:tbl>
-    <w:p/>
     <w:p>
       <w:pPr>
         <w:pStyle w:val="Heading1"/>
@@ -16944,6 +20397,28 @@
       <w:szCs w:val="32"/>
     </w:rPr>
   </w:style>
+  <w:style w:type="paragraph" w:styleId="Heading2">
+    <w:name w:val="heading 2"/>
+    <w:basedOn w:val="Normal"/>
+    <w:next w:val="Normal"/>
+    <w:link w:val="Heading2Char"/>
+    <w:uiPriority w:val="9"/>
+    <w:unhideWhenUsed/>
+    <w:qFormat/>
+    <w:rsid w:val="00B67277"/>
+    <w:pPr>
+      <w:keepNext/>
+      <w:keepLines/>
+      <w:spacing w:before="40"/>
+      <w:outlineLvl w:val="1"/>
+    </w:pPr>
+    <w:rPr>
+      <w:rFonts w:asciiTheme="majorHAnsi" w:eastAsiaTheme="majorEastAsia" w:hAnsiTheme="majorHAnsi" w:cstheme="majorBidi"/>
+      <w:color w:val="2F5496" w:themeColor="accent1" w:themeShade="BF"/>
+      <w:sz w:val="26"/>
+      <w:szCs w:val="26"/>
+    </w:rPr>
+  </w:style>
   <w:style w:type="character" w:default="1" w:styleId="DefaultParagraphFont">
     <w:name w:val="Default Paragraph Font"/>
     <w:uiPriority w:val="1"/>
@@ -17484,6 +20959,19 @@
     <w:basedOn w:val="DefaultParagraphFont"/>
     <w:rsid w:val="00241218"/>
   </w:style>
+  <w:style w:type="character" w:customStyle="1" w:styleId="Heading2Char">
+    <w:name w:val="Heading 2 Char"/>
+    <w:basedOn w:val="DefaultParagraphFont"/>
+    <w:link w:val="Heading2"/>
+    <w:uiPriority w:val="9"/>
+    <w:rsid w:val="00B67277"/>
+    <w:rPr>
+      <w:rFonts w:asciiTheme="majorHAnsi" w:eastAsiaTheme="majorEastAsia" w:hAnsiTheme="majorHAnsi" w:cstheme="majorBidi"/>
+      <w:color w:val="2F5496" w:themeColor="accent1" w:themeShade="BF"/>
+      <w:sz w:val="26"/>
+      <w:szCs w:val="26"/>
+    </w:rPr>
+  </w:style>
 </w:styles>
 </file>
 
@@ -17753,7 +21241,7 @@
 </file>
 
 <file path=customXml/itemProps1.xml><?xml version="1.0" encoding="utf-8"?>
-<ds:datastoreItem xmlns:ds="http://schemas.openxmlformats.org/officeDocument/2006/customXml" ds:itemID="{9A9DF0A4-4607-1B41-B1F1-59727EF4CE84}">
+<ds:datastoreItem xmlns:ds="http://schemas.openxmlformats.org/officeDocument/2006/customXml" ds:itemID="{2BAEC189-631C-5B48-B20D-C0149E43B6B9}">
   <ds:schemaRefs>
     <ds:schemaRef ds:uri="http://schemas.openxmlformats.org/officeDocument/2006/bibliography"/>
   </ds:schemaRefs>

</xml_diff>